<commit_message>
Add: Fichiers manquants + mise à jour templates et workflows
- Ajout UpdateNotification.tsx (notification de mise à jour)
- Mise à jour template_custom.docx
- Mise à jour workflows n8n.json
</commit_message>
<xml_diff>
--- a/templates/word/template_custom.docx
+++ b/templates/word/template_custom.docx
@@ -99,352 +99,6 @@
           <w:sz w:val="22"/>
           <w:szCs w:val="22"/>
         </w:rPr>
-        <w:pict w14:anchorId="2F3011E9">
-          <v:shape id="_x0000_s2062" type="#_x0000_t202" style="position:absolute;margin-left:292.1pt;margin-top:194.05pt;width:251.05pt;height:117pt;z-index:251656192;visibility:visible;mso-width-relative:margin;mso-height-relative:margin" o:gfxdata="UEsDBBQABgAIAAAAIQC2gziS/gAAAOEBAAATAAAAW0NvbnRlbnRfVHlwZXNdLnhtbJSRQU7DMBBF&#10;90jcwfIWJU67QAgl6YK0S0CoHGBkTxKLZGx5TGhvj5O2G0SRWNoz/78nu9wcxkFMGNg6quQqL6RA&#10;0s5Y6ir5vt9lD1JwBDIwOMJKHpHlpr69KfdHjyxSmriSfYz+USnWPY7AufNIadK6MEJMx9ApD/oD&#10;OlTrorhX2lFEilmcO2RdNtjC5xDF9pCuTyYBB5bi6bQ4syoJ3g9WQ0ymaiLzg5KdCXlKLjvcW893&#10;SUOqXwnz5DrgnHtJTxOsQfEKIT7DmDSUCaxw7Rqn8787ZsmRM9e2VmPeBN4uqYvTtW7jvijg9N/y&#10;JsXecLq0q+WD6m8AAAD//wMAUEsDBBQABgAIAAAAIQA4/SH/1gAAAJQBAAALAAAAX3JlbHMvLnJl&#10;bHOkkMFqwzAMhu+DvYPRfXGawxijTi+j0GvpHsDYimMaW0Yy2fr2M4PBMnrbUb/Q94l/f/hMi1qR&#10;JVI2sOt6UJgd+ZiDgffL8ekFlFSbvV0oo4EbChzGx4f9GRdb25HMsYhqlCwG5lrLq9biZkxWOiqY&#10;22YiTra2kYMu1l1tQD30/bPm3wwYN0x18gb45AdQl1tp5j/sFB2T0FQ7R0nTNEV3j6o9feQzro1i&#10;OWA14Fm+Q8a1a8+Bvu/d/dMb2JY5uiPbhG/ktn4cqGU/er3pcvwCAAD//wMAUEsDBBQABgAIAAAA&#10;IQCVjOgwOwIAAG0EAAAOAAAAZHJzL2Uyb0RvYy54bWysVEtv2zAMvg/YfxB0Xxzn1dSIU2QpMgwI&#10;2gLp0LMiy7EAWdQkJXb260fJebXbaVgOCilSfHwf6dlDWytyENZJ0DlNe31KhOZQSL3L6Y/X1Zcp&#10;Jc4zXTAFWuT0KBx9mH/+NGtMJgZQgSqEJRhEu6wxOa28N1mSOF6JmrkeGKHRWIKtmUfV7pLCsgaj&#10;1yoZ9PuTpAFbGAtcOIe3j52RzmP8shTcP5elE56onGJtPp42nttwJvMZy3aWmUryUxnsH6qomdSY&#10;9BLqkXlG9lb+EaqW3IKD0vc41AmUpeQi9oDdpP0P3WwqZkTsBcFx5gKT+39h+dNhY14s8e1XaJHA&#10;AEhjXObwMvTTlrYO/1gpQTtCeLzAJlpPOF4O0+l0OBxTwtGWDu4nk7sIbHJ9bqzz3wTUJAg5tchL&#10;hIsd1s5jSnQ9u4RsDpQsVlKpqBzdUllyYEghMl9AQ4lizuNlTlfxF6rGEO+eKU2anE6G437MpCHE&#10;6/yURvdrl0Hy7bYlsrhBYAvFEYGx0M2MM3wlsfg1Zn5hFocEscDB9894lAowF5wkSiqwv/52H/yR&#10;O7RS0uDQ5dT93DMrsKHvGlm9T0ejMKVRGY3vBqjYW8v21qL39RIQlBRXzPAoBn+vzmJpoX7D/ViE&#10;rGhimmPunPqzuPTdKuB+cbFYRCecS8P8Wm8MD6EDA4Ga1/aNWXPizyP1T3AeT5Z9oLHzDS81LPYe&#10;Shk5Djh3qJ7gx5mOvJ32LyzNrR69rl+J+W8AAAD//wMAUEsDBBQABgAIAAAAIQDbCZ5r3wAAAAwB&#10;AAAPAAAAZHJzL2Rvd25yZXYueG1sTI9BTwIxEIXvJv6HZky8ScuiFdadJcbEq4mAnMu2bDe20822&#10;wMKvt5zkOHlf3vumWo7esaMZYhcIYToRwAw1QXfUImzWn09zYDEp0soFMghnE2FZ399VqtThRN/m&#10;uEotyyUUS4VgU+pLzmNjjVdxEnpDOduHwauUz6HlelCnXO4dL4SQ3KuO8oJVvfmwpvldHTzCtvWX&#10;7c+0H6z27pm+Luf1JnSIjw/j+xuwZMb0D8NVP6tDnZ124UA6MofwIkWRUYTZQr4CuxJCFjNgOwQp&#10;xAJ4XfHbJ+o/AAAA//8DAFBLAQItABQABgAIAAAAIQC2gziS/gAAAOEBAAATAAAAAAAAAAAAAAAA&#10;AAAAAABbQ29udGVudF9UeXBlc10ueG1sUEsBAi0AFAAGAAgAAAAhADj9If/WAAAAlAEAAAsAAAAA&#10;AAAAAAAAAAAALwEAAF9yZWxzLy5yZWxzUEsBAi0AFAAGAAgAAAAhAJWM6DA7AgAAbQQAAA4AAAAA&#10;AAAAAAAAAAAALgIAAGRycy9lMm9Eb2MueG1sUEsBAi0AFAAGAAgAAAAhANsJnmvfAAAADAEAAA8A&#10;AAAAAAAAAAAAAAAAlQQAAGRycy9kb3ducmV2LnhtbFBLBQYAAAAABAAEAPMAAAChBQAAAAA=&#10;" stroked="f" strokeweight=".5pt">
-            <v:textbox style="mso-next-textbox:#_x0000_s2062">
-              <w:txbxContent>
-                <w:p>
-                  <w:pPr>
-                    <w:jc w:val="both"/>
-                    <w:rPr>
-                      <w:rFonts w:ascii="Aptos" w:hAnsi="Aptos"/>
-                      <w:sz w:val="22"/>
-                      <w:szCs w:val="22"/>
-                    </w:rPr>
-                  </w:pPr>
-                  <w:permStart w:id="828262682" w:edGrp="everyone"/>
-                  <w:r>
-                    <w:rPr>
-                      <w:rFonts w:ascii="Aptos" w:hAnsi="Aptos"/>
-                      <w:sz w:val="22"/>
-                      <w:szCs w:val="22"/>
-                    </w:rPr>
-                    <w:t>{</w:t>
-                  </w:r>
-                  <w:proofErr w:type="gramStart"/>
-                  <w:r>
-                    <w:rPr>
-                      <w:rFonts w:ascii="Aptos" w:hAnsi="Aptos"/>
-                      <w:sz w:val="22"/>
-                      <w:szCs w:val="22"/>
-                    </w:rPr>
-                    <w:t>entreprise</w:t>
-                  </w:r>
-                  <w:proofErr w:type="gramEnd"/>
-                  <w:r>
-                    <w:rPr>
-                      <w:rFonts w:ascii="Aptos" w:hAnsi="Aptos"/>
-                      <w:sz w:val="22"/>
-                      <w:szCs w:val="22"/>
-                    </w:rPr>
-                    <w:t>}</w:t>
-                  </w:r>
-                </w:p>
-                <w:p>
-                  <w:pPr>
-                    <w:jc w:val="both"/>
-                    <w:rPr>
-                      <w:rFonts w:ascii="Aptos" w:hAnsi="Aptos"/>
-                      <w:sz w:val="22"/>
-                      <w:szCs w:val="22"/>
-                    </w:rPr>
-                  </w:pPr>
-                  <w:r>
-                    <w:rPr>
-                      <w:rFonts w:ascii="Aptos" w:hAnsi="Aptos"/>
-                      <w:sz w:val="22"/>
-                      <w:szCs w:val="22"/>
-                    </w:rPr>
-                    <w:t>{</w:t>
-                  </w:r>
-                  <w:proofErr w:type="gramStart"/>
-                  <w:r>
-                    <w:rPr>
-                      <w:rFonts w:ascii="Aptos" w:hAnsi="Aptos"/>
-                      <w:sz w:val="22"/>
-                      <w:szCs w:val="22"/>
-                    </w:rPr>
-                    <w:t>civiliteDestinataire</w:t>
-                  </w:r>
-                  <w:proofErr w:type="gramEnd"/>
-                  <w:r>
-                    <w:rPr>
-                      <w:rFonts w:ascii="Aptos" w:hAnsi="Aptos"/>
-                      <w:sz w:val="22"/>
-                      <w:szCs w:val="22"/>
-                    </w:rPr>
-                    <w:t>} {</w:t>
-                  </w:r>
-                  <w:r>
-                    <w:rPr>
-                      <w:rFonts w:ascii="Aptos" w:hAnsi="Aptos"/>
-                      <w:sz w:val="22"/>
-                      <w:szCs w:val="22"/>
-                    </w:rPr>
-                    <w:t>nom</w:t>
-                  </w:r>
-                  <w:r>
-                    <w:rPr>
-                      <w:rFonts w:ascii="Aptos" w:hAnsi="Aptos"/>
-                      <w:sz w:val="22"/>
-                      <w:szCs w:val="22"/>
-                    </w:rPr>
-                    <w:t>D</w:t>
-                  </w:r>
-                  <w:r>
-                    <w:rPr>
-                      <w:rFonts w:ascii="Aptos" w:hAnsi="Aptos"/>
-                      <w:sz w:val="22"/>
-                      <w:szCs w:val="22"/>
-                    </w:rPr>
-                    <w:t>estinataire</w:t>
-                  </w:r>
-                  <w:r>
-                    <w:rPr>
-                      <w:rFonts w:ascii="Aptos" w:hAnsi="Aptos"/>
-                      <w:sz w:val="22"/>
-                      <w:szCs w:val="22"/>
-                    </w:rPr>
-                    <w:t>}</w:t>
-                  </w:r>
-                </w:p>
-                <w:p>
-                  <w:pPr>
-                    <w:jc w:val="both"/>
-                    <w:rPr>
-                      <w:rFonts w:ascii="Aptos" w:hAnsi="Aptos"/>
-                      <w:sz w:val="22"/>
-                      <w:szCs w:val="22"/>
-                    </w:rPr>
-                  </w:pPr>
-                  <w:r>
-                    <w:rPr>
-                      <w:rFonts w:ascii="Aptos" w:hAnsi="Aptos"/>
-                      <w:sz w:val="22"/>
-                      <w:szCs w:val="22"/>
-                    </w:rPr>
-                    <w:t>{</w:t>
-                  </w:r>
-                  <w:proofErr w:type="gramStart"/>
-                  <w:r>
-                    <w:rPr>
-                      <w:rFonts w:ascii="Aptos" w:hAnsi="Aptos"/>
-                      <w:sz w:val="22"/>
-                      <w:szCs w:val="22"/>
-                    </w:rPr>
-                    <w:t>genre</w:t>
-                  </w:r>
-                  <w:proofErr w:type="gramEnd"/>
-                  <w:r>
-                    <w:rPr>
-                      <w:rFonts w:ascii="Aptos" w:hAnsi="Aptos"/>
-                      <w:sz w:val="22"/>
-                      <w:szCs w:val="22"/>
-                    </w:rPr>
-                    <w:t xml:space="preserve">} </w:t>
-                  </w:r>
-                  <w:r>
-                    <w:rPr>
-                      <w:rFonts w:ascii="Aptos" w:hAnsi="Aptos"/>
-                      <w:sz w:val="22"/>
-                      <w:szCs w:val="22"/>
-                    </w:rPr>
-                    <w:t>{statutD</w:t>
-                  </w:r>
-                  <w:r>
-                    <w:rPr>
-                      <w:rFonts w:ascii="Aptos" w:hAnsi="Aptos"/>
-                      <w:sz w:val="22"/>
-                      <w:szCs w:val="22"/>
-                    </w:rPr>
-                    <w:t>estinataire</w:t>
-                  </w:r>
-                  <w:r>
-                    <w:rPr>
-                      <w:rFonts w:ascii="Aptos" w:hAnsi="Aptos"/>
-                      <w:sz w:val="22"/>
-                      <w:szCs w:val="22"/>
-                    </w:rPr>
-                    <w:t>}</w:t>
-                  </w:r>
-                </w:p>
-                <w:p>
-                  <w:pPr>
-                    <w:jc w:val="both"/>
-                    <w:rPr>
-                      <w:rFonts w:ascii="Aptos" w:hAnsi="Aptos"/>
-                      <w:sz w:val="22"/>
-                      <w:szCs w:val="22"/>
-                    </w:rPr>
-                  </w:pPr>
-                  <w:r>
-                    <w:rPr>
-                      <w:rFonts w:ascii="Aptos" w:hAnsi="Aptos"/>
-                      <w:sz w:val="22"/>
-                      <w:szCs w:val="22"/>
-                    </w:rPr>
-                    <w:t>{</w:t>
-                  </w:r>
-                  <w:proofErr w:type="gramStart"/>
-                  <w:r>
-                    <w:rPr>
-                      <w:rFonts w:ascii="Aptos" w:hAnsi="Aptos"/>
-                      <w:sz w:val="22"/>
-                      <w:szCs w:val="22"/>
-                    </w:rPr>
-                    <w:t>ba</w:t>
-                  </w:r>
-                  <w:r>
-                    <w:rPr>
-                      <w:rFonts w:ascii="Aptos" w:hAnsi="Aptos"/>
-                      <w:sz w:val="22"/>
-                      <w:szCs w:val="22"/>
-                    </w:rPr>
-                    <w:t>timent</w:t>
-                  </w:r>
-                  <w:proofErr w:type="gramEnd"/>
-                  <w:r>
-                    <w:rPr>
-                      <w:rFonts w:ascii="Aptos" w:hAnsi="Aptos"/>
-                      <w:sz w:val="22"/>
-                      <w:szCs w:val="22"/>
-                    </w:rPr>
-                    <w:t>}</w:t>
-                  </w:r>
-                </w:p>
-                <w:p>
-                  <w:pPr>
-                    <w:jc w:val="both"/>
-                    <w:rPr>
-                      <w:rFonts w:ascii="Aptos" w:hAnsi="Aptos"/>
-                      <w:sz w:val="22"/>
-                      <w:szCs w:val="22"/>
-                    </w:rPr>
-                  </w:pPr>
-                  <w:r>
-                    <w:rPr>
-                      <w:rFonts w:ascii="Aptos" w:hAnsi="Aptos"/>
-                      <w:sz w:val="22"/>
-                      <w:szCs w:val="22"/>
-                    </w:rPr>
-                    <w:t>{</w:t>
-                  </w:r>
-                  <w:proofErr w:type="gramStart"/>
-                  <w:r>
-                    <w:rPr>
-                      <w:rFonts w:ascii="Aptos" w:hAnsi="Aptos"/>
-                      <w:sz w:val="22"/>
-                      <w:szCs w:val="22"/>
-                    </w:rPr>
-                    <w:t>a</w:t>
-                  </w:r>
-                  <w:r>
-                    <w:rPr>
-                      <w:rFonts w:ascii="Aptos" w:hAnsi="Aptos"/>
-                      <w:sz w:val="22"/>
-                      <w:szCs w:val="22"/>
-                    </w:rPr>
-                    <w:t>dresse</w:t>
-                  </w:r>
-                  <w:proofErr w:type="gramEnd"/>
-                  <w:r>
-                    <w:rPr>
-                      <w:rFonts w:ascii="Aptos" w:hAnsi="Aptos"/>
-                      <w:sz w:val="22"/>
-                      <w:szCs w:val="22"/>
-                    </w:rPr>
-                    <w:t>}</w:t>
-                  </w:r>
-                </w:p>
-                <w:p>
-                  <w:pPr>
-                    <w:jc w:val="both"/>
-                    <w:rPr>
-                      <w:rFonts w:ascii="Aptos" w:hAnsi="Aptos"/>
-                      <w:sz w:val="22"/>
-                      <w:szCs w:val="22"/>
-                    </w:rPr>
-                  </w:pPr>
-                  <w:r>
-                    <w:rPr>
-                      <w:rFonts w:ascii="Aptos" w:hAnsi="Aptos"/>
-                      <w:sz w:val="22"/>
-                      <w:szCs w:val="22"/>
-                    </w:rPr>
-                    <w:t>{</w:t>
-                  </w:r>
-                  <w:proofErr w:type="gramStart"/>
-                  <w:r>
-                    <w:rPr>
-                      <w:rFonts w:ascii="Aptos" w:hAnsi="Aptos"/>
-                      <w:sz w:val="22"/>
-                      <w:szCs w:val="22"/>
-                    </w:rPr>
-                    <w:t>cpVille</w:t>
-                  </w:r>
-                  <w:proofErr w:type="gramEnd"/>
-                  <w:r>
-                    <w:rPr>
-                      <w:rFonts w:ascii="Aptos" w:hAnsi="Aptos"/>
-                      <w:sz w:val="22"/>
-                      <w:szCs w:val="22"/>
-                    </w:rPr>
-                    <w:t>}</w:t>
-                  </w:r>
-                </w:p>
-                <w:p>
-                  <w:pPr>
-                    <w:rPr>
-                      <w:rFonts w:ascii="Aptos" w:hAnsi="Aptos"/>
-                      <w:sz w:val="22"/>
-                      <w:szCs w:val="22"/>
-                    </w:rPr>
-                  </w:pPr>
-                  <w:hyperlink r:id="rId7" w:history="1">
-                    <w:r>
-                      <w:rPr>
-                        <w:rStyle w:val="Lienhypertexte"/>
-                        <w:rFonts w:ascii="Aptos" w:hAnsi="Aptos"/>
-                        <w:sz w:val="22"/>
-                        <w:szCs w:val="22"/>
-                      </w:rPr>
-                      <w:t>{</w:t>
-                    </w:r>
-                    <w:proofErr w:type="gramStart"/>
-                    <w:r>
-                      <w:rPr>
-                        <w:rStyle w:val="Lienhypertexte"/>
-                        <w:rFonts w:ascii="Aptos" w:hAnsi="Aptos"/>
-                        <w:sz w:val="22"/>
-                        <w:szCs w:val="22"/>
-                      </w:rPr>
-                      <w:t>emailDestinataire</w:t>
-                    </w:r>
-                    <w:proofErr w:type="gramEnd"/>
-                    <w:r>
-                      <w:rPr>
-                        <w:rStyle w:val="Lienhypertexte"/>
-                        <w:rFonts w:ascii="Aptos" w:hAnsi="Aptos"/>
-                        <w:sz w:val="22"/>
-                        <w:szCs w:val="22"/>
-                      </w:rPr>
-                      <w:t>}</w:t>
-                    </w:r>
-                  </w:hyperlink>
-                  <w:permEnd w:id="828262682"/>
-                </w:p>
-              </w:txbxContent>
-            </v:textbox>
-          </v:shape>
-        </w:pict>
-      </w:r>
-      <w:r>
-        <w:rPr>
-          <w:rFonts w:ascii="Aptos" w:hAnsi="Aptos"/>
-          <w:noProof/>
-          <w:sz w:val="22"/>
-          <w:szCs w:val="22"/>
-        </w:rPr>
         <w:pict w14:anchorId="622BEB30">
           <v:shape id="_x0000_s2063" type="#_x0000_t202" style="position:absolute;margin-left:292.45pt;margin-top:324.2pt;width:251.05pt;height:24.75pt;z-index:251657216;visibility:visible" o:gfxdata="UEsDBBQABgAIAAAAIQC2gziS/gAAAOEBAAATAAAAW0NvbnRlbnRfVHlwZXNdLnhtbJSRQU7DMBBF&#10;90jcwfIWJU67QAgl6YK0S0CoHGBkTxKLZGx5TGhvj5O2G0SRWNoz/78nu9wcxkFMGNg6quQqL6RA&#10;0s5Y6ir5vt9lD1JwBDIwOMJKHpHlpr69KfdHjyxSmriSfYz+USnWPY7AufNIadK6MEJMx9ApD/oD&#10;OlTrorhX2lFEilmcO2RdNtjC5xDF9pCuTyYBB5bi6bQ4syoJ3g9WQ0ymaiLzg5KdCXlKLjvcW893&#10;SUOqXwnz5DrgnHtJTxOsQfEKIT7DmDSUCaxw7Rqn8787ZsmRM9e2VmPeBN4uqYvTtW7jvijg9N/y&#10;JsXecLq0q+WD6m8AAAD//wMAUEsDBBQABgAIAAAAIQA4/SH/1gAAAJQBAAALAAAAX3JlbHMvLnJl&#10;bHOkkMFqwzAMhu+DvYPRfXGawxijTi+j0GvpHsDYimMaW0Yy2fr2M4PBMnrbUb/Q94l/f/hMi1qR&#10;JVI2sOt6UJgd+ZiDgffL8ekFlFSbvV0oo4EbChzGx4f9GRdb25HMsYhqlCwG5lrLq9biZkxWOiqY&#10;22YiTra2kYMu1l1tQD30/bPm3wwYN0x18gb45AdQl1tp5j/sFB2T0FQ7R0nTNEV3j6o9feQzro1i&#10;OWA14Fm+Q8a1a8+Bvu/d/dMb2JY5uiPbhG/ktn4cqGU/er3pcvwCAAD//wMAUEsDBBQABgAIAAAA&#10;IQD/hAE2+AEAANEDAAAOAAAAZHJzL2Uyb0RvYy54bWysU9uO0zAQfUfiHyy/0zS9QImarpauipCW&#10;i7TwAY7jJBaOx4zdJuXrGTvd7gJviDxYHo99Zs6Zk+3N2Bt2Uug12JLnszlnykqotW1L/u3r4dWG&#10;Mx+ErYUBq0p+Vp7f7F6+2A6uUAvowNQKGYFYXwyu5F0IrsgyLzvVCz8DpywlG8BeBAqxzWoUA6H3&#10;JlvM56+zAbB2CFJ5T6d3U5LvEn7TKBk+N41XgZmSU28hrZjWKq7ZbiuKFoXrtLy0If6hi15oS0Wv&#10;UHciCHZE/RdUryWChybMJPQZNI2WKnEgNvn8DzYPnXAqcSFxvLvK5P8frPx0enBfkIXxHYw0wETC&#10;u3uQ3z2zsO+EbdUtIgydEjUVzqNk2eB8cXkapfaFjyDV8BFqGrI4BkhAY4N9VIV4MkKnAZyvoqsx&#10;MEmHy3yzWS7XnEnKLfPVcrFOJUTx+NqhD+8V9CxuSo401IQuTvc+xG5E8XglFvNgdH3QxqQA22pv&#10;kJ0EGeCQvgv6b9eMjZctxGcTYjxJNCOziWMYq5HpuuSLCBFZV1CfiTfC5Cv6D2jTAf7kbCBPldz/&#10;OApUnJkPlrR7m69W0YQpWK3fLCjA55nqeUZYSVAlD5xN232YjHt0qNuOKk3TsnBLejc6SfHU1aV9&#10;8k1S6OLxaMzncbr19CfufgEAAP//AwBQSwMEFAAGAAgAAAAhAFBhpLvgAAAADAEAAA8AAABkcnMv&#10;ZG93bnJldi54bWxMj0FOwzAQRfdI3MEaJDaI2rSp06RxKkACsW3pASaxm0TE4yh2m/T2uCtYzszT&#10;n/eL3Wx7djGj7xwpeFkIYIZqpztqFBy/P543wHxA0tg7MgquxsOuvL8rMNduor25HELDYgj5HBW0&#10;IQw5575ujUW/cIOheDu50WKI49hwPeIUw23Pl0JIbrGj+KHFwby3pv45nK2C09f0tM6m6jMc030i&#10;37BLK3dV6vFhft0CC2YOfzDc9KM6lNGpcmfSnvUK1lJkEVUgl0kC7EYIuYr1qrhKVxnwsuD/S5S/&#10;AAAA//8DAFBLAQItABQABgAIAAAAIQC2gziS/gAAAOEBAAATAAAAAAAAAAAAAAAAAAAAAABbQ29u&#10;dGVudF9UeXBlc10ueG1sUEsBAi0AFAAGAAgAAAAhADj9If/WAAAAlAEAAAsAAAAAAAAAAAAAAAAA&#10;LwEAAF9yZWxzLy5yZWxzUEsBAi0AFAAGAAgAAAAhAP+EATb4AQAA0QMAAA4AAAAAAAAAAAAAAAAA&#10;LgIAAGRycy9lMm9Eb2MueG1sUEsBAi0AFAAGAAgAAAAhAFBhpLvgAAAADAEAAA8AAAAAAAAAAAAA&#10;AAAAUgQAAGRycy9kb3ducmV2LnhtbFBLBQYAAAAABAAEAPMAAABfBQAAAAA=&#10;" stroked="f">
             <v:textbox style="mso-next-textbox:#_x0000_s2063">
@@ -496,7 +150,7 @@
                       <w:sz w:val="22"/>
                       <w:szCs w:val="22"/>
                     </w:rPr>
-                    <w:t>13 novembre 2025</w:t>
+                    <w:t>3 décembre 2025</w:t>
                   </w:r>
                   <w:r>
                     <w:rPr>
@@ -541,7 +195,7 @@
           <w:szCs w:val="22"/>
         </w:rPr>
         <w:pict w14:anchorId="49EA7E95">
-          <v:shape id="_x0000_s2066" type="#_x0000_t202" style="position:absolute;margin-left:81.5pt;margin-top:353.95pt;width:462pt;height:116.65pt;z-index:251658240;visibility:visible" o:gfxdata="UEsDBBQABgAIAAAAIQC2gziS/gAAAOEBAAATAAAAW0NvbnRlbnRfVHlwZXNdLnhtbJSRQU7DMBBF&#10;90jcwfIWJU67QAgl6YK0S0CoHGBkTxKLZGx5TGhvj5O2G0SRWNoz/78nu9wcxkFMGNg6quQqL6RA&#10;0s5Y6ir5vt9lD1JwBDIwOMJKHpHlpr69KfdHjyxSmriSfYz+USnWPY7AufNIadK6MEJMx9ApD/oD&#10;OlTrorhX2lFEilmcO2RdNtjC5xDF9pCuTyYBB5bi6bQ4syoJ3g9WQ0ymaiLzg5KdCXlKLjvcW893&#10;SUOqXwnz5DrgnHtJTxOsQfEKIT7DmDSUCaxw7Rqn8787ZsmRM9e2VmPeBN4uqYvTtW7jvijg9N/y&#10;JsXecLq0q+WD6m8AAAD//wMAUEsDBBQABgAIAAAAIQA4/SH/1gAAAJQBAAALAAAAX3JlbHMvLnJl&#10;bHOkkMFqwzAMhu+DvYPRfXGawxijTi+j0GvpHsDYimMaW0Yy2fr2M4PBMnrbUb/Q94l/f/hMi1qR&#10;JVI2sOt6UJgd+ZiDgffL8ekFlFSbvV0oo4EbChzGx4f9GRdb25HMsYhqlCwG5lrLq9biZkxWOiqY&#10;22YiTra2kYMu1l1tQD30/bPm3wwYN0x18gb45AdQl1tp5j/sFB2T0FQ7R0nTNEV3j6o9feQzro1i&#10;OWA14Fm+Q8a1a8+Bvu/d/dMb2JY5uiPbhG/ktn4cqGU/er3pcvwCAAD//wMAUEsDBBQABgAIAAAA&#10;IQA6P0Ik+AEAANIDAAAOAAAAZHJzL2Uyb0RvYy54bWysU8GO0zAQvSPxD5bvNGlpu0vUdLV0VYS0&#10;LEgLH+A4TmLheMzYbbJ8PWOn2y1wQ+RgeTz2m3lvXjY3Y2/YUaHXYEs+n+WcKSuh1rYt+bev+zfX&#10;nPkgbC0MWFXyJ+X5zfb1q83gCrWADkytkBGI9cXgSt6F4Ios87JTvfAzcMpSsgHsRaAQ26xGMRB6&#10;b7JFnq+zAbB2CFJ5T6d3U5JvE37TKBk+N41XgZmSU28hrZjWKq7ZdiOKFoXrtDy1If6hi15oS0XP&#10;UHciCHZA/RdUryWChybMJPQZNI2WKnEgNvP8DzaPnXAqcSFxvDvL5P8frHw4ProvyML4HkYaYCLh&#10;3T3I755Z2HXCtuoWEYZOiZoKz6Nk2eB8cXoapfaFjyDV8AlqGrI4BEhAY4N9VIV4MkKnATydRVdj&#10;YJIOV9frq2VOKUm5t+v5Kl+tUg1RPD936MMHBT2Lm5IjTTXBi+O9D7EdUTxfidU8GF3vtTEpwLba&#10;GWRHQQ7Yp++E/ts1Y+NlC/HZhBhPEs9IbSIZxmpkuqY2I0SkXUH9RMQRJmPRj0CbDvAnZwOZquT+&#10;x0Gg4sx8tCTeu/lyGV2YguXqakEBXmaqy4ywkqBKHjibtrswOffgULcdVZrGZeGWBG90kuKlq1P7&#10;ZJyk0Mnk0ZmXcbr18itufwEAAP//AwBQSwMEFAAGAAgAAAAhAHuoWjzfAAAADQEAAA8AAABkcnMv&#10;ZG93bnJldi54bWxMj8FOwzAQRO9I/IO1SFwQtSHgkDROBUigXlv6AU68TaLGdhS7Tfr3bE5wnJ3R&#10;7JtiM9ueXXAMnXcKnlYCGLram841Cg4/X49vwELUzujeO1RwxQCb8vam0Lnxk9vhZR8bRiUu5FpB&#10;G+OQcx7qFq0OKz+gI+/oR6sjybHhZtQTlduePwshudWdow+tHvCzxfq0P1sFx+308JpN1Xc8pLsX&#10;+aG7tPJXpe7v5vc1sIhz/AvDgk/oUBJT5c/OBNaTTjLaEhWkSSqBLQkhEzpViydkBrws+P8V5S8A&#10;AAD//wMAUEsBAi0AFAAGAAgAAAAhALaDOJL+AAAA4QEAABMAAAAAAAAAAAAAAAAAAAAAAFtDb250&#10;ZW50X1R5cGVzXS54bWxQSwECLQAUAAYACAAAACEAOP0h/9YAAACUAQAACwAAAAAAAAAAAAAAAAAv&#10;AQAAX3JlbHMvLnJlbHNQSwECLQAUAAYACAAAACEAOj9CJPgBAADSAwAADgAAAAAAAAAAAAAAAAAu&#10;AgAAZHJzL2Uyb0RvYy54bWxQSwECLQAUAAYACAAAACEAe6haPN8AAAANAQAADwAAAAAAAAAAAAAA&#10;AABSBAAAZHJzL2Rvd25yZXYueG1sUEsFBgAAAAAEAAQA8wAAAF4FAAAAAA==&#10;" stroked="f">
+          <v:shape id="_x0000_s2066" type="#_x0000_t202" style="position:absolute;margin-left:81.5pt;margin-top:353.95pt;width:462pt;height:145.15pt;z-index:251658240;visibility:visible" o:gfxdata="UEsDBBQABgAIAAAAIQC2gziS/gAAAOEBAAATAAAAW0NvbnRlbnRfVHlwZXNdLnhtbJSRQU7DMBBF&#10;90jcwfIWJU67QAgl6YK0S0CoHGBkTxKLZGx5TGhvj5O2G0SRWNoz/78nu9wcxkFMGNg6quQqL6RA&#10;0s5Y6ir5vt9lD1JwBDIwOMJKHpHlpr69KfdHjyxSmriSfYz+USnWPY7AufNIadK6MEJMx9ApD/oD&#10;OlTrorhX2lFEilmcO2RdNtjC5xDF9pCuTyYBB5bi6bQ4syoJ3g9WQ0ymaiLzg5KdCXlKLjvcW893&#10;SUOqXwnz5DrgnHtJTxOsQfEKIT7DmDSUCaxw7Rqn8787ZsmRM9e2VmPeBN4uqYvTtW7jvijg9N/y&#10;JsXecLq0q+WD6m8AAAD//wMAUEsDBBQABgAIAAAAIQA4/SH/1gAAAJQBAAALAAAAX3JlbHMvLnJl&#10;bHOkkMFqwzAMhu+DvYPRfXGawxijTi+j0GvpHsDYimMaW0Yy2fr2M4PBMnrbUb/Q94l/f/hMi1qR&#10;JVI2sOt6UJgd+ZiDgffL8ekFlFSbvV0oo4EbChzGx4f9GRdb25HMsYhqlCwG5lrLq9biZkxWOiqY&#10;22YiTra2kYMu1l1tQD30/bPm3wwYN0x18gb45AdQl1tp5j/sFB2T0FQ7R0nTNEV3j6o9feQzro1i&#10;OWA14Fm+Q8a1a8+Bvu/d/dMb2JY5uiPbhG/ktn4cqGU/er3pcvwCAAD//wMAUEsDBBQABgAIAAAA&#10;IQA6P0Ik+AEAANIDAAAOAAAAZHJzL2Uyb0RvYy54bWysU8GO0zAQvSPxD5bvNGlpu0vUdLV0VYS0&#10;LEgLH+A4TmLheMzYbbJ8PWOn2y1wQ+RgeTz2m3lvXjY3Y2/YUaHXYEs+n+WcKSuh1rYt+bev+zfX&#10;nPkgbC0MWFXyJ+X5zfb1q83gCrWADkytkBGI9cXgSt6F4Ios87JTvfAzcMpSsgHsRaAQ26xGMRB6&#10;b7JFnq+zAbB2CFJ5T6d3U5JvE37TKBk+N41XgZmSU28hrZjWKq7ZdiOKFoXrtDy1If6hi15oS0XP&#10;UHciCHZA/RdUryWChybMJPQZNI2WKnEgNvP8DzaPnXAqcSFxvDvL5P8frHw4ProvyML4HkYaYCLh&#10;3T3I755Z2HXCtuoWEYZOiZoKz6Nk2eB8cXoapfaFjyDV8AlqGrI4BEhAY4N9VIV4MkKnATydRVdj&#10;YJIOV9frq2VOKUm5t+v5Kl+tUg1RPD936MMHBT2Lm5IjTTXBi+O9D7EdUTxfidU8GF3vtTEpwLba&#10;GWRHQQ7Yp++E/ts1Y+NlC/HZhBhPEs9IbSIZxmpkuqY2I0SkXUH9RMQRJmPRj0CbDvAnZwOZquT+&#10;x0Gg4sx8tCTeu/lyGV2YguXqakEBXmaqy4ywkqBKHjibtrswOffgULcdVZrGZeGWBG90kuKlq1P7&#10;ZJyk0Mnk0ZmXcbr18itufwEAAP//AwBQSwMEFAAGAAgAAAAhAHuoWjzfAAAADQEAAA8AAABkcnMv&#10;ZG93bnJldi54bWxMj8FOwzAQRO9I/IO1SFwQtSHgkDROBUigXlv6AU68TaLGdhS7Tfr3bE5wnJ3R&#10;7JtiM9ueXXAMnXcKnlYCGLram841Cg4/X49vwELUzujeO1RwxQCb8vam0Lnxk9vhZR8bRiUu5FpB&#10;G+OQcx7qFq0OKz+gI+/oR6sjybHhZtQTlduePwshudWdow+tHvCzxfq0P1sFx+308JpN1Xc8pLsX&#10;+aG7tPJXpe7v5vc1sIhz/AvDgk/oUBJT5c/OBNaTTjLaEhWkSSqBLQkhEzpViydkBrws+P8V5S8A&#10;AAD//wMAUEsBAi0AFAAGAAgAAAAhALaDOJL+AAAA4QEAABMAAAAAAAAAAAAAAAAAAAAAAFtDb250&#10;ZW50X1R5cGVzXS54bWxQSwECLQAUAAYACAAAACEAOP0h/9YAAACUAQAACwAAAAAAAAAAAAAAAAAv&#10;AQAAX3JlbHMvLnJlbHNQSwECLQAUAAYACAAAACEAOj9CJPgBAADSAwAADgAAAAAAAAAAAAAAAAAu&#10;AgAAZHJzL2Uyb0RvYy54bWxQSwECLQAUAAYACAAAACEAe6haPN8AAAANAQAADwAAAAAAAAAAAAAA&#10;AABSBAAAZHJzL2Rvd25yZXYueG1sUEsFBgAAAAAEAAQA8wAAAF4FAAAAAA==&#10;" stroked="f">
             <v:textbox style="mso-next-textbox:#_x0000_s2066">
               <w:txbxContent>
                 <w:p>
@@ -561,6 +215,7 @@
                     </w:rPr>
                     <w:t>{</w:t>
                   </w:r>
+                  <w:proofErr w:type="spellStart"/>
                   <w:proofErr w:type="gramStart"/>
                   <w:r>
                     <w:rPr>
@@ -570,6 +225,7 @@
                     </w:rPr>
                     <w:t>codeDocument</w:t>
                   </w:r>
+                  <w:proofErr w:type="spellEnd"/>
                   <w:proofErr w:type="gramEnd"/>
                   <w:r>
                     <w:rPr>
@@ -583,7 +239,7 @@
                 <w:p>
                   <w:pPr>
                     <w:rPr>
-                      <w:rFonts w:ascii="Aptos" w:hAnsi="Aptos"/>
+                      <w:rFonts w:cs="Calibri"/>
                       <w:sz w:val="22"/>
                       <w:szCs w:val="22"/>
                     </w:rPr>
@@ -591,68 +247,38 @@
                 </w:p>
                 <w:p>
                   <w:pPr>
-                    <w:ind w:right="-648"/>
-                    <w:rPr>
-                      <w:rFonts w:ascii="Arial" w:hAnsi="Arial"/>
+                    <w:rPr>
+                      <w:rFonts w:cs="Calibri"/>
                       <w:b/>
                       <w:bCs/>
-                      <w:sz w:val="20"/>
+                      <w:sz w:val="22"/>
+                      <w:szCs w:val="22"/>
                     </w:rPr>
                   </w:pPr>
                   <w:r>
                     <w:rPr>
-                      <w:rFonts w:ascii="Aptos" w:hAnsi="Aptos"/>
+                      <w:rFonts w:cs="Calibri"/>
                       <w:b/>
                       <w:bCs/>
                       <w:sz w:val="22"/>
                       <w:szCs w:val="22"/>
                     </w:rPr>
-                    <w:t>O</w:t>
-                  </w:r>
-                  <w:r>
-                    <w:rPr>
-                      <w:rFonts w:ascii="Aptos" w:hAnsi="Aptos"/>
-                      <w:b/>
-                      <w:bCs/>
-                      <w:sz w:val="22"/>
-                      <w:szCs w:val="22"/>
-                    </w:rPr>
-                    <w:t>bjet</w:t>
-                  </w:r>
-                  <w:r>
-                    <w:rPr>
-                      <w:rFonts w:ascii="Arial" w:hAnsi="Arial"/>
-                      <w:b/>
-                      <w:bCs/>
-                      <w:sz w:val="20"/>
-                    </w:rPr>
-                    <w:t xml:space="preserve"> : </w:t>
-                  </w:r>
-                  <w:r>
-                    <w:rPr>
-                      <w:rFonts w:ascii="Arial" w:hAnsi="Arial"/>
-                      <w:b/>
-                      <w:bCs/>
-                      <w:sz w:val="20"/>
-                    </w:rPr>
-                    <w:t>{objet}</w:t>
+                    <w:t>Objet : {objet}</w:t>
                   </w:r>
                 </w:p>
                 <w:p>
                   <w:pPr>
-                    <w:ind w:right="-648"/>
-                    <w:rPr>
-                      <w:rFonts w:ascii="Arial" w:hAnsi="Arial"/>
-                      <w:b/>
-                      <w:bCs/>
-                      <w:sz w:val="20"/>
+                    <w:rPr>
+                      <w:rFonts w:cs="Calibri"/>
+                      <w:sz w:val="22"/>
+                      <w:szCs w:val="22"/>
                     </w:rPr>
                   </w:pPr>
                 </w:p>
                 <w:p>
                   <w:pPr>
                     <w:rPr>
-                      <w:rFonts w:ascii="Aptos" w:hAnsi="Aptos"/>
+                      <w:rFonts w:cs="Calibri"/>
                       <w:sz w:val="22"/>
                       <w:szCs w:val="22"/>
                     </w:rPr>
@@ -660,96 +286,212 @@
                 </w:p>
                 <w:p>
                   <w:pPr>
-                    <w:jc w:val="both"/>
-                    <w:rPr>
-                      <w:rFonts w:ascii="Aptos" w:hAnsi="Aptos"/>
+                    <w:rPr>
+                      <w:rFonts w:cs="Calibri"/>
                       <w:sz w:val="22"/>
                       <w:szCs w:val="22"/>
                     </w:rPr>
                   </w:pPr>
                   <w:r>
                     <w:rPr>
-                      <w:rFonts w:ascii="Aptos" w:hAnsi="Aptos"/>
-                      <w:sz w:val="22"/>
-                      <w:szCs w:val="22"/>
-                    </w:rPr>
-                    <w:t>{</w:t>
+                      <w:rFonts w:cs="Calibri"/>
+                      <w:sz w:val="22"/>
+                      <w:szCs w:val="22"/>
+                    </w:rPr>
+                    <w:t>{-</w:t>
                   </w:r>
                   <w:proofErr w:type="spellStart"/>
                   <w:proofErr w:type="gramStart"/>
                   <w:r>
                     <w:rPr>
-                      <w:rFonts w:ascii="Aptos" w:hAnsi="Aptos"/>
+                      <w:rFonts w:cs="Calibri"/>
+                      <w:sz w:val="22"/>
+                      <w:szCs w:val="22"/>
+                    </w:rPr>
+                    <w:t>w:p</w:t>
+                  </w:r>
+                  <w:proofErr w:type="spellEnd"/>
+                  <w:proofErr w:type="gramEnd"/>
+                  <w:r>
+                    <w:rPr>
+                      <w:rFonts w:cs="Calibri"/>
+                      <w:sz w:val="22"/>
+                      <w:szCs w:val="22"/>
+                    </w:rPr>
+                    <w:t xml:space="preserve"> </w:t>
+                  </w:r>
+                  <w:proofErr w:type="spellStart"/>
+                  <w:proofErr w:type="gramStart"/>
+                  <w:r>
+                    <w:rPr>
+                      <w:rFonts w:cs="Calibri"/>
+                      <w:sz w:val="22"/>
+                      <w:szCs w:val="22"/>
+                    </w:rPr>
+                    <w:t>nomDestinataire</w:t>
+                  </w:r>
+                  <w:proofErr w:type="spellEnd"/>
+                  <w:r>
+                    <w:rPr>
+                      <w:rFonts w:cs="Calibri"/>
+                      <w:sz w:val="22"/>
+                      <w:szCs w:val="22"/>
+                    </w:rPr>
+                    <w:t>}{</w:t>
+                  </w:r>
+                  <w:proofErr w:type="spellStart"/>
+                  <w:proofErr w:type="gramEnd"/>
+                  <w:r>
+                    <w:rPr>
+                      <w:rFonts w:cs="Calibri"/>
                       <w:sz w:val="22"/>
                       <w:szCs w:val="22"/>
                     </w:rPr>
                     <w:t>civiliteDestinataire</w:t>
                   </w:r>
                   <w:proofErr w:type="spellEnd"/>
-                  <w:proofErr w:type="gramEnd"/>
-                  <w:r>
-                    <w:rPr>
-                      <w:rFonts w:ascii="Aptos" w:hAnsi="Aptos"/>
+                  <w:r>
+                    <w:rPr>
+                      <w:rFonts w:cs="Calibri"/>
+                      <w:sz w:val="22"/>
+                      <w:szCs w:val="22"/>
+                    </w:rPr>
+                    <w:t>} {</w:t>
+                  </w:r>
+                  <w:proofErr w:type="spellStart"/>
+                  <w:r>
+                    <w:rPr>
+                      <w:rFonts w:cs="Calibri"/>
+                      <w:sz w:val="22"/>
+                      <w:szCs w:val="22"/>
+                    </w:rPr>
+                    <w:t>nomDestinataire</w:t>
+                  </w:r>
+                  <w:proofErr w:type="spellEnd"/>
+                  <w:r>
+                    <w:rPr>
+                      <w:rFonts w:cs="Calibri"/>
+                      <w:sz w:val="22"/>
+                      <w:szCs w:val="22"/>
+                    </w:rPr>
+                    <w:t>}{/</w:t>
+                  </w:r>
+                  <w:proofErr w:type="spellStart"/>
+                  <w:r>
+                    <w:rPr>
+                      <w:rFonts w:cs="Calibri"/>
+                      <w:sz w:val="22"/>
+                      <w:szCs w:val="22"/>
+                    </w:rPr>
+                    <w:t>nomDestinataire</w:t>
+                  </w:r>
+                  <w:proofErr w:type="spellEnd"/>
+                  <w:r>
+                    <w:rPr>
+                      <w:rFonts w:cs="Calibri"/>
                       <w:sz w:val="22"/>
                       <w:szCs w:val="22"/>
                     </w:rPr>
                     <w:t>}</w:t>
-                  </w:r>
-                  <w:r>
-                    <w:rPr>
-                      <w:rFonts w:ascii="Aptos" w:hAnsi="Aptos"/>
-                      <w:sz w:val="22"/>
-                      <w:szCs w:val="22"/>
-                    </w:rPr>
-                    <w:t xml:space="preserve"> {</w:t>
-                  </w:r>
-                  <w:proofErr w:type="spellStart"/>
-                  <w:r>
-                    <w:rPr>
-                      <w:rFonts w:ascii="Aptos" w:hAnsi="Aptos"/>
-                      <w:sz w:val="22"/>
-                      <w:szCs w:val="22"/>
-                    </w:rPr>
-                    <w:t>nom</w:t>
-                  </w:r>
-                  <w:r>
-                    <w:rPr>
-                      <w:rFonts w:ascii="Aptos" w:hAnsi="Aptos"/>
-                      <w:sz w:val="22"/>
-                      <w:szCs w:val="22"/>
-                    </w:rPr>
-                    <w:t>D</w:t>
-                  </w:r>
-                  <w:r>
-                    <w:rPr>
-                      <w:rFonts w:ascii="Aptos" w:hAnsi="Aptos"/>
-                      <w:sz w:val="22"/>
-                      <w:szCs w:val="22"/>
-                    </w:rPr>
-                    <w:t>estinataire</w:t>
-                  </w:r>
-                  <w:proofErr w:type="spellEnd"/>
-                  <w:r>
-                    <w:rPr>
-                      <w:rFonts w:ascii="Aptos" w:hAnsi="Aptos"/>
-                      <w:sz w:val="22"/>
-                      <w:szCs w:val="22"/>
-                    </w:rPr>
-                    <w:t>}</w:t>
-                  </w:r>
-                  <w:r>
-                    <w:rPr>
-                      <w:rFonts w:ascii="Aptos" w:hAnsi="Aptos"/>
-                      <w:sz w:val="22"/>
-                      <w:szCs w:val="22"/>
-                    </w:rPr>
-                    <w:t>,</w:t>
                   </w:r>
                 </w:p>
                 <w:p>
                   <w:pPr>
                     <w:rPr>
-                      <w:rFonts w:ascii="Aptos" w:hAnsi="Aptos"/>
+                      <w:rFonts w:cs="Calibri"/>
+                      <w:sz w:val="22"/>
+                      <w:szCs w:val="22"/>
+                    </w:rPr>
+                  </w:pPr>
+                  <w:r>
+                    <w:rPr>
+                      <w:rFonts w:cs="Calibri"/>
+                      <w:sz w:val="22"/>
+                      <w:szCs w:val="22"/>
+                    </w:rPr>
+                    <w:t>{-</w:t>
+                  </w:r>
+                  <w:proofErr w:type="spellStart"/>
+                  <w:proofErr w:type="gramStart"/>
+                  <w:r>
+                    <w:rPr>
+                      <w:rFonts w:cs="Calibri"/>
+                      <w:sz w:val="22"/>
+                      <w:szCs w:val="22"/>
+                    </w:rPr>
+                    <w:t>w:p</w:t>
+                  </w:r>
+                  <w:proofErr w:type="spellEnd"/>
+                  <w:proofErr w:type="gramEnd"/>
+                  <w:r>
+                    <w:rPr>
+                      <w:rFonts w:cs="Calibri"/>
+                      <w:sz w:val="22"/>
+                      <w:szCs w:val="22"/>
+                    </w:rPr>
+                    <w:t xml:space="preserve"> </w:t>
+                  </w:r>
+                  <w:proofErr w:type="spellStart"/>
+                  <w:proofErr w:type="gramStart"/>
+                  <w:r>
+                    <w:rPr>
+                      <w:rFonts w:cs="Calibri"/>
+                      <w:sz w:val="22"/>
+                      <w:szCs w:val="22"/>
+                    </w:rPr>
+                    <w:t>statutDestinataire</w:t>
+                  </w:r>
+                  <w:proofErr w:type="spellEnd"/>
+                  <w:r>
+                    <w:rPr>
+                      <w:rFonts w:cs="Calibri"/>
+                      <w:sz w:val="22"/>
+                      <w:szCs w:val="22"/>
+                    </w:rPr>
+                    <w:t>}{</w:t>
+                  </w:r>
+                  <w:proofErr w:type="spellStart"/>
+                  <w:proofErr w:type="gramEnd"/>
+                  <w:r>
+                    <w:rPr>
+                      <w:rFonts w:cs="Calibri"/>
+                      <w:sz w:val="22"/>
+                      <w:szCs w:val="22"/>
+                    </w:rPr>
+                    <w:t>statutDestinataire</w:t>
+                  </w:r>
+                  <w:proofErr w:type="spellEnd"/>
+                  <w:r>
+                    <w:rPr>
+                      <w:rFonts w:cs="Calibri"/>
+                      <w:sz w:val="22"/>
+                      <w:szCs w:val="22"/>
+                    </w:rPr>
+                    <w:t>}{/</w:t>
+                  </w:r>
+                  <w:proofErr w:type="spellStart"/>
+                  <w:r>
+                    <w:rPr>
+                      <w:rFonts w:cs="Calibri"/>
+                      <w:sz w:val="22"/>
+                      <w:szCs w:val="22"/>
+                    </w:rPr>
+                    <w:t>statutDestinataire</w:t>
+                  </w:r>
+                  <w:proofErr w:type="spellEnd"/>
+                  <w:r>
+                    <w:rPr>
+                      <w:rFonts w:cs="Calibri"/>
+                      <w:sz w:val="22"/>
+                      <w:szCs w:val="22"/>
+                    </w:rPr>
+                    <w:t>},</w:t>
+                  </w:r>
+                </w:p>
+                <w:p>
+                  <w:pPr>
+                    <w:rPr>
+                      <w:rFonts w:cs="Calibri"/>
                       <w:sz w:val="22"/>
                       <w:szCs w:val="22"/>
                     </w:rPr>
@@ -765,7 +507,7 @@
                   </w:pPr>
                   <w:r>
                     <w:rPr>
-                      <w:rFonts w:ascii="Aptos" w:hAnsi="Aptos"/>
+                      <w:rFonts w:cs="Calibri"/>
                       <w:sz w:val="22"/>
                       <w:szCs w:val="22"/>
                     </w:rPr>
@@ -775,33 +517,17 @@
                   <w:proofErr w:type="gramStart"/>
                   <w:r>
                     <w:rPr>
-                      <w:rFonts w:ascii="Aptos" w:hAnsi="Aptos"/>
-                      <w:sz w:val="22"/>
-                      <w:szCs w:val="22"/>
-                    </w:rPr>
-                    <w:t>text</w:t>
-                  </w:r>
-                  <w:r>
-                    <w:rPr>
-                      <w:rFonts w:ascii="Aptos" w:hAnsi="Aptos"/>
-                      <w:sz w:val="22"/>
-                      <w:szCs w:val="22"/>
-                    </w:rPr>
-                    <w:t>e</w:t>
-                  </w:r>
-                  <w:r>
-                    <w:rPr>
-                      <w:rFonts w:ascii="Aptos" w:hAnsi="Aptos"/>
-                      <w:sz w:val="22"/>
-                      <w:szCs w:val="22"/>
-                    </w:rPr>
-                    <w:t>Ia</w:t>
+                      <w:rFonts w:cs="Calibri"/>
+                      <w:sz w:val="22"/>
+                      <w:szCs w:val="22"/>
+                    </w:rPr>
+                    <w:t>texteIa</w:t>
                   </w:r>
                   <w:proofErr w:type="spellEnd"/>
                   <w:proofErr w:type="gramEnd"/>
                   <w:r>
                     <w:rPr>
-                      <w:rFonts w:ascii="Aptos" w:hAnsi="Aptos"/>
+                      <w:rFonts w:cs="Calibri"/>
                       <w:sz w:val="22"/>
                       <w:szCs w:val="22"/>
                     </w:rPr>
@@ -809,6 +535,619 @@
                   </w:r>
                 </w:p>
                 <w:permEnd w:id="350494471"/>
+              </w:txbxContent>
+            </v:textbox>
+          </v:shape>
+        </w:pict>
+      </w:r>
+      <w:r>
+        <w:rPr>
+          <w:rFonts w:ascii="Aptos" w:hAnsi="Aptos"/>
+          <w:noProof/>
+          <w:sz w:val="22"/>
+          <w:szCs w:val="22"/>
+        </w:rPr>
+        <w:pict w14:anchorId="2F3011E9">
+          <v:shape id="_x0000_s2062" type="#_x0000_t202" style="position:absolute;margin-left:292.1pt;margin-top:128.6pt;width:251.05pt;height:155.6pt;z-index:251656192;visibility:visible;mso-width-relative:margin;mso-height-relative:margin" o:gfxdata="UEsDBBQABgAIAAAAIQC2gziS/gAAAOEBAAATAAAAW0NvbnRlbnRfVHlwZXNdLnhtbJSRQU7DMBBF&#10;90jcwfIWJU67QAgl6YK0S0CoHGBkTxKLZGx5TGhvj5O2G0SRWNoz/78nu9wcxkFMGNg6quQqL6RA&#10;0s5Y6ir5vt9lD1JwBDIwOMJKHpHlpr69KfdHjyxSmriSfYz+USnWPY7AufNIadK6MEJMx9ApD/oD&#10;OlTrorhX2lFEilmcO2RdNtjC5xDF9pCuTyYBB5bi6bQ4syoJ3g9WQ0ymaiLzg5KdCXlKLjvcW893&#10;SUOqXwnz5DrgnHtJTxOsQfEKIT7DmDSUCaxw7Rqn8787ZsmRM9e2VmPeBN4uqYvTtW7jvijg9N/y&#10;JsXecLq0q+WD6m8AAAD//wMAUEsDBBQABgAIAAAAIQA4/SH/1gAAAJQBAAALAAAAX3JlbHMvLnJl&#10;bHOkkMFqwzAMhu+DvYPRfXGawxijTi+j0GvpHsDYimMaW0Yy2fr2M4PBMnrbUb/Q94l/f/hMi1qR&#10;JVI2sOt6UJgd+ZiDgffL8ekFlFSbvV0oo4EbChzGx4f9GRdb25HMsYhqlCwG5lrLq9biZkxWOiqY&#10;22YiTra2kYMu1l1tQD30/bPm3wwYN0x18gb45AdQl1tp5j/sFB2T0FQ7R0nTNEV3j6o9feQzro1i&#10;OWA14Fm+Q8a1a8+Bvu/d/dMb2JY5uiPbhG/ktn4cqGU/er3pcvwCAAD//wMAUEsDBBQABgAIAAAA&#10;IQCVjOgwOwIAAG0EAAAOAAAAZHJzL2Uyb0RvYy54bWysVEtv2zAMvg/YfxB0Xxzn1dSIU2QpMgwI&#10;2gLp0LMiy7EAWdQkJXb260fJebXbaVgOCilSfHwf6dlDWytyENZJ0DlNe31KhOZQSL3L6Y/X1Zcp&#10;Jc4zXTAFWuT0KBx9mH/+NGtMJgZQgSqEJRhEu6wxOa28N1mSOF6JmrkeGKHRWIKtmUfV7pLCsgaj&#10;1yoZ9PuTpAFbGAtcOIe3j52RzmP8shTcP5elE56onGJtPp42nttwJvMZy3aWmUryUxnsH6qomdSY&#10;9BLqkXlG9lb+EaqW3IKD0vc41AmUpeQi9oDdpP0P3WwqZkTsBcFx5gKT+39h+dNhY14s8e1XaJHA&#10;AEhjXObwMvTTlrYO/1gpQTtCeLzAJlpPOF4O0+l0OBxTwtGWDu4nk7sIbHJ9bqzz3wTUJAg5tchL&#10;hIsd1s5jSnQ9u4RsDpQsVlKpqBzdUllyYEghMl9AQ4lizuNlTlfxF6rGEO+eKU2anE6G437MpCHE&#10;6/yURvdrl0Hy7bYlsrhBYAvFEYGx0M2MM3wlsfg1Zn5hFocEscDB9894lAowF5wkSiqwv/52H/yR&#10;O7RS0uDQ5dT93DMrsKHvGlm9T0ejMKVRGY3vBqjYW8v21qL39RIQlBRXzPAoBn+vzmJpoX7D/ViE&#10;rGhimmPunPqzuPTdKuB+cbFYRCecS8P8Wm8MD6EDA4Ga1/aNWXPizyP1T3AeT5Z9oLHzDS81LPYe&#10;Shk5Djh3qJ7gx5mOvJ32LyzNrR69rl+J+W8AAAD//wMAUEsDBBQABgAIAAAAIQDbCZ5r3wAAAAwB&#10;AAAPAAAAZHJzL2Rvd25yZXYueG1sTI9BTwIxEIXvJv6HZky8ScuiFdadJcbEq4mAnMu2bDe20822&#10;wMKvt5zkOHlf3vumWo7esaMZYhcIYToRwAw1QXfUImzWn09zYDEp0soFMghnE2FZ399VqtThRN/m&#10;uEotyyUUS4VgU+pLzmNjjVdxEnpDOduHwauUz6HlelCnXO4dL4SQ3KuO8oJVvfmwpvldHTzCtvWX&#10;7c+0H6z27pm+Luf1JnSIjw/j+xuwZMb0D8NVP6tDnZ124UA6MofwIkWRUYTZQr4CuxJCFjNgOwQp&#10;xAJ4XfHbJ+o/AAAA//8DAFBLAQItABQABgAIAAAAIQC2gziS/gAAAOEBAAATAAAAAAAAAAAAAAAA&#10;AAAAAABbQ29udGVudF9UeXBlc10ueG1sUEsBAi0AFAAGAAgAAAAhADj9If/WAAAAlAEAAAsAAAAA&#10;AAAAAAAAAAAALwEAAF9yZWxzLy5yZWxzUEsBAi0AFAAGAAgAAAAhAJWM6DA7AgAAbQQAAA4AAAAA&#10;AAAAAAAAAAAALgIAAGRycy9lMm9Eb2MueG1sUEsBAi0AFAAGAAgAAAAhANsJnmvfAAAADAEAAA8A&#10;AAAAAAAAAAAAAAAAlQQAAGRycy9kb3ducmV2LnhtbFBLBQYAAAAABAAEAPMAAAChBQAAAAA=&#10;" stroked="f" strokeweight=".5pt">
+            <v:textbox style="mso-next-textbox:#_x0000_s2062">
+              <w:txbxContent>
+                <w:p>
+                  <w:pPr>
+                    <w:rPr>
+                      <w:rFonts w:ascii="Aptos" w:hAnsi="Aptos"/>
+                      <w:color w:val="020418"/>
+                      <w:sz w:val="22"/>
+                    </w:rPr>
+                  </w:pPr>
+                  <w:r>
+                    <w:rPr>
+                      <w:rFonts w:ascii="Aptos" w:hAnsi="Aptos"/>
+                      <w:color w:val="020418"/>
+                      <w:sz w:val="22"/>
+                    </w:rPr>
+                    <w:t>{</w:t>
+                  </w:r>
+                  <w:proofErr w:type="gramStart"/>
+                  <w:r>
+                    <w:rPr>
+                      <w:rFonts w:ascii="Aptos" w:hAnsi="Aptos"/>
+                      <w:color w:val="020418"/>
+                      <w:sz w:val="22"/>
+                    </w:rPr>
+                    <w:t>entreprise</w:t>
+                  </w:r>
+                  <w:proofErr w:type="gramEnd"/>
+                  <w:r>
+                    <w:rPr>
+                      <w:rFonts w:ascii="Aptos" w:hAnsi="Aptos"/>
+                      <w:color w:val="020418"/>
+                      <w:sz w:val="22"/>
+                    </w:rPr>
+                    <w:t>}</w:t>
+                  </w:r>
+                </w:p>
+                <w:p>
+                  <w:pPr>
+                    <w:rPr>
+                      <w:rFonts w:ascii="Aptos" w:hAnsi="Aptos"/>
+                      <w:color w:val="020418"/>
+                      <w:sz w:val="22"/>
+                    </w:rPr>
+                  </w:pPr>
+                  <w:r>
+                    <w:rPr>
+                      <w:rFonts w:ascii="Aptos" w:hAnsi="Aptos"/>
+                      <w:color w:val="020418"/>
+                      <w:sz w:val="22"/>
+                    </w:rPr>
+                    <w:t>{-</w:t>
+                  </w:r>
+                  <w:proofErr w:type="spellStart"/>
+                  <w:proofErr w:type="gramStart"/>
+                  <w:r>
+                    <w:rPr>
+                      <w:rFonts w:ascii="Aptos" w:hAnsi="Aptos"/>
+                      <w:color w:val="020418"/>
+                      <w:sz w:val="22"/>
+                    </w:rPr>
+                    <w:t>w:p</w:t>
+                  </w:r>
+                  <w:proofErr w:type="spellEnd"/>
+                  <w:proofErr w:type="gramEnd"/>
+                  <w:r>
+                    <w:rPr>
+                      <w:rFonts w:ascii="Aptos" w:hAnsi="Aptos"/>
+                      <w:color w:val="020418"/>
+                      <w:sz w:val="22"/>
+                    </w:rPr>
+                    <w:t xml:space="preserve"> </w:t>
+                  </w:r>
+                  <w:proofErr w:type="spellStart"/>
+                  <w:proofErr w:type="gramStart"/>
+                  <w:r>
+                    <w:rPr>
+                      <w:rFonts w:ascii="Aptos" w:hAnsi="Aptos"/>
+                      <w:color w:val="020418"/>
+                      <w:sz w:val="22"/>
+                    </w:rPr>
+                    <w:t>nomDestinataire</w:t>
+                  </w:r>
+                  <w:proofErr w:type="spellEnd"/>
+                  <w:r>
+                    <w:rPr>
+                      <w:rFonts w:ascii="Aptos" w:hAnsi="Aptos"/>
+                      <w:color w:val="020418"/>
+                      <w:sz w:val="22"/>
+                    </w:rPr>
+                    <w:t>}{</w:t>
+                  </w:r>
+                  <w:proofErr w:type="spellStart"/>
+                  <w:proofErr w:type="gramEnd"/>
+                  <w:r>
+                    <w:rPr>
+                      <w:rFonts w:ascii="Aptos" w:hAnsi="Aptos"/>
+                      <w:color w:val="020418"/>
+                      <w:sz w:val="22"/>
+                    </w:rPr>
+                    <w:t>civiliteDestinataire</w:t>
+                  </w:r>
+                  <w:proofErr w:type="spellEnd"/>
+                  <w:r>
+                    <w:rPr>
+                      <w:rFonts w:ascii="Aptos" w:hAnsi="Aptos"/>
+                      <w:color w:val="020418"/>
+                      <w:sz w:val="22"/>
+                    </w:rPr>
+                    <w:t>} {</w:t>
+                  </w:r>
+                  <w:proofErr w:type="spellStart"/>
+                  <w:r>
+                    <w:rPr>
+                      <w:rFonts w:ascii="Aptos" w:hAnsi="Aptos"/>
+                      <w:color w:val="020418"/>
+                      <w:sz w:val="22"/>
+                    </w:rPr>
+                    <w:t>nomDestinataire</w:t>
+                  </w:r>
+                  <w:proofErr w:type="spellEnd"/>
+                  <w:r>
+                    <w:rPr>
+                      <w:rFonts w:ascii="Aptos" w:hAnsi="Aptos"/>
+                      <w:color w:val="020418"/>
+                      <w:sz w:val="22"/>
+                    </w:rPr>
+                    <w:t>}{/</w:t>
+                  </w:r>
+                  <w:proofErr w:type="spellStart"/>
+                  <w:r>
+                    <w:rPr>
+                      <w:rFonts w:ascii="Aptos" w:hAnsi="Aptos"/>
+                      <w:color w:val="020418"/>
+                      <w:sz w:val="22"/>
+                    </w:rPr>
+                    <w:t>nomDestinataire</w:t>
+                  </w:r>
+                  <w:proofErr w:type="spellEnd"/>
+                  <w:r>
+                    <w:rPr>
+                      <w:rFonts w:ascii="Aptos" w:hAnsi="Aptos"/>
+                      <w:color w:val="020418"/>
+                      <w:sz w:val="22"/>
+                    </w:rPr>
+                    <w:t>}</w:t>
+                  </w:r>
+                </w:p>
+                <w:p>
+                  <w:pPr>
+                    <w:rPr>
+                      <w:rFonts w:ascii="Aptos" w:hAnsi="Aptos"/>
+                      <w:color w:val="020418"/>
+                      <w:sz w:val="22"/>
+                    </w:rPr>
+                  </w:pPr>
+                  <w:r>
+                    <w:rPr>
+                      <w:rFonts w:ascii="Aptos" w:hAnsi="Aptos"/>
+                      <w:color w:val="020418"/>
+                      <w:sz w:val="22"/>
+                    </w:rPr>
+                    <w:t>{-</w:t>
+                  </w:r>
+                  <w:proofErr w:type="spellStart"/>
+                  <w:proofErr w:type="gramStart"/>
+                  <w:r>
+                    <w:rPr>
+                      <w:rFonts w:ascii="Aptos" w:hAnsi="Aptos"/>
+                      <w:color w:val="020418"/>
+                      <w:sz w:val="22"/>
+                    </w:rPr>
+                    <w:t>w:p</w:t>
+                  </w:r>
+                  <w:proofErr w:type="spellEnd"/>
+                  <w:proofErr w:type="gramEnd"/>
+                  <w:r>
+                    <w:rPr>
+                      <w:rFonts w:ascii="Aptos" w:hAnsi="Aptos"/>
+                      <w:color w:val="020418"/>
+                      <w:sz w:val="22"/>
+                    </w:rPr>
+                    <w:t xml:space="preserve"> </w:t>
+                  </w:r>
+                  <w:proofErr w:type="spellStart"/>
+                  <w:proofErr w:type="gramStart"/>
+                  <w:r>
+                    <w:rPr>
+                      <w:rFonts w:ascii="Aptos" w:hAnsi="Aptos"/>
+                      <w:color w:val="020418"/>
+                      <w:sz w:val="22"/>
+                    </w:rPr>
+                    <w:t>statutDestinataire</w:t>
+                  </w:r>
+                  <w:proofErr w:type="spellEnd"/>
+                  <w:r>
+                    <w:rPr>
+                      <w:rFonts w:ascii="Aptos" w:hAnsi="Aptos"/>
+                      <w:color w:val="020418"/>
+                      <w:sz w:val="22"/>
+                    </w:rPr>
+                    <w:t>}{</w:t>
+                  </w:r>
+                  <w:proofErr w:type="gramEnd"/>
+                  <w:r>
+                    <w:rPr>
+                      <w:rFonts w:ascii="Aptos" w:hAnsi="Aptos"/>
+                      <w:color w:val="020418"/>
+                      <w:sz w:val="22"/>
+                    </w:rPr>
+                    <w:t>genre} {</w:t>
+                  </w:r>
+                  <w:proofErr w:type="spellStart"/>
+                  <w:r>
+                    <w:rPr>
+                      <w:rFonts w:ascii="Aptos" w:hAnsi="Aptos"/>
+                      <w:color w:val="020418"/>
+                      <w:sz w:val="22"/>
+                    </w:rPr>
+                    <w:t>statutDestinataire</w:t>
+                  </w:r>
+                  <w:proofErr w:type="spellEnd"/>
+                  <w:r>
+                    <w:rPr>
+                      <w:rFonts w:ascii="Aptos" w:hAnsi="Aptos"/>
+                      <w:color w:val="020418"/>
+                      <w:sz w:val="22"/>
+                    </w:rPr>
+                    <w:t>}{/</w:t>
+                  </w:r>
+                  <w:proofErr w:type="spellStart"/>
+                  <w:r>
+                    <w:rPr>
+                      <w:rFonts w:ascii="Aptos" w:hAnsi="Aptos"/>
+                      <w:color w:val="020418"/>
+                      <w:sz w:val="22"/>
+                    </w:rPr>
+                    <w:t>statutDestinataire</w:t>
+                  </w:r>
+                  <w:proofErr w:type="spellEnd"/>
+                  <w:r>
+                    <w:rPr>
+                      <w:rFonts w:ascii="Aptos" w:hAnsi="Aptos"/>
+                      <w:color w:val="020418"/>
+                      <w:sz w:val="22"/>
+                    </w:rPr>
+                    <w:t>}</w:t>
+                  </w:r>
+                </w:p>
+                <w:p>
+                  <w:pPr>
+                    <w:rPr>
+                      <w:rFonts w:ascii="Aptos" w:hAnsi="Aptos"/>
+                      <w:color w:val="020418"/>
+                      <w:sz w:val="22"/>
+                    </w:rPr>
+                  </w:pPr>
+                  <w:r>
+                    <w:rPr>
+                      <w:rFonts w:ascii="Aptos" w:hAnsi="Aptos"/>
+                      <w:color w:val="020418"/>
+                      <w:sz w:val="22"/>
+                    </w:rPr>
+                    <w:t>{-</w:t>
+                  </w:r>
+                  <w:proofErr w:type="spellStart"/>
+                  <w:proofErr w:type="gramStart"/>
+                  <w:r>
+                    <w:rPr>
+                      <w:rFonts w:ascii="Aptos" w:hAnsi="Aptos"/>
+                      <w:color w:val="020418"/>
+                      <w:sz w:val="22"/>
+                    </w:rPr>
+                    <w:t>w:p</w:t>
+                  </w:r>
+                  <w:proofErr w:type="spellEnd"/>
+                  <w:proofErr w:type="gramEnd"/>
+                  <w:r>
+                    <w:rPr>
+                      <w:rFonts w:ascii="Aptos" w:hAnsi="Aptos"/>
+                      <w:color w:val="020418"/>
+                      <w:sz w:val="22"/>
+                    </w:rPr>
+                    <w:t xml:space="preserve"> </w:t>
+                  </w:r>
+                  <w:proofErr w:type="spellStart"/>
+                  <w:proofErr w:type="gramStart"/>
+                  <w:r>
+                    <w:rPr>
+                      <w:rFonts w:ascii="Aptos" w:hAnsi="Aptos"/>
+                      <w:color w:val="020418"/>
+                      <w:sz w:val="22"/>
+                    </w:rPr>
+                    <w:t>batiment</w:t>
+                  </w:r>
+                  <w:proofErr w:type="spellEnd"/>
+                  <w:r>
+                    <w:rPr>
+                      <w:rFonts w:ascii="Aptos" w:hAnsi="Aptos"/>
+                      <w:color w:val="020418"/>
+                      <w:sz w:val="22"/>
+                    </w:rPr>
+                    <w:t>}{</w:t>
+                  </w:r>
+                  <w:proofErr w:type="spellStart"/>
+                  <w:proofErr w:type="gramEnd"/>
+                  <w:r>
+                    <w:rPr>
+                      <w:rFonts w:ascii="Aptos" w:hAnsi="Aptos"/>
+                      <w:color w:val="020418"/>
+                      <w:sz w:val="22"/>
+                    </w:rPr>
+                    <w:t>batiment</w:t>
+                  </w:r>
+                  <w:proofErr w:type="spellEnd"/>
+                  <w:r>
+                    <w:rPr>
+                      <w:rFonts w:ascii="Aptos" w:hAnsi="Aptos"/>
+                      <w:color w:val="020418"/>
+                      <w:sz w:val="22"/>
+                    </w:rPr>
+                    <w:t>}{/</w:t>
+                  </w:r>
+                  <w:proofErr w:type="spellStart"/>
+                  <w:r>
+                    <w:rPr>
+                      <w:rFonts w:ascii="Aptos" w:hAnsi="Aptos"/>
+                      <w:color w:val="020418"/>
+                      <w:sz w:val="22"/>
+                    </w:rPr>
+                    <w:t>batiment</w:t>
+                  </w:r>
+                  <w:proofErr w:type="spellEnd"/>
+                  <w:r>
+                    <w:rPr>
+                      <w:rFonts w:ascii="Aptos" w:hAnsi="Aptos"/>
+                      <w:color w:val="020418"/>
+                      <w:sz w:val="22"/>
+                    </w:rPr>
+                    <w:t>}</w:t>
+                  </w:r>
+                </w:p>
+                <w:p>
+                  <w:pPr>
+                    <w:rPr>
+                      <w:rFonts w:ascii="Aptos" w:hAnsi="Aptos"/>
+                      <w:color w:val="020418"/>
+                      <w:sz w:val="22"/>
+                    </w:rPr>
+                  </w:pPr>
+                  <w:r>
+                    <w:rPr>
+                      <w:rFonts w:ascii="Aptos" w:hAnsi="Aptos"/>
+                      <w:color w:val="020418"/>
+                      <w:sz w:val="22"/>
+                    </w:rPr>
+                    <w:t>{-</w:t>
+                  </w:r>
+                  <w:proofErr w:type="spellStart"/>
+                  <w:proofErr w:type="gramStart"/>
+                  <w:r>
+                    <w:rPr>
+                      <w:rFonts w:ascii="Aptos" w:hAnsi="Aptos"/>
+                      <w:color w:val="020418"/>
+                      <w:sz w:val="22"/>
+                    </w:rPr>
+                    <w:t>w:p</w:t>
+                  </w:r>
+                  <w:proofErr w:type="spellEnd"/>
+                  <w:proofErr w:type="gramEnd"/>
+                  <w:r>
+                    <w:rPr>
+                      <w:rFonts w:ascii="Aptos" w:hAnsi="Aptos"/>
+                      <w:color w:val="020418"/>
+                      <w:sz w:val="22"/>
+                    </w:rPr>
+                    <w:t xml:space="preserve"> </w:t>
+                  </w:r>
+                  <w:proofErr w:type="gramStart"/>
+                  <w:r>
+                    <w:rPr>
+                      <w:rFonts w:ascii="Aptos" w:hAnsi="Aptos"/>
+                      <w:color w:val="020418"/>
+                      <w:sz w:val="22"/>
+                    </w:rPr>
+                    <w:t>adresse}{</w:t>
+                  </w:r>
+                  <w:proofErr w:type="gramEnd"/>
+                  <w:r>
+                    <w:rPr>
+                      <w:rFonts w:ascii="Aptos" w:hAnsi="Aptos"/>
+                      <w:color w:val="020418"/>
+                      <w:sz w:val="22"/>
+                    </w:rPr>
+                    <w:t>adresse}{/adresse}</w:t>
+                  </w:r>
+                </w:p>
+                <w:p>
+                  <w:pPr>
+                    <w:rPr>
+                      <w:rFonts w:ascii="Aptos" w:hAnsi="Aptos"/>
+                      <w:color w:val="020418"/>
+                      <w:sz w:val="22"/>
+                    </w:rPr>
+                  </w:pPr>
+                  <w:r>
+                    <w:rPr>
+                      <w:rFonts w:ascii="Aptos" w:hAnsi="Aptos"/>
+                      <w:color w:val="020418"/>
+                      <w:sz w:val="22"/>
+                    </w:rPr>
+                    <w:t>{-</w:t>
+                  </w:r>
+                  <w:proofErr w:type="spellStart"/>
+                  <w:proofErr w:type="gramStart"/>
+                  <w:r>
+                    <w:rPr>
+                      <w:rFonts w:ascii="Aptos" w:hAnsi="Aptos"/>
+                      <w:color w:val="020418"/>
+                      <w:sz w:val="22"/>
+                    </w:rPr>
+                    <w:t>w:p</w:t>
+                  </w:r>
+                  <w:proofErr w:type="spellEnd"/>
+                  <w:proofErr w:type="gramEnd"/>
+                  <w:r>
+                    <w:rPr>
+                      <w:rFonts w:ascii="Aptos" w:hAnsi="Aptos"/>
+                      <w:color w:val="020418"/>
+                      <w:sz w:val="22"/>
+                    </w:rPr>
+                    <w:t xml:space="preserve"> </w:t>
+                  </w:r>
+                  <w:proofErr w:type="spellStart"/>
+                  <w:proofErr w:type="gramStart"/>
+                  <w:r>
+                    <w:rPr>
+                      <w:rFonts w:ascii="Aptos" w:hAnsi="Aptos"/>
+                      <w:color w:val="020418"/>
+                      <w:sz w:val="22"/>
+                    </w:rPr>
+                    <w:t>cpVille</w:t>
+                  </w:r>
+                  <w:proofErr w:type="spellEnd"/>
+                  <w:r>
+                    <w:rPr>
+                      <w:rFonts w:ascii="Aptos" w:hAnsi="Aptos"/>
+                      <w:color w:val="020418"/>
+                      <w:sz w:val="22"/>
+                    </w:rPr>
+                    <w:t>}{</w:t>
+                  </w:r>
+                  <w:proofErr w:type="spellStart"/>
+                  <w:proofErr w:type="gramEnd"/>
+                  <w:r>
+                    <w:rPr>
+                      <w:rFonts w:ascii="Aptos" w:hAnsi="Aptos"/>
+                      <w:color w:val="020418"/>
+                      <w:sz w:val="22"/>
+                    </w:rPr>
+                    <w:t>cpVille</w:t>
+                  </w:r>
+                  <w:proofErr w:type="spellEnd"/>
+                  <w:r>
+                    <w:rPr>
+                      <w:rFonts w:ascii="Aptos" w:hAnsi="Aptos"/>
+                      <w:color w:val="020418"/>
+                      <w:sz w:val="22"/>
+                    </w:rPr>
+                    <w:t>}{/</w:t>
+                  </w:r>
+                  <w:proofErr w:type="spellStart"/>
+                  <w:r>
+                    <w:rPr>
+                      <w:rFonts w:ascii="Aptos" w:hAnsi="Aptos"/>
+                      <w:color w:val="020418"/>
+                      <w:sz w:val="22"/>
+                    </w:rPr>
+                    <w:t>cpVille</w:t>
+                  </w:r>
+                  <w:proofErr w:type="spellEnd"/>
+                  <w:r>
+                    <w:rPr>
+                      <w:rFonts w:ascii="Aptos" w:hAnsi="Aptos"/>
+                      <w:color w:val="020418"/>
+                      <w:sz w:val="22"/>
+                    </w:rPr>
+                    <w:t>}</w:t>
+                  </w:r>
+                </w:p>
+                <w:p>
+                  <w:pPr>
+                    <w:rPr>
+                      <w:rFonts w:ascii="Aptos" w:hAnsi="Aptos"/>
+                      <w:sz w:val="22"/>
+                      <w:szCs w:val="22"/>
+                    </w:rPr>
+                  </w:pPr>
+                  <w:r>
+                    <w:rPr>
+                      <w:rFonts w:ascii="Aptos" w:hAnsi="Aptos"/>
+                      <w:color w:val="020418"/>
+                      <w:sz w:val="22"/>
+                    </w:rPr>
+                    <w:t>{-</w:t>
+                  </w:r>
+                  <w:proofErr w:type="spellStart"/>
+                  <w:proofErr w:type="gramStart"/>
+                  <w:r>
+                    <w:rPr>
+                      <w:rFonts w:ascii="Aptos" w:hAnsi="Aptos"/>
+                      <w:color w:val="020418"/>
+                      <w:sz w:val="22"/>
+                    </w:rPr>
+                    <w:t>w:p</w:t>
+                  </w:r>
+                  <w:proofErr w:type="spellEnd"/>
+                  <w:proofErr w:type="gramEnd"/>
+                  <w:r>
+                    <w:rPr>
+                      <w:rFonts w:ascii="Aptos" w:hAnsi="Aptos"/>
+                      <w:color w:val="020418"/>
+                      <w:sz w:val="22"/>
+                    </w:rPr>
+                    <w:t xml:space="preserve"> </w:t>
+                  </w:r>
+                  <w:proofErr w:type="spellStart"/>
+                  <w:r>
+                    <w:rPr>
+                      <w:rFonts w:ascii="Aptos" w:hAnsi="Aptos"/>
+                      <w:color w:val="020418"/>
+                      <w:sz w:val="22"/>
+                    </w:rPr>
+                    <w:t>emailDestinataire</w:t>
+                  </w:r>
+                  <w:proofErr w:type="spellEnd"/>
+                  <w:r>
+                    <w:rPr>
+                      <w:rFonts w:ascii="Aptos" w:hAnsi="Aptos"/>
+                      <w:color w:val="020418"/>
+                      <w:sz w:val="22"/>
+                    </w:rPr>
+                    <w:t>}</w:t>
+                  </w:r>
+                  <w:hyperlink r:id="rId7" w:history="1">
+                    <w:r>
+                      <w:rPr>
+                        <w:rStyle w:val="Lienhypertexte"/>
+                        <w:rFonts w:ascii="Aptos" w:hAnsi="Aptos"/>
+                        <w:sz w:val="22"/>
+                      </w:rPr>
+                      <w:t>{</w:t>
+                    </w:r>
+                    <w:proofErr w:type="spellStart"/>
+                    <w:r>
+                      <w:rPr>
+                        <w:rStyle w:val="Lienhypertexte"/>
+                        <w:rFonts w:ascii="Aptos" w:hAnsi="Aptos"/>
+                        <w:sz w:val="22"/>
+                      </w:rPr>
+                      <w:t>emailDestinataire</w:t>
+                    </w:r>
+                    <w:proofErr w:type="spellEnd"/>
+                    <w:r>
+                      <w:rPr>
+                        <w:rStyle w:val="Lienhypertexte"/>
+                        <w:rFonts w:ascii="Aptos" w:hAnsi="Aptos"/>
+                        <w:sz w:val="22"/>
+                      </w:rPr>
+                      <w:t>}</w:t>
+                    </w:r>
+                  </w:hyperlink>
+                  <w:r>
+                    <w:rPr>
+                      <w:rFonts w:ascii="Aptos" w:hAnsi="Aptos"/>
+                      <w:color w:val="020418"/>
+                      <w:sz w:val="22"/>
+                    </w:rPr>
+                    <w:t>{/</w:t>
+                  </w:r>
+                  <w:proofErr w:type="spellStart"/>
+                  <w:r>
+                    <w:rPr>
+                      <w:rFonts w:ascii="Aptos" w:hAnsi="Aptos"/>
+                      <w:color w:val="020418"/>
+                      <w:sz w:val="22"/>
+                    </w:rPr>
+                    <w:t>emailDestinataire</w:t>
+                  </w:r>
+                  <w:proofErr w:type="spellEnd"/>
+                  <w:r>
+                    <w:rPr>
+                      <w:rFonts w:ascii="Aptos" w:hAnsi="Aptos"/>
+                      <w:color w:val="020418"/>
+                      <w:sz w:val="22"/>
+                    </w:rPr>
+                    <w:t>}</w:t>
+                  </w:r>
+                </w:p>
               </w:txbxContent>
             </v:textbox>
           </v:shape>
@@ -1305,7 +1644,7 @@
   <w:style w:type="paragraph" w:default="1" w:styleId="Normal">
     <w:name w:val="Normal"/>
     <w:qFormat/>
-    <w:rsid w:val="00213F27"/>
+    <w:rsid w:val="00B5606E"/>
     <w:rPr>
       <w:sz w:val="24"/>
       <w:szCs w:val="24"/>

</xml_diff>

<commit_message>
feat: validation email stricte + limite 900 caractères texte IA + message info drag&drop
</commit_message>
<xml_diff>
--- a/templates/word/template_custom.docx
+++ b/templates/word/template_custom.docx
@@ -195,7 +195,7 @@
           <w:szCs w:val="22"/>
         </w:rPr>
         <w:pict w14:anchorId="49EA7E95">
-          <v:shape id="_x0000_s2066" type="#_x0000_t202" style="position:absolute;margin-left:81.5pt;margin-top:353.95pt;width:462pt;height:145.15pt;z-index:251658240;visibility:visible" o:gfxdata="UEsDBBQABgAIAAAAIQC2gziS/gAAAOEBAAATAAAAW0NvbnRlbnRfVHlwZXNdLnhtbJSRQU7DMBBF&#10;90jcwfIWJU67QAgl6YK0S0CoHGBkTxKLZGx5TGhvj5O2G0SRWNoz/78nu9wcxkFMGNg6quQqL6RA&#10;0s5Y6ir5vt9lD1JwBDIwOMJKHpHlpr69KfdHjyxSmriSfYz+USnWPY7AufNIadK6MEJMx9ApD/oD&#10;OlTrorhX2lFEilmcO2RdNtjC5xDF9pCuTyYBB5bi6bQ4syoJ3g9WQ0ymaiLzg5KdCXlKLjvcW893&#10;SUOqXwnz5DrgnHtJTxOsQfEKIT7DmDSUCaxw7Rqn8787ZsmRM9e2VmPeBN4uqYvTtW7jvijg9N/y&#10;JsXecLq0q+WD6m8AAAD//wMAUEsDBBQABgAIAAAAIQA4/SH/1gAAAJQBAAALAAAAX3JlbHMvLnJl&#10;bHOkkMFqwzAMhu+DvYPRfXGawxijTi+j0GvpHsDYimMaW0Yy2fr2M4PBMnrbUb/Q94l/f/hMi1qR&#10;JVI2sOt6UJgd+ZiDgffL8ekFlFSbvV0oo4EbChzGx4f9GRdb25HMsYhqlCwG5lrLq9biZkxWOiqY&#10;22YiTra2kYMu1l1tQD30/bPm3wwYN0x18gb45AdQl1tp5j/sFB2T0FQ7R0nTNEV3j6o9feQzro1i&#10;OWA14Fm+Q8a1a8+Bvu/d/dMb2JY5uiPbhG/ktn4cqGU/er3pcvwCAAD//wMAUEsDBBQABgAIAAAA&#10;IQA6P0Ik+AEAANIDAAAOAAAAZHJzL2Uyb0RvYy54bWysU8GO0zAQvSPxD5bvNGlpu0vUdLV0VYS0&#10;LEgLH+A4TmLheMzYbbJ8PWOn2y1wQ+RgeTz2m3lvXjY3Y2/YUaHXYEs+n+WcKSuh1rYt+bev+zfX&#10;nPkgbC0MWFXyJ+X5zfb1q83gCrWADkytkBGI9cXgSt6F4Ios87JTvfAzcMpSsgHsRaAQ26xGMRB6&#10;b7JFnq+zAbB2CFJ5T6d3U5JvE37TKBk+N41XgZmSU28hrZjWKq7ZdiOKFoXrtDy1If6hi15oS0XP&#10;UHciCHZA/RdUryWChybMJPQZNI2WKnEgNvP8DzaPnXAqcSFxvDvL5P8frHw4ProvyML4HkYaYCLh&#10;3T3I755Z2HXCtuoWEYZOiZoKz6Nk2eB8cXoapfaFjyDV8AlqGrI4BEhAY4N9VIV4MkKnATydRVdj&#10;YJIOV9frq2VOKUm5t+v5Kl+tUg1RPD936MMHBT2Lm5IjTTXBi+O9D7EdUTxfidU8GF3vtTEpwLba&#10;GWRHQQ7Yp++E/ts1Y+NlC/HZhBhPEs9IbSIZxmpkuqY2I0SkXUH9RMQRJmPRj0CbDvAnZwOZquT+&#10;x0Gg4sx8tCTeu/lyGV2YguXqakEBXmaqy4ywkqBKHjibtrswOffgULcdVZrGZeGWBG90kuKlq1P7&#10;ZJyk0Mnk0ZmXcbr18itufwEAAP//AwBQSwMEFAAGAAgAAAAhAHuoWjzfAAAADQEAAA8AAABkcnMv&#10;ZG93bnJldi54bWxMj8FOwzAQRO9I/IO1SFwQtSHgkDROBUigXlv6AU68TaLGdhS7Tfr3bE5wnJ3R&#10;7JtiM9ueXXAMnXcKnlYCGLram841Cg4/X49vwELUzujeO1RwxQCb8vam0Lnxk9vhZR8bRiUu5FpB&#10;G+OQcx7qFq0OKz+gI+/oR6sjybHhZtQTlduePwshudWdow+tHvCzxfq0P1sFx+308JpN1Xc8pLsX&#10;+aG7tPJXpe7v5vc1sIhz/AvDgk/oUBJT5c/OBNaTTjLaEhWkSSqBLQkhEzpViydkBrws+P8V5S8A&#10;AAD//wMAUEsBAi0AFAAGAAgAAAAhALaDOJL+AAAA4QEAABMAAAAAAAAAAAAAAAAAAAAAAFtDb250&#10;ZW50X1R5cGVzXS54bWxQSwECLQAUAAYACAAAACEAOP0h/9YAAACUAQAACwAAAAAAAAAAAAAAAAAv&#10;AQAAX3JlbHMvLnJlbHNQSwECLQAUAAYACAAAACEAOj9CJPgBAADSAwAADgAAAAAAAAAAAAAAAAAu&#10;AgAAZHJzL2Uyb0RvYy54bWxQSwECLQAUAAYACAAAACEAe6haPN8AAAANAQAADwAAAAAAAAAAAAAA&#10;AABSBAAAZHJzL2Rvd25yZXYueG1sUEsFBgAAAAAEAAQA8wAAAF4FAAAAAA==&#10;" stroked="f">
+          <v:shape id="_x0000_s2066" type="#_x0000_t202" style="position:absolute;margin-left:81.5pt;margin-top:353.95pt;width:462pt;height:268.1pt;z-index:251658240;visibility:visible" o:gfxdata="UEsDBBQABgAIAAAAIQC2gziS/gAAAOEBAAATAAAAW0NvbnRlbnRfVHlwZXNdLnhtbJSRQU7DMBBF&#10;90jcwfIWJU67QAgl6YK0S0CoHGBkTxKLZGx5TGhvj5O2G0SRWNoz/78nu9wcxkFMGNg6quQqL6RA&#10;0s5Y6ir5vt9lD1JwBDIwOMJKHpHlpr69KfdHjyxSmriSfYz+USnWPY7AufNIadK6MEJMx9ApD/oD&#10;OlTrorhX2lFEilmcO2RdNtjC5xDF9pCuTyYBB5bi6bQ4syoJ3g9WQ0ymaiLzg5KdCXlKLjvcW893&#10;SUOqXwnz5DrgnHtJTxOsQfEKIT7DmDSUCaxw7Rqn8787ZsmRM9e2VmPeBN4uqYvTtW7jvijg9N/y&#10;JsXecLq0q+WD6m8AAAD//wMAUEsDBBQABgAIAAAAIQA4/SH/1gAAAJQBAAALAAAAX3JlbHMvLnJl&#10;bHOkkMFqwzAMhu+DvYPRfXGawxijTi+j0GvpHsDYimMaW0Yy2fr2M4PBMnrbUb/Q94l/f/hMi1qR&#10;JVI2sOt6UJgd+ZiDgffL8ekFlFSbvV0oo4EbChzGx4f9GRdb25HMsYhqlCwG5lrLq9biZkxWOiqY&#10;22YiTra2kYMu1l1tQD30/bPm3wwYN0x18gb45AdQl1tp5j/sFB2T0FQ7R0nTNEV3j6o9feQzro1i&#10;OWA14Fm+Q8a1a8+Bvu/d/dMb2JY5uiPbhG/ktn4cqGU/er3pcvwCAAD//wMAUEsDBBQABgAIAAAA&#10;IQA6P0Ik+AEAANIDAAAOAAAAZHJzL2Uyb0RvYy54bWysU8GO0zAQvSPxD5bvNGlpu0vUdLV0VYS0&#10;LEgLH+A4TmLheMzYbbJ8PWOn2y1wQ+RgeTz2m3lvXjY3Y2/YUaHXYEs+n+WcKSuh1rYt+bev+zfX&#10;nPkgbC0MWFXyJ+X5zfb1q83gCrWADkytkBGI9cXgSt6F4Ios87JTvfAzcMpSsgHsRaAQ26xGMRB6&#10;b7JFnq+zAbB2CFJ5T6d3U5JvE37TKBk+N41XgZmSU28hrZjWKq7ZdiOKFoXrtDy1If6hi15oS0XP&#10;UHciCHZA/RdUryWChybMJPQZNI2WKnEgNvP8DzaPnXAqcSFxvDvL5P8frHw4ProvyML4HkYaYCLh&#10;3T3I755Z2HXCtuoWEYZOiZoKz6Nk2eB8cXoapfaFjyDV8AlqGrI4BEhAY4N9VIV4MkKnATydRVdj&#10;YJIOV9frq2VOKUm5t+v5Kl+tUg1RPD936MMHBT2Lm5IjTTXBi+O9D7EdUTxfidU8GF3vtTEpwLba&#10;GWRHQQ7Yp++E/ts1Y+NlC/HZhBhPEs9IbSIZxmpkuqY2I0SkXUH9RMQRJmPRj0CbDvAnZwOZquT+&#10;x0Gg4sx8tCTeu/lyGV2YguXqakEBXmaqy4ywkqBKHjibtrswOffgULcdVZrGZeGWBG90kuKlq1P7&#10;ZJyk0Mnk0ZmXcbr18itufwEAAP//AwBQSwMEFAAGAAgAAAAhAHuoWjzfAAAADQEAAA8AAABkcnMv&#10;ZG93bnJldi54bWxMj8FOwzAQRO9I/IO1SFwQtSHgkDROBUigXlv6AU68TaLGdhS7Tfr3bE5wnJ3R&#10;7JtiM9ueXXAMnXcKnlYCGLram841Cg4/X49vwELUzujeO1RwxQCb8vam0Lnxk9vhZR8bRiUu5FpB&#10;G+OQcx7qFq0OKz+gI+/oR6sjybHhZtQTlduePwshudWdow+tHvCzxfq0P1sFx+308JpN1Xc8pLsX&#10;+aG7tPJXpe7v5vc1sIhz/AvDgk/oUBJT5c/OBNaTTjLaEhWkSSqBLQkhEzpViydkBrws+P8V5S8A&#10;AAD//wMAUEsBAi0AFAAGAAgAAAAhALaDOJL+AAAA4QEAABMAAAAAAAAAAAAAAAAAAAAAAFtDb250&#10;ZW50X1R5cGVzXS54bWxQSwECLQAUAAYACAAAACEAOP0h/9YAAACUAQAACwAAAAAAAAAAAAAAAAAv&#10;AQAAX3JlbHMvLnJlbHNQSwECLQAUAAYACAAAACEAOj9CJPgBAADSAwAADgAAAAAAAAAAAAAAAAAu&#10;AgAAZHJzL2Uyb0RvYy54bWxQSwECLQAUAAYACAAAACEAe6haPN8AAAANAQAADwAAAAAAAAAAAAAA&#10;AABSBAAAZHJzL2Rvd25yZXYueG1sUEsFBgAAAAAEAAQA8wAAAF4FAAAAAA==&#10;" stroked="f">
             <v:textbox style="mso-next-textbox:#_x0000_s2066">
               <w:txbxContent>
                 <w:p>
@@ -394,98 +394,13 @@
                     </w:rPr>
                     <w:t>}</w:t>
                   </w:r>
-                </w:p>
-                <w:p>
-                  <w:pPr>
-                    <w:rPr>
-                      <w:rFonts w:cs="Calibri"/>
-                      <w:sz w:val="22"/>
-                      <w:szCs w:val="22"/>
-                    </w:rPr>
-                  </w:pPr>
-                  <w:r>
-                    <w:rPr>
-                      <w:rFonts w:cs="Calibri"/>
-                      <w:sz w:val="22"/>
-                      <w:szCs w:val="22"/>
-                    </w:rPr>
-                    <w:t>{-</w:t>
-                  </w:r>
-                  <w:proofErr w:type="spellStart"/>
-                  <w:proofErr w:type="gramStart"/>
-                  <w:r>
-                    <w:rPr>
-                      <w:rFonts w:cs="Calibri"/>
-                      <w:sz w:val="22"/>
-                      <w:szCs w:val="22"/>
-                    </w:rPr>
-                    <w:t>w:p</w:t>
-                  </w:r>
-                  <w:proofErr w:type="spellEnd"/>
-                  <w:proofErr w:type="gramEnd"/>
-                  <w:r>
-                    <w:rPr>
-                      <w:rFonts w:cs="Calibri"/>
-                      <w:sz w:val="22"/>
-                      <w:szCs w:val="22"/>
-                    </w:rPr>
-                    <w:t xml:space="preserve"> </w:t>
-                  </w:r>
-                  <w:proofErr w:type="spellStart"/>
-                  <w:proofErr w:type="gramStart"/>
-                  <w:r>
-                    <w:rPr>
-                      <w:rFonts w:cs="Calibri"/>
-                      <w:sz w:val="22"/>
-                      <w:szCs w:val="22"/>
-                    </w:rPr>
-                    <w:t>statutDestinataire</w:t>
-                  </w:r>
-                  <w:proofErr w:type="spellEnd"/>
-                  <w:r>
-                    <w:rPr>
-                      <w:rFonts w:cs="Calibri"/>
-                      <w:sz w:val="22"/>
-                      <w:szCs w:val="22"/>
-                    </w:rPr>
-                    <w:t>}{</w:t>
-                  </w:r>
-                  <w:proofErr w:type="spellStart"/>
-                  <w:proofErr w:type="gramEnd"/>
-                  <w:r>
-                    <w:rPr>
-                      <w:rFonts w:cs="Calibri"/>
-                      <w:sz w:val="22"/>
-                      <w:szCs w:val="22"/>
-                    </w:rPr>
-                    <w:t>statutDestinataire</w:t>
-                  </w:r>
-                  <w:proofErr w:type="spellEnd"/>
-                  <w:r>
-                    <w:rPr>
-                      <w:rFonts w:cs="Calibri"/>
-                      <w:sz w:val="22"/>
-                      <w:szCs w:val="22"/>
-                    </w:rPr>
-                    <w:t>}{/</w:t>
-                  </w:r>
-                  <w:proofErr w:type="spellStart"/>
-                  <w:r>
-                    <w:rPr>
-                      <w:rFonts w:cs="Calibri"/>
-                      <w:sz w:val="22"/>
-                      <w:szCs w:val="22"/>
-                    </w:rPr>
-                    <w:t>statutDestinataire</w:t>
-                  </w:r>
-                  <w:proofErr w:type="spellEnd"/>
-                  <w:r>
-                    <w:rPr>
-                      <w:rFonts w:cs="Calibri"/>
-                      <w:sz w:val="22"/>
-                      <w:szCs w:val="22"/>
-                    </w:rPr>
-                    <w:t>},</w:t>
+                  <w:r>
+                    <w:rPr>
+                      <w:rFonts w:cs="Calibri"/>
+                      <w:sz w:val="22"/>
+                      <w:szCs w:val="22"/>
+                    </w:rPr>
+                    <w:t>,</w:t>
                   </w:r>
                 </w:p>
                 <w:p>

</xml_diff>

<commit_message>
feat: Switch AI to Groq API for faster response and add sentence completion instruction
</commit_message>
<xml_diff>
--- a/templates/word/template_custom.docx
+++ b/templates/word/template_custom.docx
@@ -17,453 +17,12 @@
           <w:sz w:val="22"/>
           <w:szCs w:val="22"/>
         </w:rPr>
-        <w:pict w14:anchorId="4406F46B">
+        <w:pict w14:anchorId="2F3011E9">
           <v:shapetype id="_x0000_t202" coordsize="21600,21600" o:spt="202" path="m,l,21600r21600,l21600,xe">
             <v:stroke joinstyle="miter"/>
             <v:path gradientshapeok="t" o:connecttype="rect"/>
           </v:shapetype>
-          <v:shape id="_x0000_s2067" type="#_x0000_t202" style="position:absolute;margin-left:423.9pt;margin-top:670pt;width:119.6pt;height:46.7pt;z-index:251659264;visibility:visible" o:gfxdata="UEsDBBQABgAIAAAAIQC2gziS/gAAAOEBAAATAAAAW0NvbnRlbnRfVHlwZXNdLnhtbJSRQU7DMBBF&#10;90jcwfIWJU67QAgl6YK0S0CoHGBkTxKLZGx5TGhvj5O2G0SRWNoz/78nu9wcxkFMGNg6quQqL6RA&#10;0s5Y6ir5vt9lD1JwBDIwOMJKHpHlpr69KfdHjyxSmriSfYz+USnWPY7AufNIadK6MEJMx9ApD/oD&#10;OlTrorhX2lFEilmcO2RdNtjC5xDF9pCuTyYBB5bi6bQ4syoJ3g9WQ0ymaiLzg5KdCXlKLjvcW893&#10;SUOqXwnz5DrgnHtJTxOsQfEKIT7DmDSUCaxw7Rqn8787ZsmRM9e2VmPeBN4uqYvTtW7jvijg9N/y&#10;JsXecLq0q+WD6m8AAAD//wMAUEsDBBQABgAIAAAAIQA4/SH/1gAAAJQBAAALAAAAX3JlbHMvLnJl&#10;bHOkkMFqwzAMhu+DvYPRfXGawxijTi+j0GvpHsDYimMaW0Yy2fr2M4PBMnrbUb/Q94l/f/hMi1qR&#10;JVI2sOt6UJgd+ZiDgffL8ekFlFSbvV0oo4EbChzGx4f9GRdb25HMsYhqlCwG5lrLq9biZkxWOiqY&#10;22YiTra2kYMu1l1tQD30/bPm3wwYN0x18gb45AdQl1tp5j/sFB2T0FQ7R0nTNEV3j6o9feQzro1i&#10;OWA14Fm+Q8a1a8+Bvu/d/dMb2JY5uiPbhG/ktn4cqGU/er3pcvwCAAD//wMAUEsDBBQABgAIAAAA&#10;IQBdJjHC9wEAANEDAAAOAAAAZHJzL2Uyb0RvYy54bWysU8tu2zAQvBfoPxC817Jcx0kEy0HqwEWB&#10;9AGk/QCKoiSiFJdd0pbcr++SchwjvRXVgeBqydmd2eH6buwNOyj0GmzJ89mcM2Ul1Nq2Jf/xfffu&#10;hjMfhK2FAatKflSe323evlkPrlAL6MDUChmBWF8MruRdCK7IMi871Qs/A6csJRvAXgQKsc1qFAOh&#10;9yZbzOerbACsHYJU3tPfhynJNwm/aZQMX5vGq8BMyam3kFZMaxXXbLMWRYvCdVqe2hD/0EUvtKWi&#10;Z6gHEQTbo/4LqtcSwUMTZhL6DJpGS5U4EJt8/orNUyecSlxIHO/OMvn/Byu/HJ7cN2Rh/AAjDTCR&#10;8O4R5E/PLGw7YVt1jwhDp0RNhfMoWTY4X5yuRql94SNINXyGmoYs9gES0NhgH1UhnozQaQDHs+hq&#10;DEzGklf5ze2CUpJyy9X1+1WaSiaK59sOffiooGdxU3KkoSZ0cXj0IXYjiucjsZgHo+udNiYF2FZb&#10;g+wgyAC79CUCr44ZGw9biNcmxPgn0YzMJo5hrEama+oyQkTWFdRH4o0w+YreAW06wN+cDeSpkvtf&#10;e4GKM/PJkna3+XIZTZiC5dV1ZI2XmeoyI6wkqJIHzqbtNkzG3TvUbUeVpmlZuCe9G52keOnq1D75&#10;Jil08ng05mWcTr28xM0fAAAA//8DAFBLAwQUAAYACAAAACEABjRv2uAAAAAOAQAADwAAAGRycy9k&#10;b3ducmV2LnhtbEyPQU+DQBCF7yb+h82YeDF2adEtpSyNmmi8tvYHLDAFUnaWsNtC/73DSW8z817e&#10;fC/bTbYTVxx860jDchGBQCpd1VKt4fjz+ZyA8MFQZTpHqOGGHnb5/V1m0sqNtMfrIdSCQ8inRkMT&#10;Qp9K6csGrfEL1yOxdnKDNYHXoZbVYEYOt51cRZGS1rTEHxrT40eD5flwsRpO3+PT62YsvsJxvX9R&#10;76ZdF+6m9ePD9LYFEXAKf2aY8RkdcmYq3IUqLzoNySpm9MBCvFTcarZEKuapmG/JRoHMM/m/Rv4L&#10;AAD//wMAUEsBAi0AFAAGAAgAAAAhALaDOJL+AAAA4QEAABMAAAAAAAAAAAAAAAAAAAAAAFtDb250&#10;ZW50X1R5cGVzXS54bWxQSwECLQAUAAYACAAAACEAOP0h/9YAAACUAQAACwAAAAAAAAAAAAAAAAAv&#10;AQAAX3JlbHMvLnJlbHNQSwECLQAUAAYACAAAACEAXSYxwvcBAADRAwAADgAAAAAAAAAAAAAAAAAu&#10;AgAAZHJzL2Uyb0RvYy54bWxQSwECLQAUAAYACAAAACEABjRv2uAAAAAOAQAADwAAAAAAAAAAAAAA&#10;AABRBAAAZHJzL2Rvd25yZXYueG1sUEsFBgAAAAAEAAQA8wAAAF4FAAAAAA==&#10;" stroked="f">
-            <v:textbox style="mso-next-textbox:#_x0000_s2067">
-              <w:txbxContent>
-                <w:p>
-                  <w:pPr>
-                    <w:jc w:val="both"/>
-                    <w:rPr>
-                      <w:rFonts w:ascii="Aptos" w:hAnsi="Aptos"/>
-                      <w:sz w:val="22"/>
-                      <w:szCs w:val="22"/>
-                    </w:rPr>
-                  </w:pPr>
-                  <w:r>
-                    <w:rPr>
-                      <w:rFonts w:ascii="Aptos" w:hAnsi="Aptos"/>
-                      <w:sz w:val="22"/>
-                      <w:szCs w:val="22"/>
-                    </w:rPr>
-                    <w:t>{</w:t>
-                  </w:r>
-                  <w:proofErr w:type="gramStart"/>
-                  <w:r>
-                    <w:rPr>
-                      <w:rFonts w:ascii="Aptos" w:hAnsi="Aptos"/>
-                      <w:sz w:val="22"/>
-                      <w:szCs w:val="22"/>
-                    </w:rPr>
-                    <w:t>signature</w:t>
-                  </w:r>
-                  <w:r>
-                    <w:rPr>
-                      <w:rFonts w:ascii="Aptos" w:hAnsi="Aptos"/>
-                      <w:sz w:val="22"/>
-                      <w:szCs w:val="22"/>
-                    </w:rPr>
-                    <w:t>Exp</w:t>
-                  </w:r>
-                  <w:proofErr w:type="gramEnd"/>
-                  <w:r>
-                    <w:rPr>
-                      <w:rFonts w:ascii="Aptos" w:hAnsi="Aptos"/>
-                      <w:sz w:val="22"/>
-                      <w:szCs w:val="22"/>
-                    </w:rPr>
-                    <w:t>}</w:t>
-                  </w:r>
-                </w:p>
-                <w:p>
-                  <w:pPr>
-                    <w:jc w:val="both"/>
-                    <w:rPr>
-                      <w:rFonts w:ascii="Aptos" w:hAnsi="Aptos"/>
-                      <w:sz w:val="22"/>
-                      <w:szCs w:val="22"/>
-                    </w:rPr>
-                  </w:pPr>
-                  <w:r>
-                    <w:rPr>
-                      <w:rFonts w:ascii="Aptos" w:hAnsi="Aptos"/>
-                      <w:sz w:val="22"/>
-                      <w:szCs w:val="22"/>
-                    </w:rPr>
-                    <w:t>Secrétaire Fédéral</w:t>
-                  </w:r>
-                </w:p>
-              </w:txbxContent>
-            </v:textbox>
-          </v:shape>
-        </w:pict>
-      </w:r>
-      <w:r>
-        <w:rPr>
-          <w:rFonts w:ascii="Aptos" w:hAnsi="Aptos"/>
-          <w:noProof/>
-          <w:sz w:val="22"/>
-          <w:szCs w:val="22"/>
-        </w:rPr>
-        <w:pict w14:anchorId="622BEB30">
-          <v:shape id="_x0000_s2063" type="#_x0000_t202" style="position:absolute;margin-left:292.45pt;margin-top:324.2pt;width:251.05pt;height:24.75pt;z-index:251657216;visibility:visible" o:gfxdata="UEsDBBQABgAIAAAAIQC2gziS/gAAAOEBAAATAAAAW0NvbnRlbnRfVHlwZXNdLnhtbJSRQU7DMBBF&#10;90jcwfIWJU67QAgl6YK0S0CoHGBkTxKLZGx5TGhvj5O2G0SRWNoz/78nu9wcxkFMGNg6quQqL6RA&#10;0s5Y6ir5vt9lD1JwBDIwOMJKHpHlpr69KfdHjyxSmriSfYz+USnWPY7AufNIadK6MEJMx9ApD/oD&#10;OlTrorhX2lFEilmcO2RdNtjC5xDF9pCuTyYBB5bi6bQ4syoJ3g9WQ0ymaiLzg5KdCXlKLjvcW893&#10;SUOqXwnz5DrgnHtJTxOsQfEKIT7DmDSUCaxw7Rqn8787ZsmRM9e2VmPeBN4uqYvTtW7jvijg9N/y&#10;JsXecLq0q+WD6m8AAAD//wMAUEsDBBQABgAIAAAAIQA4/SH/1gAAAJQBAAALAAAAX3JlbHMvLnJl&#10;bHOkkMFqwzAMhu+DvYPRfXGawxijTi+j0GvpHsDYimMaW0Yy2fr2M4PBMnrbUb/Q94l/f/hMi1qR&#10;JVI2sOt6UJgd+ZiDgffL8ekFlFSbvV0oo4EbChzGx4f9GRdb25HMsYhqlCwG5lrLq9biZkxWOiqY&#10;22YiTra2kYMu1l1tQD30/bPm3wwYN0x18gb45AdQl1tp5j/sFB2T0FQ7R0nTNEV3j6o9feQzro1i&#10;OWA14Fm+Q8a1a8+Bvu/d/dMb2JY5uiPbhG/ktn4cqGU/er3pcvwCAAD//wMAUEsDBBQABgAIAAAA&#10;IQD/hAE2+AEAANEDAAAOAAAAZHJzL2Uyb0RvYy54bWysU9uO0zAQfUfiHyy/0zS9QImarpauipCW&#10;i7TwAY7jJBaOx4zdJuXrGTvd7gJviDxYHo99Zs6Zk+3N2Bt2Uug12JLnszlnykqotW1L/u3r4dWG&#10;Mx+ErYUBq0p+Vp7f7F6+2A6uUAvowNQKGYFYXwyu5F0IrsgyLzvVCz8DpywlG8BeBAqxzWoUA6H3&#10;JlvM56+zAbB2CFJ5T6d3U5LvEn7TKBk+N41XgZmSU28hrZjWKq7ZbiuKFoXrtLy0If6hi15oS0Wv&#10;UHciCHZE/RdUryWChybMJPQZNI2WKnEgNvn8DzYPnXAqcSFxvLvK5P8frPx0enBfkIXxHYw0wETC&#10;u3uQ3z2zsO+EbdUtIgydEjUVzqNk2eB8cXkapfaFjyDV8BFqGrI4BkhAY4N9VIV4MkKnAZyvoqsx&#10;MEmHy3yzWS7XnEnKLfPVcrFOJUTx+NqhD+8V9CxuSo401IQuTvc+xG5E8XglFvNgdH3QxqQA22pv&#10;kJ0EGeCQvgv6b9eMjZctxGcTYjxJNCOziWMYq5HpuuSLCBFZV1CfiTfC5Cv6D2jTAf7kbCBPldz/&#10;OApUnJkPlrR7m69W0YQpWK3fLCjA55nqeUZYSVAlD5xN232YjHt0qNuOKk3TsnBLejc6SfHU1aV9&#10;8k1S6OLxaMzncbr19CfufgEAAP//AwBQSwMEFAAGAAgAAAAhAFBhpLvgAAAADAEAAA8AAABkcnMv&#10;ZG93bnJldi54bWxMj0FOwzAQRfdI3MEaJDaI2rSp06RxKkACsW3pASaxm0TE4yh2m/T2uCtYzszT&#10;n/eL3Wx7djGj7xwpeFkIYIZqpztqFBy/P543wHxA0tg7MgquxsOuvL8rMNduor25HELDYgj5HBW0&#10;IQw5575ujUW/cIOheDu50WKI49hwPeIUw23Pl0JIbrGj+KHFwby3pv45nK2C09f0tM6m6jMc030i&#10;37BLK3dV6vFhft0CC2YOfzDc9KM6lNGpcmfSnvUK1lJkEVUgl0kC7EYIuYr1qrhKVxnwsuD/S5S/&#10;AAAA//8DAFBLAQItABQABgAIAAAAIQC2gziS/gAAAOEBAAATAAAAAAAAAAAAAAAAAAAAAABbQ29u&#10;dGVudF9UeXBlc10ueG1sUEsBAi0AFAAGAAgAAAAhADj9If/WAAAAlAEAAAsAAAAAAAAAAAAAAAAA&#10;LwEAAF9yZWxzLy5yZWxzUEsBAi0AFAAGAAgAAAAhAP+EATb4AQAA0QMAAA4AAAAAAAAAAAAAAAAA&#10;LgIAAGRycy9lMm9Eb2MueG1sUEsBAi0AFAAGAAgAAAAhAFBhpLvgAAAADAEAAA8AAAAAAAAAAAAA&#10;AAAAUgQAAGRycy9kb3ducmV2LnhtbFBLBQYAAAAABAAEAPMAAABfBQAAAAA=&#10;" stroked="f">
-            <v:textbox style="mso-next-textbox:#_x0000_s2063">
-              <w:txbxContent>
-                <w:p>
-                  <w:pPr>
-                    <w:rPr>
-                      <w:rFonts w:ascii="Aptos" w:hAnsi="Aptos"/>
-                      <w:sz w:val="22"/>
-                      <w:szCs w:val="22"/>
-                    </w:rPr>
-                  </w:pPr>
-                  <w:r>
-                    <w:rPr>
-                      <w:rFonts w:ascii="Aptos" w:hAnsi="Aptos"/>
-                      <w:sz w:val="22"/>
-                      <w:szCs w:val="22"/>
-                    </w:rPr>
-                    <w:t xml:space="preserve">Paris, le </w:t>
-                  </w:r>
-                  <w:r>
-                    <w:rPr>
-                      <w:rFonts w:ascii="Aptos" w:hAnsi="Aptos"/>
-                      <w:sz w:val="22"/>
-                      <w:szCs w:val="22"/>
-                    </w:rPr>
-                    <w:fldChar w:fldCharType="begin"/>
-                  </w:r>
-                  <w:r>
-                    <w:rPr>
-                      <w:rFonts w:ascii="Aptos" w:hAnsi="Aptos"/>
-                      <w:sz w:val="22"/>
-                      <w:szCs w:val="22"/>
-                    </w:rPr>
-                    <w:instrText xml:space="preserve"> TIME \@ "d MMMM yyyy" </w:instrText>
-                  </w:r>
-                  <w:r>
-                    <w:rPr>
-                      <w:rFonts w:ascii="Aptos" w:hAnsi="Aptos"/>
-                      <w:sz w:val="22"/>
-                      <w:szCs w:val="22"/>
-                    </w:rPr>
-                    <w:fldChar w:fldCharType="separate"/>
-                  </w:r>
-                  <w:r>
-                    <w:rPr>
-                      <w:rFonts w:ascii="Aptos" w:hAnsi="Aptos"/>
-                      <w:noProof/>
-                      <w:sz w:val="22"/>
-                      <w:szCs w:val="22"/>
-                    </w:rPr>
-                    <w:t>3 décembre 2025</w:t>
-                  </w:r>
-                  <w:r>
-                    <w:rPr>
-                      <w:rFonts w:ascii="Aptos" w:hAnsi="Aptos"/>
-                      <w:sz w:val="22"/>
-                      <w:szCs w:val="22"/>
-                    </w:rPr>
-                    <w:fldChar w:fldCharType="end"/>
-                  </w:r>
-                </w:p>
-              </w:txbxContent>
-            </v:textbox>
-          </v:shape>
-        </w:pict>
-      </w:r>
-    </w:p>
-    <w:p>
-      <w:pPr>
-        <w:rPr>
-          <w:rFonts w:ascii="Aptos" w:hAnsi="Aptos"/>
-          <w:sz w:val="22"/>
-          <w:szCs w:val="22"/>
-        </w:rPr>
-      </w:pPr>
-    </w:p>
-    <w:p>
-      <w:pPr>
-        <w:tabs>
-          <w:tab w:val="left" w:pos="4437"/>
-        </w:tabs>
-        <w:rPr>
-          <w:rFonts w:ascii="Aptos" w:hAnsi="Aptos"/>
-          <w:sz w:val="22"/>
-          <w:szCs w:val="22"/>
-        </w:rPr>
-      </w:pPr>
-      <w:r>
-        <w:rPr>
-          <w:rFonts w:ascii="Aptos" w:hAnsi="Aptos"/>
-          <w:noProof/>
-          <w:sz w:val="22"/>
-          <w:szCs w:val="22"/>
-        </w:rPr>
-        <w:pict w14:anchorId="49EA7E95">
-          <v:shape id="_x0000_s2066" type="#_x0000_t202" style="position:absolute;margin-left:81.5pt;margin-top:353.95pt;width:462pt;height:268.1pt;z-index:251658240;visibility:visible" o:gfxdata="UEsDBBQABgAIAAAAIQC2gziS/gAAAOEBAAATAAAAW0NvbnRlbnRfVHlwZXNdLnhtbJSRQU7DMBBF&#10;90jcwfIWJU67QAgl6YK0S0CoHGBkTxKLZGx5TGhvj5O2G0SRWNoz/78nu9wcxkFMGNg6quQqL6RA&#10;0s5Y6ir5vt9lD1JwBDIwOMJKHpHlpr69KfdHjyxSmriSfYz+USnWPY7AufNIadK6MEJMx9ApD/oD&#10;OlTrorhX2lFEilmcO2RdNtjC5xDF9pCuTyYBB5bi6bQ4syoJ3g9WQ0ymaiLzg5KdCXlKLjvcW893&#10;SUOqXwnz5DrgnHtJTxOsQfEKIT7DmDSUCaxw7Rqn8787ZsmRM9e2VmPeBN4uqYvTtW7jvijg9N/y&#10;JsXecLq0q+WD6m8AAAD//wMAUEsDBBQABgAIAAAAIQA4/SH/1gAAAJQBAAALAAAAX3JlbHMvLnJl&#10;bHOkkMFqwzAMhu+DvYPRfXGawxijTi+j0GvpHsDYimMaW0Yy2fr2M4PBMnrbUb/Q94l/f/hMi1qR&#10;JVI2sOt6UJgd+ZiDgffL8ekFlFSbvV0oo4EbChzGx4f9GRdb25HMsYhqlCwG5lrLq9biZkxWOiqY&#10;22YiTra2kYMu1l1tQD30/bPm3wwYN0x18gb45AdQl1tp5j/sFB2T0FQ7R0nTNEV3j6o9feQzro1i&#10;OWA14Fm+Q8a1a8+Bvu/d/dMb2JY5uiPbhG/ktn4cqGU/er3pcvwCAAD//wMAUEsDBBQABgAIAAAA&#10;IQA6P0Ik+AEAANIDAAAOAAAAZHJzL2Uyb0RvYy54bWysU8GO0zAQvSPxD5bvNGlpu0vUdLV0VYS0&#10;LEgLH+A4TmLheMzYbbJ8PWOn2y1wQ+RgeTz2m3lvXjY3Y2/YUaHXYEs+n+WcKSuh1rYt+bev+zfX&#10;nPkgbC0MWFXyJ+X5zfb1q83gCrWADkytkBGI9cXgSt6F4Ios87JTvfAzcMpSsgHsRaAQ26xGMRB6&#10;b7JFnq+zAbB2CFJ5T6d3U5JvE37TKBk+N41XgZmSU28hrZjWKq7ZdiOKFoXrtDy1If6hi15oS0XP&#10;UHciCHZA/RdUryWChybMJPQZNI2WKnEgNvP8DzaPnXAqcSFxvDvL5P8frHw4ProvyML4HkYaYCLh&#10;3T3I755Z2HXCtuoWEYZOiZoKz6Nk2eB8cXoapfaFjyDV8AlqGrI4BEhAY4N9VIV4MkKnATydRVdj&#10;YJIOV9frq2VOKUm5t+v5Kl+tUg1RPD936MMHBT2Lm5IjTTXBi+O9D7EdUTxfidU8GF3vtTEpwLba&#10;GWRHQQ7Yp++E/ts1Y+NlC/HZhBhPEs9IbSIZxmpkuqY2I0SkXUH9RMQRJmPRj0CbDvAnZwOZquT+&#10;x0Gg4sx8tCTeu/lyGV2YguXqakEBXmaqy4ywkqBKHjibtrswOffgULcdVZrGZeGWBG90kuKlq1P7&#10;ZJyk0Mnk0ZmXcbr18itufwEAAP//AwBQSwMEFAAGAAgAAAAhAHuoWjzfAAAADQEAAA8AAABkcnMv&#10;ZG93bnJldi54bWxMj8FOwzAQRO9I/IO1SFwQtSHgkDROBUigXlv6AU68TaLGdhS7Tfr3bE5wnJ3R&#10;7JtiM9ueXXAMnXcKnlYCGLram841Cg4/X49vwELUzujeO1RwxQCb8vam0Lnxk9vhZR8bRiUu5FpB&#10;G+OQcx7qFq0OKz+gI+/oR6sjybHhZtQTlduePwshudWdow+tHvCzxfq0P1sFx+308JpN1Xc8pLsX&#10;+aG7tPJXpe7v5vc1sIhz/AvDgk/oUBJT5c/OBNaTTjLaEhWkSSqBLQkhEzpViydkBrws+P8V5S8A&#10;AAD//wMAUEsBAi0AFAAGAAgAAAAhALaDOJL+AAAA4QEAABMAAAAAAAAAAAAAAAAAAAAAAFtDb250&#10;ZW50X1R5cGVzXS54bWxQSwECLQAUAAYACAAAACEAOP0h/9YAAACUAQAACwAAAAAAAAAAAAAAAAAv&#10;AQAAX3JlbHMvLnJlbHNQSwECLQAUAAYACAAAACEAOj9CJPgBAADSAwAADgAAAAAAAAAAAAAAAAAu&#10;AgAAZHJzL2Uyb0RvYy54bWxQSwECLQAUAAYACAAAACEAe6haPN8AAAANAQAADwAAAAAAAAAAAAAA&#10;AABSBAAAZHJzL2Rvd25yZXYueG1sUEsFBgAAAAAEAAQA8wAAAF4FAAAAAA==&#10;" stroked="f">
-            <v:textbox style="mso-next-textbox:#_x0000_s2066">
-              <w:txbxContent>
-                <w:p>
-                  <w:pPr>
-                    <w:rPr>
-                      <w:rFonts w:cs="Calibri"/>
-                      <w:sz w:val="22"/>
-                      <w:szCs w:val="22"/>
-                    </w:rPr>
-                  </w:pPr>
-                  <w:permStart w:id="350494471" w:edGrp="everyone"/>
-                  <w:r>
-                    <w:rPr>
-                      <w:rFonts w:cs="Calibri"/>
-                      <w:sz w:val="22"/>
-                      <w:szCs w:val="22"/>
-                    </w:rPr>
-                    <w:t>{</w:t>
-                  </w:r>
-                  <w:proofErr w:type="spellStart"/>
-                  <w:proofErr w:type="gramStart"/>
-                  <w:r>
-                    <w:rPr>
-                      <w:rFonts w:cs="Calibri"/>
-                      <w:sz w:val="22"/>
-                      <w:szCs w:val="22"/>
-                    </w:rPr>
-                    <w:t>codeDocument</w:t>
-                  </w:r>
-                  <w:proofErr w:type="spellEnd"/>
-                  <w:proofErr w:type="gramEnd"/>
-                  <w:r>
-                    <w:rPr>
-                      <w:rFonts w:cs="Calibri"/>
-                      <w:sz w:val="22"/>
-                      <w:szCs w:val="22"/>
-                    </w:rPr>
-                    <w:t>}</w:t>
-                  </w:r>
-                </w:p>
-                <w:p>
-                  <w:pPr>
-                    <w:rPr>
-                      <w:rFonts w:cs="Calibri"/>
-                      <w:sz w:val="22"/>
-                      <w:szCs w:val="22"/>
-                    </w:rPr>
-                  </w:pPr>
-                </w:p>
-                <w:p>
-                  <w:pPr>
-                    <w:rPr>
-                      <w:rFonts w:cs="Calibri"/>
-                      <w:b/>
-                      <w:bCs/>
-                      <w:sz w:val="22"/>
-                      <w:szCs w:val="22"/>
-                    </w:rPr>
-                  </w:pPr>
-                  <w:r>
-                    <w:rPr>
-                      <w:rFonts w:cs="Calibri"/>
-                      <w:b/>
-                      <w:bCs/>
-                      <w:sz w:val="22"/>
-                      <w:szCs w:val="22"/>
-                    </w:rPr>
-                    <w:t>Objet : {objet}</w:t>
-                  </w:r>
-                </w:p>
-                <w:p>
-                  <w:pPr>
-                    <w:rPr>
-                      <w:rFonts w:cs="Calibri"/>
-                      <w:sz w:val="22"/>
-                      <w:szCs w:val="22"/>
-                    </w:rPr>
-                  </w:pPr>
-                </w:p>
-                <w:p>
-                  <w:pPr>
-                    <w:rPr>
-                      <w:rFonts w:cs="Calibri"/>
-                      <w:sz w:val="22"/>
-                      <w:szCs w:val="22"/>
-                    </w:rPr>
-                  </w:pPr>
-                </w:p>
-                <w:p>
-                  <w:pPr>
-                    <w:rPr>
-                      <w:rFonts w:cs="Calibri"/>
-                      <w:sz w:val="22"/>
-                      <w:szCs w:val="22"/>
-                    </w:rPr>
-                  </w:pPr>
-                  <w:r>
-                    <w:rPr>
-                      <w:rFonts w:cs="Calibri"/>
-                      <w:sz w:val="22"/>
-                      <w:szCs w:val="22"/>
-                    </w:rPr>
-                    <w:t>{-</w:t>
-                  </w:r>
-                  <w:proofErr w:type="spellStart"/>
-                  <w:proofErr w:type="gramStart"/>
-                  <w:r>
-                    <w:rPr>
-                      <w:rFonts w:cs="Calibri"/>
-                      <w:sz w:val="22"/>
-                      <w:szCs w:val="22"/>
-                    </w:rPr>
-                    <w:t>w:p</w:t>
-                  </w:r>
-                  <w:proofErr w:type="spellEnd"/>
-                  <w:proofErr w:type="gramEnd"/>
-                  <w:r>
-                    <w:rPr>
-                      <w:rFonts w:cs="Calibri"/>
-                      <w:sz w:val="22"/>
-                      <w:szCs w:val="22"/>
-                    </w:rPr>
-                    <w:t xml:space="preserve"> </w:t>
-                  </w:r>
-                  <w:proofErr w:type="spellStart"/>
-                  <w:proofErr w:type="gramStart"/>
-                  <w:r>
-                    <w:rPr>
-                      <w:rFonts w:cs="Calibri"/>
-                      <w:sz w:val="22"/>
-                      <w:szCs w:val="22"/>
-                    </w:rPr>
-                    <w:t>nomDestinataire</w:t>
-                  </w:r>
-                  <w:proofErr w:type="spellEnd"/>
-                  <w:r>
-                    <w:rPr>
-                      <w:rFonts w:cs="Calibri"/>
-                      <w:sz w:val="22"/>
-                      <w:szCs w:val="22"/>
-                    </w:rPr>
-                    <w:t>}{</w:t>
-                  </w:r>
-                  <w:proofErr w:type="spellStart"/>
-                  <w:proofErr w:type="gramEnd"/>
-                  <w:r>
-                    <w:rPr>
-                      <w:rFonts w:cs="Calibri"/>
-                      <w:sz w:val="22"/>
-                      <w:szCs w:val="22"/>
-                    </w:rPr>
-                    <w:t>civiliteDestinataire</w:t>
-                  </w:r>
-                  <w:proofErr w:type="spellEnd"/>
-                  <w:r>
-                    <w:rPr>
-                      <w:rFonts w:cs="Calibri"/>
-                      <w:sz w:val="22"/>
-                      <w:szCs w:val="22"/>
-                    </w:rPr>
-                    <w:t>} {</w:t>
-                  </w:r>
-                  <w:proofErr w:type="spellStart"/>
-                  <w:r>
-                    <w:rPr>
-                      <w:rFonts w:cs="Calibri"/>
-                      <w:sz w:val="22"/>
-                      <w:szCs w:val="22"/>
-                    </w:rPr>
-                    <w:t>nomDestinataire</w:t>
-                  </w:r>
-                  <w:proofErr w:type="spellEnd"/>
-                  <w:r>
-                    <w:rPr>
-                      <w:rFonts w:cs="Calibri"/>
-                      <w:sz w:val="22"/>
-                      <w:szCs w:val="22"/>
-                    </w:rPr>
-                    <w:t>}{/</w:t>
-                  </w:r>
-                  <w:proofErr w:type="spellStart"/>
-                  <w:r>
-                    <w:rPr>
-                      <w:rFonts w:cs="Calibri"/>
-                      <w:sz w:val="22"/>
-                      <w:szCs w:val="22"/>
-                    </w:rPr>
-                    <w:t>nomDestinataire</w:t>
-                  </w:r>
-                  <w:proofErr w:type="spellEnd"/>
-                  <w:r>
-                    <w:rPr>
-                      <w:rFonts w:cs="Calibri"/>
-                      <w:sz w:val="22"/>
-                      <w:szCs w:val="22"/>
-                    </w:rPr>
-                    <w:t>}</w:t>
-                  </w:r>
-                  <w:r>
-                    <w:rPr>
-                      <w:rFonts w:cs="Calibri"/>
-                      <w:sz w:val="22"/>
-                      <w:szCs w:val="22"/>
-                    </w:rPr>
-                    <w:t>,</w:t>
-                  </w:r>
-                </w:p>
-                <w:p>
-                  <w:pPr>
-                    <w:rPr>
-                      <w:rFonts w:cs="Calibri"/>
-                      <w:sz w:val="22"/>
-                      <w:szCs w:val="22"/>
-                    </w:rPr>
-                  </w:pPr>
-                </w:p>
-                <w:p>
-                  <w:pPr>
-                    <w:rPr>
-                      <w:rFonts w:ascii="Aptos" w:hAnsi="Aptos"/>
-                      <w:sz w:val="22"/>
-                      <w:szCs w:val="22"/>
-                    </w:rPr>
-                  </w:pPr>
-                  <w:r>
-                    <w:rPr>
-                      <w:rFonts w:cs="Calibri"/>
-                      <w:sz w:val="22"/>
-                      <w:szCs w:val="22"/>
-                    </w:rPr>
-                    <w:t>{</w:t>
-                  </w:r>
-                  <w:proofErr w:type="spellStart"/>
-                  <w:proofErr w:type="gramStart"/>
-                  <w:r>
-                    <w:rPr>
-                      <w:rFonts w:cs="Calibri"/>
-                      <w:sz w:val="22"/>
-                      <w:szCs w:val="22"/>
-                    </w:rPr>
-                    <w:t>texteIa</w:t>
-                  </w:r>
-                  <w:proofErr w:type="spellEnd"/>
-                  <w:proofErr w:type="gramEnd"/>
-                  <w:r>
-                    <w:rPr>
-                      <w:rFonts w:cs="Calibri"/>
-                      <w:sz w:val="22"/>
-                      <w:szCs w:val="22"/>
-                    </w:rPr>
-                    <w:t>}</w:t>
-                  </w:r>
-                </w:p>
-                <w:permEnd w:id="350494471"/>
-              </w:txbxContent>
-            </v:textbox>
-          </v:shape>
-        </w:pict>
-      </w:r>
-      <w:r>
-        <w:rPr>
-          <w:rFonts w:ascii="Aptos" w:hAnsi="Aptos"/>
-          <w:noProof/>
-          <w:sz w:val="22"/>
-          <w:szCs w:val="22"/>
-        </w:rPr>
-        <w:pict w14:anchorId="2F3011E9">
-          <v:shape id="_x0000_s2062" type="#_x0000_t202" style="position:absolute;margin-left:292.1pt;margin-top:128.6pt;width:251.05pt;height:155.6pt;z-index:251656192;visibility:visible;mso-width-relative:margin;mso-height-relative:margin" o:gfxdata="UEsDBBQABgAIAAAAIQC2gziS/gAAAOEBAAATAAAAW0NvbnRlbnRfVHlwZXNdLnhtbJSRQU7DMBBF&#10;90jcwfIWJU67QAgl6YK0S0CoHGBkTxKLZGx5TGhvj5O2G0SRWNoz/78nu9wcxkFMGNg6quQqL6RA&#10;0s5Y6ir5vt9lD1JwBDIwOMJKHpHlpr69KfdHjyxSmriSfYz+USnWPY7AufNIadK6MEJMx9ApD/oD&#10;OlTrorhX2lFEilmcO2RdNtjC5xDF9pCuTyYBB5bi6bQ4syoJ3g9WQ0ymaiLzg5KdCXlKLjvcW893&#10;SUOqXwnz5DrgnHtJTxOsQfEKIT7DmDSUCaxw7Rqn8787ZsmRM9e2VmPeBN4uqYvTtW7jvijg9N/y&#10;JsXecLq0q+WD6m8AAAD//wMAUEsDBBQABgAIAAAAIQA4/SH/1gAAAJQBAAALAAAAX3JlbHMvLnJl&#10;bHOkkMFqwzAMhu+DvYPRfXGawxijTi+j0GvpHsDYimMaW0Yy2fr2M4PBMnrbUb/Q94l/f/hMi1qR&#10;JVI2sOt6UJgd+ZiDgffL8ekFlFSbvV0oo4EbChzGx4f9GRdb25HMsYhqlCwG5lrLq9biZkxWOiqY&#10;22YiTra2kYMu1l1tQD30/bPm3wwYN0x18gb45AdQl1tp5j/sFB2T0FQ7R0nTNEV3j6o9feQzro1i&#10;OWA14Fm+Q8a1a8+Bvu/d/dMb2JY5uiPbhG/ktn4cqGU/er3pcvwCAAD//wMAUEsDBBQABgAIAAAA&#10;IQCVjOgwOwIAAG0EAAAOAAAAZHJzL2Uyb0RvYy54bWysVEtv2zAMvg/YfxB0Xxzn1dSIU2QpMgwI&#10;2gLp0LMiy7EAWdQkJXb260fJebXbaVgOCilSfHwf6dlDWytyENZJ0DlNe31KhOZQSL3L6Y/X1Zcp&#10;Jc4zXTAFWuT0KBx9mH/+NGtMJgZQgSqEJRhEu6wxOa28N1mSOF6JmrkeGKHRWIKtmUfV7pLCsgaj&#10;1yoZ9PuTpAFbGAtcOIe3j52RzmP8shTcP5elE56onGJtPp42nttwJvMZy3aWmUryUxnsH6qomdSY&#10;9BLqkXlG9lb+EaqW3IKD0vc41AmUpeQi9oDdpP0P3WwqZkTsBcFx5gKT+39h+dNhY14s8e1XaJHA&#10;AEhjXObwMvTTlrYO/1gpQTtCeLzAJlpPOF4O0+l0OBxTwtGWDu4nk7sIbHJ9bqzz3wTUJAg5tchL&#10;hIsd1s5jSnQ9u4RsDpQsVlKpqBzdUllyYEghMl9AQ4lizuNlTlfxF6rGEO+eKU2anE6G437MpCHE&#10;6/yURvdrl0Hy7bYlsrhBYAvFEYGx0M2MM3wlsfg1Zn5hFocEscDB9894lAowF5wkSiqwv/52H/yR&#10;O7RS0uDQ5dT93DMrsKHvGlm9T0ejMKVRGY3vBqjYW8v21qL39RIQlBRXzPAoBn+vzmJpoX7D/ViE&#10;rGhimmPunPqzuPTdKuB+cbFYRCecS8P8Wm8MD6EDA4Ga1/aNWXPizyP1T3AeT5Z9oLHzDS81LPYe&#10;Shk5Djh3qJ7gx5mOvJ32LyzNrR69rl+J+W8AAAD//wMAUEsDBBQABgAIAAAAIQDbCZ5r3wAAAAwB&#10;AAAPAAAAZHJzL2Rvd25yZXYueG1sTI9BTwIxEIXvJv6HZky8ScuiFdadJcbEq4mAnMu2bDe20822&#10;wMKvt5zkOHlf3vumWo7esaMZYhcIYToRwAw1QXfUImzWn09zYDEp0soFMghnE2FZ399VqtThRN/m&#10;uEotyyUUS4VgU+pLzmNjjVdxEnpDOduHwauUz6HlelCnXO4dL4SQ3KuO8oJVvfmwpvldHTzCtvWX&#10;7c+0H6z27pm+Luf1JnSIjw/j+xuwZMb0D8NVP6tDnZ124UA6MofwIkWRUYTZQr4CuxJCFjNgOwQp&#10;xAJ4XfHbJ+o/AAAA//8DAFBLAQItABQABgAIAAAAIQC2gziS/gAAAOEBAAATAAAAAAAAAAAAAAAA&#10;AAAAAABbQ29udGVudF9UeXBlc10ueG1sUEsBAi0AFAAGAAgAAAAhADj9If/WAAAAlAEAAAsAAAAA&#10;AAAAAAAAAAAALwEAAF9yZWxzLy5yZWxzUEsBAi0AFAAGAAgAAAAhAJWM6DA7AgAAbQQAAA4AAAAA&#10;AAAAAAAAAAAALgIAAGRycy9lMm9Eb2MueG1sUEsBAi0AFAAGAAgAAAAhANsJnmvfAAAADAEAAA8A&#10;AAAAAAAAAAAAAAAAlQQAAGRycy9kb3ducmV2LnhtbFBLBQYAAAAABAAEAPMAAAChBQAAAAA=&#10;" stroked="f" strokeweight=".5pt">
+          <v:shape id="_x0000_s2062" type="#_x0000_t202" style="position:absolute;margin-left:292.1pt;margin-top:-162.85pt;width:251.05pt;height:155.6pt;z-index:251656192;visibility:visible;mso-width-relative:margin;mso-height-relative:margin" o:gfxdata="UEsDBBQABgAIAAAAIQC2gziS/gAAAOEBAAATAAAAW0NvbnRlbnRfVHlwZXNdLnhtbJSRQU7DMBBF&#10;90jcwfIWJU67QAgl6YK0S0CoHGBkTxKLZGx5TGhvj5O2G0SRWNoz/78nu9wcxkFMGNg6quQqL6RA&#10;0s5Y6ir5vt9lD1JwBDIwOMJKHpHlpr69KfdHjyxSmriSfYz+USnWPY7AufNIadK6MEJMx9ApD/oD&#10;OlTrorhX2lFEilmcO2RdNtjC5xDF9pCuTyYBB5bi6bQ4syoJ3g9WQ0ymaiLzg5KdCXlKLjvcW893&#10;SUOqXwnz5DrgnHtJTxOsQfEKIT7DmDSUCaxw7Rqn8787ZsmRM9e2VmPeBN4uqYvTtW7jvijg9N/y&#10;JsXecLq0q+WD6m8AAAD//wMAUEsDBBQABgAIAAAAIQA4/SH/1gAAAJQBAAALAAAAX3JlbHMvLnJl&#10;bHOkkMFqwzAMhu+DvYPRfXGawxijTi+j0GvpHsDYimMaW0Yy2fr2M4PBMnrbUb/Q94l/f/hMi1qR&#10;JVI2sOt6UJgd+ZiDgffL8ekFlFSbvV0oo4EbChzGx4f9GRdb25HMsYhqlCwG5lrLq9biZkxWOiqY&#10;22YiTra2kYMu1l1tQD30/bPm3wwYN0x18gb45AdQl1tp5j/sFB2T0FQ7R0nTNEV3j6o9feQzro1i&#10;OWA14Fm+Q8a1a8+Bvu/d/dMb2JY5uiPbhG/ktn4cqGU/er3pcvwCAAD//wMAUEsDBBQABgAIAAAA&#10;IQCVjOgwOwIAAG0EAAAOAAAAZHJzL2Uyb0RvYy54bWysVEtv2zAMvg/YfxB0Xxzn1dSIU2QpMgwI&#10;2gLp0LMiy7EAWdQkJXb260fJebXbaVgOCilSfHwf6dlDWytyENZJ0DlNe31KhOZQSL3L6Y/X1Zcp&#10;Jc4zXTAFWuT0KBx9mH/+NGtMJgZQgSqEJRhEu6wxOa28N1mSOF6JmrkeGKHRWIKtmUfV7pLCsgaj&#10;1yoZ9PuTpAFbGAtcOIe3j52RzmP8shTcP5elE56onGJtPp42nttwJvMZy3aWmUryUxnsH6qomdSY&#10;9BLqkXlG9lb+EaqW3IKD0vc41AmUpeQi9oDdpP0P3WwqZkTsBcFx5gKT+39h+dNhY14s8e1XaJHA&#10;AEhjXObwMvTTlrYO/1gpQTtCeLzAJlpPOF4O0+l0OBxTwtGWDu4nk7sIbHJ9bqzz3wTUJAg5tchL&#10;hIsd1s5jSnQ9u4RsDpQsVlKpqBzdUllyYEghMl9AQ4lizuNlTlfxF6rGEO+eKU2anE6G437MpCHE&#10;6/yURvdrl0Hy7bYlsrhBYAvFEYGx0M2MM3wlsfg1Zn5hFocEscDB9894lAowF5wkSiqwv/52H/yR&#10;O7RS0uDQ5dT93DMrsKHvGlm9T0ejMKVRGY3vBqjYW8v21qL39RIQlBRXzPAoBn+vzmJpoX7D/ViE&#10;rGhimmPunPqzuPTdKuB+cbFYRCecS8P8Wm8MD6EDA4Ga1/aNWXPizyP1T3AeT5Z9oLHzDS81LPYe&#10;Shk5Djh3qJ7gx5mOvJ32LyzNrR69rl+J+W8AAAD//wMAUEsDBBQABgAIAAAAIQDbCZ5r3wAAAAwB&#10;AAAPAAAAZHJzL2Rvd25yZXYueG1sTI9BTwIxEIXvJv6HZky8ScuiFdadJcbEq4mAnMu2bDe20822&#10;wMKvt5zkOHlf3vumWo7esaMZYhcIYToRwAw1QXfUImzWn09zYDEp0soFMghnE2FZ399VqtThRN/m&#10;uEotyyUUS4VgU+pLzmNjjVdxEnpDOduHwauUz6HlelCnXO4dL4SQ3KuO8oJVvfmwpvldHTzCtvWX&#10;7c+0H6z27pm+Luf1JnSIjw/j+xuwZMb0D8NVP6tDnZ124UA6MofwIkWRUYTZQr4CuxJCFjNgOwQp&#10;xAJ4XfHbJ+o/AAAA//8DAFBLAQItABQABgAIAAAAIQC2gziS/gAAAOEBAAATAAAAAAAAAAAAAAAA&#10;AAAAAABbQ29udGVudF9UeXBlc10ueG1sUEsBAi0AFAAGAAgAAAAhADj9If/WAAAAlAEAAAsAAAAA&#10;AAAAAAAAAAAALwEAAF9yZWxzLy5yZWxzUEsBAi0AFAAGAAgAAAAhAJWM6DA7AgAAbQQAAA4AAAAA&#10;AAAAAAAAAAAALgIAAGRycy9lMm9Eb2MueG1sUEsBAi0AFAAGAAgAAAAhANsJnmvfAAAADAEAAA8A&#10;AAAAAAAAAAAAAAAAlQQAAGRycy9kb3ducmV2LnhtbFBLBQYAAAAABAAEAPMAAAChBQAAAAA=&#10;" stroked="f" strokeweight=".5pt">
             <v:textbox style="mso-next-textbox:#_x0000_s2062">
               <w:txbxContent>
                 <w:p>
@@ -1068,21 +627,475 @@
           </v:shape>
         </w:pict>
       </w:r>
-      <w:r>
+    </w:p>
+    <w:p>
+      <w:pPr>
         <w:rPr>
           <w:rFonts w:ascii="Aptos" w:hAnsi="Aptos"/>
           <w:sz w:val="22"/>
           <w:szCs w:val="22"/>
         </w:rPr>
-        <w:tab/>
-      </w:r>
+      </w:pPr>
+    </w:p>
+    <w:p>
+      <w:pPr>
+        <w:rPr>
+          <w:rFonts w:ascii="Aptos" w:hAnsi="Aptos"/>
+          <w:sz w:val="22"/>
+          <w:szCs w:val="22"/>
+        </w:rPr>
+      </w:pPr>
+      <w:r>
+        <w:rPr>
+          <w:rFonts w:ascii="Aptos" w:hAnsi="Aptos"/>
+          <w:noProof/>
+          <w:sz w:val="22"/>
+          <w:szCs w:val="22"/>
+        </w:rPr>
+        <w:pict w14:anchorId="622BEB30">
+          <v:shape id="_x0000_s2063" type="#_x0000_t202" style="position:absolute;margin-left:292.45pt;margin-top:5.9pt;width:251.05pt;height:24.75pt;z-index:251657216;visibility:visible" o:gfxdata="UEsDBBQABgAIAAAAIQC2gziS/gAAAOEBAAATAAAAW0NvbnRlbnRfVHlwZXNdLnhtbJSRQU7DMBBF&#10;90jcwfIWJU67QAgl6YK0S0CoHGBkTxKLZGx5TGhvj5O2G0SRWNoz/78nu9wcxkFMGNg6quQqL6RA&#10;0s5Y6ir5vt9lD1JwBDIwOMJKHpHlpr69KfdHjyxSmriSfYz+USnWPY7AufNIadK6MEJMx9ApD/oD&#10;OlTrorhX2lFEilmcO2RdNtjC5xDF9pCuTyYBB5bi6bQ4syoJ3g9WQ0ymaiLzg5KdCXlKLjvcW893&#10;SUOqXwnz5DrgnHtJTxOsQfEKIT7DmDSUCaxw7Rqn8787ZsmRM9e2VmPeBN4uqYvTtW7jvijg9N/y&#10;JsXecLq0q+WD6m8AAAD//wMAUEsDBBQABgAIAAAAIQA4/SH/1gAAAJQBAAALAAAAX3JlbHMvLnJl&#10;bHOkkMFqwzAMhu+DvYPRfXGawxijTi+j0GvpHsDYimMaW0Yy2fr2M4PBMnrbUb/Q94l/f/hMi1qR&#10;JVI2sOt6UJgd+ZiDgffL8ekFlFSbvV0oo4EbChzGx4f9GRdb25HMsYhqlCwG5lrLq9biZkxWOiqY&#10;22YiTra2kYMu1l1tQD30/bPm3wwYN0x18gb45AdQl1tp5j/sFB2T0FQ7R0nTNEV3j6o9feQzro1i&#10;OWA14Fm+Q8a1a8+Bvu/d/dMb2JY5uiPbhG/ktn4cqGU/er3pcvwCAAD//wMAUEsDBBQABgAIAAAA&#10;IQD/hAE2+AEAANEDAAAOAAAAZHJzL2Uyb0RvYy54bWysU9uO0zAQfUfiHyy/0zS9QImarpauipCW&#10;i7TwAY7jJBaOx4zdJuXrGTvd7gJviDxYHo99Zs6Zk+3N2Bt2Uug12JLnszlnykqotW1L/u3r4dWG&#10;Mx+ErYUBq0p+Vp7f7F6+2A6uUAvowNQKGYFYXwyu5F0IrsgyLzvVCz8DpywlG8BeBAqxzWoUA6H3&#10;JlvM56+zAbB2CFJ5T6d3U5LvEn7TKBk+N41XgZmSU28hrZjWKq7ZbiuKFoXrtLy0If6hi15oS0Wv&#10;UHciCHZE/RdUryWChybMJPQZNI2WKnEgNvn8DzYPnXAqcSFxvLvK5P8frPx0enBfkIXxHYw0wETC&#10;u3uQ3z2zsO+EbdUtIgydEjUVzqNk2eB8cXkapfaFjyDV8BFqGrI4BkhAY4N9VIV4MkKnAZyvoqsx&#10;MEmHy3yzWS7XnEnKLfPVcrFOJUTx+NqhD+8V9CxuSo401IQuTvc+xG5E8XglFvNgdH3QxqQA22pv&#10;kJ0EGeCQvgv6b9eMjZctxGcTYjxJNCOziWMYq5HpuuSLCBFZV1CfiTfC5Cv6D2jTAf7kbCBPldz/&#10;OApUnJkPlrR7m69W0YQpWK3fLCjA55nqeUZYSVAlD5xN232YjHt0qNuOKk3TsnBLejc6SfHU1aV9&#10;8k1S6OLxaMzncbr19CfufgEAAP//AwBQSwMEFAAGAAgAAAAhAFBhpLvgAAAADAEAAA8AAABkcnMv&#10;ZG93bnJldi54bWxMj0FOwzAQRfdI3MEaJDaI2rSp06RxKkACsW3pASaxm0TE4yh2m/T2uCtYzszT&#10;n/eL3Wx7djGj7xwpeFkIYIZqpztqFBy/P543wHxA0tg7MgquxsOuvL8rMNduor25HELDYgj5HBW0&#10;IQw5575ujUW/cIOheDu50WKI49hwPeIUw23Pl0JIbrGj+KHFwby3pv45nK2C09f0tM6m6jMc030i&#10;37BLK3dV6vFhft0CC2YOfzDc9KM6lNGpcmfSnvUK1lJkEVUgl0kC7EYIuYr1qrhKVxnwsuD/S5S/&#10;AAAA//8DAFBLAQItABQABgAIAAAAIQC2gziS/gAAAOEBAAATAAAAAAAAAAAAAAAAAAAAAABbQ29u&#10;dGVudF9UeXBlc10ueG1sUEsBAi0AFAAGAAgAAAAhADj9If/WAAAAlAEAAAsAAAAAAAAAAAAAAAAA&#10;LwEAAF9yZWxzLy5yZWxzUEsBAi0AFAAGAAgAAAAhAP+EATb4AQAA0QMAAA4AAAAAAAAAAAAAAAAA&#10;LgIAAGRycy9lMm9Eb2MueG1sUEsBAi0AFAAGAAgAAAAhAFBhpLvgAAAADAEAAA8AAAAAAAAAAAAA&#10;AAAAUgQAAGRycy9kb3ducmV2LnhtbFBLBQYAAAAABAAEAPMAAABfBQAAAAA=&#10;" stroked="f">
+            <v:textbox style="mso-next-textbox:#_x0000_s2063">
+              <w:txbxContent>
+                <w:p>
+                  <w:pPr>
+                    <w:rPr>
+                      <w:rFonts w:ascii="Aptos" w:hAnsi="Aptos"/>
+                      <w:sz w:val="22"/>
+                      <w:szCs w:val="22"/>
+                    </w:rPr>
+                  </w:pPr>
+                  <w:r>
+                    <w:rPr>
+                      <w:rFonts w:ascii="Aptos" w:hAnsi="Aptos"/>
+                      <w:sz w:val="22"/>
+                      <w:szCs w:val="22"/>
+                    </w:rPr>
+                    <w:t xml:space="preserve">Paris, le </w:t>
+                  </w:r>
+                  <w:r>
+                    <w:rPr>
+                      <w:rFonts w:ascii="Aptos" w:hAnsi="Aptos"/>
+                      <w:sz w:val="22"/>
+                      <w:szCs w:val="22"/>
+                    </w:rPr>
+                    <w:fldChar w:fldCharType="begin"/>
+                  </w:r>
+                  <w:r>
+                    <w:rPr>
+                      <w:rFonts w:ascii="Aptos" w:hAnsi="Aptos"/>
+                      <w:sz w:val="22"/>
+                      <w:szCs w:val="22"/>
+                    </w:rPr>
+                    <w:instrText xml:space="preserve"> TIME \@ "d MMMM yyyy" </w:instrText>
+                  </w:r>
+                  <w:r>
+                    <w:rPr>
+                      <w:rFonts w:ascii="Aptos" w:hAnsi="Aptos"/>
+                      <w:sz w:val="22"/>
+                      <w:szCs w:val="22"/>
+                    </w:rPr>
+                    <w:fldChar w:fldCharType="separate"/>
+                  </w:r>
+                  <w:r>
+                    <w:rPr>
+                      <w:rFonts w:ascii="Aptos" w:hAnsi="Aptos"/>
+                      <w:noProof/>
+                      <w:sz w:val="22"/>
+                      <w:szCs w:val="22"/>
+                    </w:rPr>
+                    <w:t>5 décembre 2025</w:t>
+                  </w:r>
+                  <w:r>
+                    <w:rPr>
+                      <w:rFonts w:ascii="Aptos" w:hAnsi="Aptos"/>
+                      <w:sz w:val="22"/>
+                      <w:szCs w:val="22"/>
+                    </w:rPr>
+                    <w:fldChar w:fldCharType="end"/>
+                  </w:r>
+                </w:p>
+              </w:txbxContent>
+            </v:textbox>
+          </v:shape>
+        </w:pict>
+      </w:r>
+    </w:p>
+    <w:p>
+      <w:pPr>
+        <w:rPr>
+          <w:rFonts w:ascii="Aptos" w:hAnsi="Aptos"/>
+          <w:sz w:val="22"/>
+          <w:szCs w:val="22"/>
+        </w:rPr>
+      </w:pPr>
+    </w:p>
+    <w:p>
+      <w:pPr>
+        <w:tabs>
+          <w:tab w:val="left" w:pos="7985"/>
+        </w:tabs>
+        <w:rPr>
+          <w:rFonts w:ascii="Aptos" w:hAnsi="Aptos"/>
+          <w:sz w:val="22"/>
+          <w:szCs w:val="22"/>
+        </w:rPr>
+      </w:pPr>
+    </w:p>
+    <w:p>
+      <w:pPr>
+        <w:rPr>
+          <w:rFonts w:ascii="Aptos" w:hAnsi="Aptos"/>
+          <w:sz w:val="22"/>
+          <w:szCs w:val="22"/>
+        </w:rPr>
+      </w:pPr>
+    </w:p>
+    <w:p>
+      <w:pPr>
+        <w:tabs>
+          <w:tab w:val="left" w:pos="954"/>
+        </w:tabs>
+        <w:rPr>
+          <w:rFonts w:ascii="Aptos" w:hAnsi="Aptos"/>
+          <w:sz w:val="22"/>
+          <w:szCs w:val="22"/>
+        </w:rPr>
+      </w:pPr>
+    </w:p>
+    <w:p>
+      <w:pPr>
+        <w:ind w:left="1134" w:right="1134"/>
+        <w:rPr>
+          <w:rFonts w:cs="Calibri"/>
+          <w:sz w:val="22"/>
+          <w:szCs w:val="22"/>
+        </w:rPr>
+      </w:pPr>
+      <w:permStart w:id="1647476519" w:edGrp="everyone"/>
+      <w:r>
+        <w:rPr>
+          <w:rFonts w:cs="Calibri"/>
+          <w:sz w:val="22"/>
+          <w:szCs w:val="22"/>
+        </w:rPr>
+        <w:t>{</w:t>
+      </w:r>
+      <w:proofErr w:type="spellStart"/>
+      <w:proofErr w:type="gramStart"/>
+      <w:r>
+        <w:rPr>
+          <w:rFonts w:cs="Calibri"/>
+          <w:sz w:val="22"/>
+          <w:szCs w:val="22"/>
+        </w:rPr>
+        <w:t>codeDocument</w:t>
+      </w:r>
+      <w:proofErr w:type="spellEnd"/>
+      <w:proofErr w:type="gramEnd"/>
+      <w:r>
+        <w:rPr>
+          <w:rFonts w:cs="Calibri"/>
+          <w:sz w:val="22"/>
+          <w:szCs w:val="22"/>
+        </w:rPr>
+        <w:t>}</w:t>
+      </w:r>
+    </w:p>
+    <w:p>
+      <w:pPr>
+        <w:ind w:left="1134" w:right="1134"/>
+        <w:rPr>
+          <w:rFonts w:cs="Calibri"/>
+          <w:sz w:val="22"/>
+          <w:szCs w:val="22"/>
+        </w:rPr>
+      </w:pPr>
+    </w:p>
+    <w:p>
+      <w:pPr>
+        <w:ind w:left="1134" w:right="1134"/>
+        <w:rPr>
+          <w:rFonts w:cs="Calibri"/>
+          <w:b/>
+          <w:bCs/>
+          <w:sz w:val="22"/>
+          <w:szCs w:val="22"/>
+        </w:rPr>
+      </w:pPr>
+      <w:r>
+        <w:rPr>
+          <w:rFonts w:cs="Calibri"/>
+          <w:b/>
+          <w:bCs/>
+          <w:sz w:val="22"/>
+          <w:szCs w:val="22"/>
+        </w:rPr>
+        <w:t>Objet : {objet}</w:t>
+      </w:r>
+    </w:p>
+    <w:p>
+      <w:pPr>
+        <w:ind w:left="1134" w:right="1134"/>
+        <w:rPr>
+          <w:rFonts w:cs="Calibri"/>
+          <w:sz w:val="22"/>
+          <w:szCs w:val="22"/>
+        </w:rPr>
+      </w:pPr>
+    </w:p>
+    <w:p>
+      <w:pPr>
+        <w:ind w:left="1134" w:right="1134"/>
+        <w:rPr>
+          <w:rFonts w:cs="Calibri"/>
+          <w:sz w:val="22"/>
+          <w:szCs w:val="22"/>
+        </w:rPr>
+      </w:pPr>
+    </w:p>
+    <w:p>
+      <w:pPr>
+        <w:ind w:left="1134" w:right="1134"/>
+        <w:rPr>
+          <w:rFonts w:cs="Calibri"/>
+          <w:sz w:val="22"/>
+          <w:szCs w:val="22"/>
+        </w:rPr>
+      </w:pPr>
+      <w:r>
+        <w:rPr>
+          <w:rFonts w:cs="Calibri"/>
+          <w:sz w:val="22"/>
+          <w:szCs w:val="22"/>
+        </w:rPr>
+        <w:t>{-</w:t>
+      </w:r>
+      <w:proofErr w:type="spellStart"/>
+      <w:proofErr w:type="gramStart"/>
+      <w:r>
+        <w:rPr>
+          <w:rFonts w:cs="Calibri"/>
+          <w:sz w:val="22"/>
+          <w:szCs w:val="22"/>
+        </w:rPr>
+        <w:t>w:p</w:t>
+      </w:r>
+      <w:proofErr w:type="spellEnd"/>
+      <w:proofErr w:type="gramEnd"/>
+      <w:r>
+        <w:rPr>
+          <w:rFonts w:cs="Calibri"/>
+          <w:sz w:val="22"/>
+          <w:szCs w:val="22"/>
+        </w:rPr>
+        <w:t xml:space="preserve"> </w:t>
+      </w:r>
+      <w:proofErr w:type="spellStart"/>
+      <w:proofErr w:type="gramStart"/>
+      <w:r>
+        <w:rPr>
+          <w:rFonts w:cs="Calibri"/>
+          <w:sz w:val="22"/>
+          <w:szCs w:val="22"/>
+        </w:rPr>
+        <w:t>nomDestinataire</w:t>
+      </w:r>
+      <w:proofErr w:type="spellEnd"/>
+      <w:r>
+        <w:rPr>
+          <w:rFonts w:cs="Calibri"/>
+          <w:sz w:val="22"/>
+          <w:szCs w:val="22"/>
+        </w:rPr>
+        <w:t>}{</w:t>
+      </w:r>
+      <w:proofErr w:type="spellStart"/>
+      <w:proofErr w:type="gramEnd"/>
+      <w:r>
+        <w:rPr>
+          <w:rFonts w:cs="Calibri"/>
+          <w:sz w:val="22"/>
+          <w:szCs w:val="22"/>
+        </w:rPr>
+        <w:t>civiliteDestinataire</w:t>
+      </w:r>
+      <w:proofErr w:type="spellEnd"/>
+      <w:r>
+        <w:rPr>
+          <w:rFonts w:cs="Calibri"/>
+          <w:sz w:val="22"/>
+          <w:szCs w:val="22"/>
+        </w:rPr>
+        <w:t>} {</w:t>
+      </w:r>
+      <w:proofErr w:type="spellStart"/>
+      <w:r>
+        <w:rPr>
+          <w:rFonts w:cs="Calibri"/>
+          <w:sz w:val="22"/>
+          <w:szCs w:val="22"/>
+        </w:rPr>
+        <w:t>nomDestinataire</w:t>
+      </w:r>
+      <w:proofErr w:type="spellEnd"/>
+      <w:r>
+        <w:rPr>
+          <w:rFonts w:cs="Calibri"/>
+          <w:sz w:val="22"/>
+          <w:szCs w:val="22"/>
+        </w:rPr>
+        <w:t>}{/</w:t>
+      </w:r>
+      <w:proofErr w:type="spellStart"/>
+      <w:r>
+        <w:rPr>
+          <w:rFonts w:cs="Calibri"/>
+          <w:sz w:val="22"/>
+          <w:szCs w:val="22"/>
+        </w:rPr>
+        <w:t>nomDestinataire</w:t>
+      </w:r>
+      <w:proofErr w:type="spellEnd"/>
+      <w:r>
+        <w:rPr>
+          <w:rFonts w:cs="Calibri"/>
+          <w:sz w:val="22"/>
+          <w:szCs w:val="22"/>
+        </w:rPr>
+        <w:t>}</w:t>
+      </w:r>
+      <w:r>
+        <w:rPr>
+          <w:rFonts w:cs="Calibri"/>
+          <w:sz w:val="22"/>
+          <w:szCs w:val="22"/>
+        </w:rPr>
+        <w:t>,</w:t>
+      </w:r>
+    </w:p>
+    <w:p>
+      <w:pPr>
+        <w:ind w:left="1134" w:right="1134"/>
+        <w:rPr>
+          <w:rFonts w:cs="Calibri"/>
+          <w:sz w:val="22"/>
+          <w:szCs w:val="22"/>
+        </w:rPr>
+      </w:pPr>
+    </w:p>
+    <w:p>
+      <w:pPr>
+        <w:ind w:left="1134" w:right="1134"/>
+        <w:rPr>
+          <w:rFonts w:cs="Calibri"/>
+          <w:sz w:val="22"/>
+          <w:szCs w:val="22"/>
+        </w:rPr>
+      </w:pPr>
+      <w:r>
+        <w:rPr>
+          <w:rFonts w:cs="Calibri"/>
+          <w:sz w:val="22"/>
+          <w:szCs w:val="22"/>
+        </w:rPr>
+        <w:t>{</w:t>
+      </w:r>
+      <w:proofErr w:type="spellStart"/>
+      <w:proofErr w:type="gramStart"/>
+      <w:r>
+        <w:rPr>
+          <w:rFonts w:cs="Calibri"/>
+          <w:sz w:val="22"/>
+          <w:szCs w:val="22"/>
+        </w:rPr>
+        <w:t>texteIa</w:t>
+      </w:r>
+      <w:proofErr w:type="spellEnd"/>
+      <w:proofErr w:type="gramEnd"/>
+      <w:r>
+        <w:rPr>
+          <w:rFonts w:cs="Calibri"/>
+          <w:sz w:val="22"/>
+          <w:szCs w:val="22"/>
+        </w:rPr>
+        <w:t>}</w:t>
+      </w:r>
+    </w:p>
+    <w:p>
+      <w:pPr>
+        <w:spacing w:before="1800"/>
+        <w:ind w:left="1134" w:right="1134"/>
+        <w:jc w:val="right"/>
+        <w:rPr>
+          <w:rFonts w:ascii="Aptos" w:hAnsi="Aptos"/>
+          <w:sz w:val="22"/>
+          <w:szCs w:val="22"/>
+        </w:rPr>
+      </w:pPr>
+      <w:r>
+        <w:rPr>
+          <w:rFonts w:ascii="Aptos" w:hAnsi="Aptos"/>
+          <w:sz w:val="22"/>
+          <w:szCs w:val="22"/>
+        </w:rPr>
+        <w:t>{</w:t>
+      </w:r>
+      <w:proofErr w:type="spellStart"/>
+      <w:proofErr w:type="gramStart"/>
+      <w:r>
+        <w:rPr>
+          <w:rFonts w:ascii="Aptos" w:hAnsi="Aptos"/>
+          <w:sz w:val="22"/>
+          <w:szCs w:val="22"/>
+        </w:rPr>
+        <w:t>signature</w:t>
+      </w:r>
+      <w:r>
+        <w:rPr>
+          <w:rFonts w:ascii="Aptos" w:hAnsi="Aptos"/>
+          <w:sz w:val="22"/>
+          <w:szCs w:val="22"/>
+        </w:rPr>
+        <w:t>Exp</w:t>
+      </w:r>
+      <w:proofErr w:type="spellEnd"/>
+      <w:proofErr w:type="gramEnd"/>
+      <w:r>
+        <w:rPr>
+          <w:rFonts w:ascii="Aptos" w:hAnsi="Aptos"/>
+          <w:sz w:val="22"/>
+          <w:szCs w:val="22"/>
+        </w:rPr>
+        <w:t>}</w:t>
+      </w:r>
+    </w:p>
+    <w:p>
+      <w:pPr>
+        <w:ind w:left="1134" w:right="1134"/>
+        <w:jc w:val="right"/>
+        <w:rPr>
+          <w:rFonts w:ascii="Aptos" w:hAnsi="Aptos"/>
+          <w:sz w:val="22"/>
+          <w:szCs w:val="22"/>
+        </w:rPr>
+      </w:pPr>
+      <w:r>
+        <w:rPr>
+          <w:rFonts w:ascii="Aptos" w:hAnsi="Aptos"/>
+          <w:sz w:val="22"/>
+          <w:szCs w:val="22"/>
+        </w:rPr>
+        <w:t>Secrétaire Fédéral</w:t>
+      </w:r>
+      <w:permEnd w:id="1647476519"/>
     </w:p>
     <w:sectPr>
-      <w:headerReference w:type="default" r:id="rId8"/>
-      <w:footerReference w:type="default" r:id="rId9"/>
+      <w:headerReference w:type="first" r:id="rId8"/>
+      <w:footerReference w:type="first" r:id="rId9"/>
       <w:pgSz w:w="11900" w:h="16840"/>
-      <w:pgMar w:top="17" w:right="0" w:bottom="24" w:left="0" w:header="708" w:footer="708" w:gutter="0"/>
+      <w:pgMar w:top="17" w:right="0" w:bottom="24" w:left="0" w:header="5669" w:footer="708" w:gutter="0"/>
       <w:cols w:space="708"/>
+      <w:titlePg/>
       <w:docGrid w:linePitch="360"/>
     </w:sectPr>
   </w:body>
@@ -1119,7 +1132,7 @@
         <w:noProof/>
       </w:rPr>
       <w:pict w14:anchorId="1D1540E1">
-        <v:rect id="_x0000_s1027" style="position:absolute;margin-left:-1.35pt;margin-top:.9pt;width:594.9pt;height:44.3pt;z-index:251657216" stroked="f">
+        <v:rect id="_x0000_s1035" style="position:absolute;margin-left:-1.35pt;margin-top:.9pt;width:594.9pt;height:44.3pt;z-index:251660288" stroked="f">
           <v:fill r:id="rId1" o:title="logo FO pied" recolor="t" type="frame"/>
         </v:rect>
       </w:pict>
@@ -1158,7 +1171,7 @@
         <w:noProof/>
       </w:rPr>
       <w:pict w14:anchorId="6ABAD89F">
-        <v:rect id="_x0000_s1028" style="position:absolute;margin-left:19.35pt;margin-top:45.55pt;width:141.25pt;height:205.15pt;z-index:251658240" stroked="f">
+        <v:rect id="_x0000_s1040" style="position:absolute;margin-left:19.35pt;margin-top:-202.5pt;width:141.25pt;height:205.15pt;z-index:251662336" stroked="f">
           <v:fill r:id="rId1" o:title="logo FO" recolor="t" type="frame"/>
         </v:rect>
       </w:pict>
@@ -1559,7 +1572,7 @@
   <w:style w:type="paragraph" w:default="1" w:styleId="Normal">
     <w:name w:val="Normal"/>
     <w:qFormat/>
-    <w:rsid w:val="00B5606E"/>
+    <w:rsid w:val="00F73CC8"/>
     <w:rPr>
       <w:sz w:val="24"/>
       <w:szCs w:val="24"/>

</xml_diff>

<commit_message>
fix: Correction bugs formulaire - contamination données entre templates et undefined dans dropdowns
- Fix contamination données entre templates via filtrage dans cleanFormData()
- Fix undefined dans dropdowns civilité (select contrôlé correctement)
- Invalidation cache document lors changement de template
- Toast informatif lors du changement de template
- Suppression template_custom.docx dupliqué (déplacé dans templates/word/)
</commit_message>
<xml_diff>
--- a/templates/word/template_custom.docx
+++ b/templates/word/template_custom.docx
@@ -17,12 +17,453 @@
           <w:sz w:val="22"/>
           <w:szCs w:val="22"/>
         </w:rPr>
-        <w:pict w14:anchorId="2F3011E9">
+        <w:pict w14:anchorId="4406F46B">
           <v:shapetype id="_x0000_t202" coordsize="21600,21600" o:spt="202" path="m,l,21600r21600,l21600,xe">
             <v:stroke joinstyle="miter"/>
             <v:path gradientshapeok="t" o:connecttype="rect"/>
           </v:shapetype>
-          <v:shape id="_x0000_s2062" type="#_x0000_t202" style="position:absolute;margin-left:292.1pt;margin-top:-162.85pt;width:251.05pt;height:155.6pt;z-index:251656192;visibility:visible;mso-width-relative:margin;mso-height-relative:margin" o:gfxdata="UEsDBBQABgAIAAAAIQC2gziS/gAAAOEBAAATAAAAW0NvbnRlbnRfVHlwZXNdLnhtbJSRQU7DMBBF&#10;90jcwfIWJU67QAgl6YK0S0CoHGBkTxKLZGx5TGhvj5O2G0SRWNoz/78nu9wcxkFMGNg6quQqL6RA&#10;0s5Y6ir5vt9lD1JwBDIwOMJKHpHlpr69KfdHjyxSmriSfYz+USnWPY7AufNIadK6MEJMx9ApD/oD&#10;OlTrorhX2lFEilmcO2RdNtjC5xDF9pCuTyYBB5bi6bQ4syoJ3g9WQ0ymaiLzg5KdCXlKLjvcW893&#10;SUOqXwnz5DrgnHtJTxOsQfEKIT7DmDSUCaxw7Rqn8787ZsmRM9e2VmPeBN4uqYvTtW7jvijg9N/y&#10;JsXecLq0q+WD6m8AAAD//wMAUEsDBBQABgAIAAAAIQA4/SH/1gAAAJQBAAALAAAAX3JlbHMvLnJl&#10;bHOkkMFqwzAMhu+DvYPRfXGawxijTi+j0GvpHsDYimMaW0Yy2fr2M4PBMnrbUb/Q94l/f/hMi1qR&#10;JVI2sOt6UJgd+ZiDgffL8ekFlFSbvV0oo4EbChzGx4f9GRdb25HMsYhqlCwG5lrLq9biZkxWOiqY&#10;22YiTra2kYMu1l1tQD30/bPm3wwYN0x18gb45AdQl1tp5j/sFB2T0FQ7R0nTNEV3j6o9feQzro1i&#10;OWA14Fm+Q8a1a8+Bvu/d/dMb2JY5uiPbhG/ktn4cqGU/er3pcvwCAAD//wMAUEsDBBQABgAIAAAA&#10;IQCVjOgwOwIAAG0EAAAOAAAAZHJzL2Uyb0RvYy54bWysVEtv2zAMvg/YfxB0Xxzn1dSIU2QpMgwI&#10;2gLp0LMiy7EAWdQkJXb260fJebXbaVgOCilSfHwf6dlDWytyENZJ0DlNe31KhOZQSL3L6Y/X1Zcp&#10;Jc4zXTAFWuT0KBx9mH/+NGtMJgZQgSqEJRhEu6wxOa28N1mSOF6JmrkeGKHRWIKtmUfV7pLCsgaj&#10;1yoZ9PuTpAFbGAtcOIe3j52RzmP8shTcP5elE56onGJtPp42nttwJvMZy3aWmUryUxnsH6qomdSY&#10;9BLqkXlG9lb+EaqW3IKD0vc41AmUpeQi9oDdpP0P3WwqZkTsBcFx5gKT+39h+dNhY14s8e1XaJHA&#10;AEhjXObwMvTTlrYO/1gpQTtCeLzAJlpPOF4O0+l0OBxTwtGWDu4nk7sIbHJ9bqzz3wTUJAg5tchL&#10;hIsd1s5jSnQ9u4RsDpQsVlKpqBzdUllyYEghMl9AQ4lizuNlTlfxF6rGEO+eKU2anE6G437MpCHE&#10;6/yURvdrl0Hy7bYlsrhBYAvFEYGx0M2MM3wlsfg1Zn5hFocEscDB9894lAowF5wkSiqwv/52H/yR&#10;O7RS0uDQ5dT93DMrsKHvGlm9T0ejMKVRGY3vBqjYW8v21qL39RIQlBRXzPAoBn+vzmJpoX7D/ViE&#10;rGhimmPunPqzuPTdKuB+cbFYRCecS8P8Wm8MD6EDA4Ga1/aNWXPizyP1T3AeT5Z9oLHzDS81LPYe&#10;Shk5Djh3qJ7gx5mOvJ32LyzNrR69rl+J+W8AAAD//wMAUEsDBBQABgAIAAAAIQDbCZ5r3wAAAAwB&#10;AAAPAAAAZHJzL2Rvd25yZXYueG1sTI9BTwIxEIXvJv6HZky8ScuiFdadJcbEq4mAnMu2bDe20822&#10;wMKvt5zkOHlf3vumWo7esaMZYhcIYToRwAw1QXfUImzWn09zYDEp0soFMghnE2FZ399VqtThRN/m&#10;uEotyyUUS4VgU+pLzmNjjVdxEnpDOduHwauUz6HlelCnXO4dL4SQ3KuO8oJVvfmwpvldHTzCtvWX&#10;7c+0H6z27pm+Luf1JnSIjw/j+xuwZMb0D8NVP6tDnZ124UA6MofwIkWRUYTZQr4CuxJCFjNgOwQp&#10;xAJ4XfHbJ+o/AAAA//8DAFBLAQItABQABgAIAAAAIQC2gziS/gAAAOEBAAATAAAAAAAAAAAAAAAA&#10;AAAAAABbQ29udGVudF9UeXBlc10ueG1sUEsBAi0AFAAGAAgAAAAhADj9If/WAAAAlAEAAAsAAAAA&#10;AAAAAAAAAAAALwEAAF9yZWxzLy5yZWxzUEsBAi0AFAAGAAgAAAAhAJWM6DA7AgAAbQQAAA4AAAAA&#10;AAAAAAAAAAAALgIAAGRycy9lMm9Eb2MueG1sUEsBAi0AFAAGAAgAAAAhANsJnmvfAAAADAEAAA8A&#10;AAAAAAAAAAAAAAAAlQQAAGRycy9kb3ducmV2LnhtbFBLBQYAAAAABAAEAPMAAAChBQAAAAA=&#10;" stroked="f" strokeweight=".5pt">
+          <v:shape id="_x0000_s2067" type="#_x0000_t202" style="position:absolute;margin-left:423.9pt;margin-top:670pt;width:119.6pt;height:46.7pt;z-index:251659264;visibility:visible" o:gfxdata="UEsDBBQABgAIAAAAIQC2gziS/gAAAOEBAAATAAAAW0NvbnRlbnRfVHlwZXNdLnhtbJSRQU7DMBBF&#10;90jcwfIWJU67QAgl6YK0S0CoHGBkTxKLZGx5TGhvj5O2G0SRWNoz/78nu9wcxkFMGNg6quQqL6RA&#10;0s5Y6ir5vt9lD1JwBDIwOMJKHpHlpr69KfdHjyxSmriSfYz+USnWPY7AufNIadK6MEJMx9ApD/oD&#10;OlTrorhX2lFEilmcO2RdNtjC5xDF9pCuTyYBB5bi6bQ4syoJ3g9WQ0ymaiLzg5KdCXlKLjvcW893&#10;SUOqXwnz5DrgnHtJTxOsQfEKIT7DmDSUCaxw7Rqn8787ZsmRM9e2VmPeBN4uqYvTtW7jvijg9N/y&#10;JsXecLq0q+WD6m8AAAD//wMAUEsDBBQABgAIAAAAIQA4/SH/1gAAAJQBAAALAAAAX3JlbHMvLnJl&#10;bHOkkMFqwzAMhu+DvYPRfXGawxijTi+j0GvpHsDYimMaW0Yy2fr2M4PBMnrbUb/Q94l/f/hMi1qR&#10;JVI2sOt6UJgd+ZiDgffL8ekFlFSbvV0oo4EbChzGx4f9GRdb25HMsYhqlCwG5lrLq9biZkxWOiqY&#10;22YiTra2kYMu1l1tQD30/bPm3wwYN0x18gb45AdQl1tp5j/sFB2T0FQ7R0nTNEV3j6o9feQzro1i&#10;OWA14Fm+Q8a1a8+Bvu/d/dMb2JY5uiPbhG/ktn4cqGU/er3pcvwCAAD//wMAUEsDBBQABgAIAAAA&#10;IQBdJjHC9wEAANEDAAAOAAAAZHJzL2Uyb0RvYy54bWysU8tu2zAQvBfoPxC817Jcx0kEy0HqwEWB&#10;9AGk/QCKoiSiFJdd0pbcr++SchwjvRXVgeBqydmd2eH6buwNOyj0GmzJ89mcM2Ul1Nq2Jf/xfffu&#10;hjMfhK2FAatKflSe323evlkPrlAL6MDUChmBWF8MruRdCK7IMi871Qs/A6csJRvAXgQKsc1qFAOh&#10;9yZbzOerbACsHYJU3tPfhynJNwm/aZQMX5vGq8BMyam3kFZMaxXXbLMWRYvCdVqe2hD/0EUvtKWi&#10;Z6gHEQTbo/4LqtcSwUMTZhL6DJpGS5U4EJt8/orNUyecSlxIHO/OMvn/Byu/HJ7cN2Rh/AAjDTCR&#10;8O4R5E/PLGw7YVt1jwhDp0RNhfMoWTY4X5yuRql94SNINXyGmoYs9gES0NhgH1UhnozQaQDHs+hq&#10;DEzGklf5ze2CUpJyy9X1+1WaSiaK59sOffiooGdxU3KkoSZ0cXj0IXYjiucjsZgHo+udNiYF2FZb&#10;g+wgyAC79CUCr44ZGw9biNcmxPgn0YzMJo5hrEama+oyQkTWFdRH4o0w+YreAW06wN+cDeSpkvtf&#10;e4GKM/PJkna3+XIZTZiC5dV1ZI2XmeoyI6wkqJIHzqbtNkzG3TvUbUeVpmlZuCe9G52keOnq1D75&#10;Jil08ng05mWcTr28xM0fAAAA//8DAFBLAwQUAAYACAAAACEABjRv2uAAAAAOAQAADwAAAGRycy9k&#10;b3ducmV2LnhtbEyPQU+DQBCF7yb+h82YeDF2adEtpSyNmmi8tvYHLDAFUnaWsNtC/73DSW8z817e&#10;fC/bTbYTVxx860jDchGBQCpd1VKt4fjz+ZyA8MFQZTpHqOGGHnb5/V1m0sqNtMfrIdSCQ8inRkMT&#10;Qp9K6csGrfEL1yOxdnKDNYHXoZbVYEYOt51cRZGS1rTEHxrT40eD5flwsRpO3+PT62YsvsJxvX9R&#10;76ZdF+6m9ePD9LYFEXAKf2aY8RkdcmYq3IUqLzoNySpm9MBCvFTcarZEKuapmG/JRoHMM/m/Rv4L&#10;AAD//wMAUEsBAi0AFAAGAAgAAAAhALaDOJL+AAAA4QEAABMAAAAAAAAAAAAAAAAAAAAAAFtDb250&#10;ZW50X1R5cGVzXS54bWxQSwECLQAUAAYACAAAACEAOP0h/9YAAACUAQAACwAAAAAAAAAAAAAAAAAv&#10;AQAAX3JlbHMvLnJlbHNQSwECLQAUAAYACAAAACEAXSYxwvcBAADRAwAADgAAAAAAAAAAAAAAAAAu&#10;AgAAZHJzL2Uyb0RvYy54bWxQSwECLQAUAAYACAAAACEABjRv2uAAAAAOAQAADwAAAAAAAAAAAAAA&#10;AABRBAAAZHJzL2Rvd25yZXYueG1sUEsFBgAAAAAEAAQA8wAAAF4FAAAAAA==&#10;" stroked="f">
+            <v:textbox style="mso-next-textbox:#_x0000_s2067">
+              <w:txbxContent>
+                <w:p>
+                  <w:pPr>
+                    <w:jc w:val="both"/>
+                    <w:rPr>
+                      <w:rFonts w:ascii="Aptos" w:hAnsi="Aptos"/>
+                      <w:sz w:val="22"/>
+                      <w:szCs w:val="22"/>
+                    </w:rPr>
+                  </w:pPr>
+                  <w:r>
+                    <w:rPr>
+                      <w:rFonts w:ascii="Aptos" w:hAnsi="Aptos"/>
+                      <w:sz w:val="22"/>
+                      <w:szCs w:val="22"/>
+                    </w:rPr>
+                    <w:t>{</w:t>
+                  </w:r>
+                  <w:proofErr w:type="gramStart"/>
+                  <w:r>
+                    <w:rPr>
+                      <w:rFonts w:ascii="Aptos" w:hAnsi="Aptos"/>
+                      <w:sz w:val="22"/>
+                      <w:szCs w:val="22"/>
+                    </w:rPr>
+                    <w:t>signature</w:t>
+                  </w:r>
+                  <w:r>
+                    <w:rPr>
+                      <w:rFonts w:ascii="Aptos" w:hAnsi="Aptos"/>
+                      <w:sz w:val="22"/>
+                      <w:szCs w:val="22"/>
+                    </w:rPr>
+                    <w:t>Exp</w:t>
+                  </w:r>
+                  <w:proofErr w:type="gramEnd"/>
+                  <w:r>
+                    <w:rPr>
+                      <w:rFonts w:ascii="Aptos" w:hAnsi="Aptos"/>
+                      <w:sz w:val="22"/>
+                      <w:szCs w:val="22"/>
+                    </w:rPr>
+                    <w:t>}</w:t>
+                  </w:r>
+                </w:p>
+                <w:p>
+                  <w:pPr>
+                    <w:jc w:val="both"/>
+                    <w:rPr>
+                      <w:rFonts w:ascii="Aptos" w:hAnsi="Aptos"/>
+                      <w:sz w:val="22"/>
+                      <w:szCs w:val="22"/>
+                    </w:rPr>
+                  </w:pPr>
+                  <w:r>
+                    <w:rPr>
+                      <w:rFonts w:ascii="Aptos" w:hAnsi="Aptos"/>
+                      <w:sz w:val="22"/>
+                      <w:szCs w:val="22"/>
+                    </w:rPr>
+                    <w:t>Secrétaire Fédéral</w:t>
+                  </w:r>
+                </w:p>
+              </w:txbxContent>
+            </v:textbox>
+          </v:shape>
+        </w:pict>
+      </w:r>
+      <w:r>
+        <w:rPr>
+          <w:rFonts w:ascii="Aptos" w:hAnsi="Aptos"/>
+          <w:noProof/>
+          <w:sz w:val="22"/>
+          <w:szCs w:val="22"/>
+        </w:rPr>
+        <w:pict w14:anchorId="622BEB30">
+          <v:shape id="_x0000_s2063" type="#_x0000_t202" style="position:absolute;margin-left:292.45pt;margin-top:324.2pt;width:251.05pt;height:24.75pt;z-index:251657216;visibility:visible" o:gfxdata="UEsDBBQABgAIAAAAIQC2gziS/gAAAOEBAAATAAAAW0NvbnRlbnRfVHlwZXNdLnhtbJSRQU7DMBBF&#10;90jcwfIWJU67QAgl6YK0S0CoHGBkTxKLZGx5TGhvj5O2G0SRWNoz/78nu9wcxkFMGNg6quQqL6RA&#10;0s5Y6ir5vt9lD1JwBDIwOMJKHpHlpr69KfdHjyxSmriSfYz+USnWPY7AufNIadK6MEJMx9ApD/oD&#10;OlTrorhX2lFEilmcO2RdNtjC5xDF9pCuTyYBB5bi6bQ4syoJ3g9WQ0ymaiLzg5KdCXlKLjvcW893&#10;SUOqXwnz5DrgnHtJTxOsQfEKIT7DmDSUCaxw7Rqn8787ZsmRM9e2VmPeBN4uqYvTtW7jvijg9N/y&#10;JsXecLq0q+WD6m8AAAD//wMAUEsDBBQABgAIAAAAIQA4/SH/1gAAAJQBAAALAAAAX3JlbHMvLnJl&#10;bHOkkMFqwzAMhu+DvYPRfXGawxijTi+j0GvpHsDYimMaW0Yy2fr2M4PBMnrbUb/Q94l/f/hMi1qR&#10;JVI2sOt6UJgd+ZiDgffL8ekFlFSbvV0oo4EbChzGx4f9GRdb25HMsYhqlCwG5lrLq9biZkxWOiqY&#10;22YiTra2kYMu1l1tQD30/bPm3wwYN0x18gb45AdQl1tp5j/sFB2T0FQ7R0nTNEV3j6o9feQzro1i&#10;OWA14Fm+Q8a1a8+Bvu/d/dMb2JY5uiPbhG/ktn4cqGU/er3pcvwCAAD//wMAUEsDBBQABgAIAAAA&#10;IQD/hAE2+AEAANEDAAAOAAAAZHJzL2Uyb0RvYy54bWysU9uO0zAQfUfiHyy/0zS9QImarpauipCW&#10;i7TwAY7jJBaOx4zdJuXrGTvd7gJviDxYHo99Zs6Zk+3N2Bt2Uug12JLnszlnykqotW1L/u3r4dWG&#10;Mx+ErYUBq0p+Vp7f7F6+2A6uUAvowNQKGYFYXwyu5F0IrsgyLzvVCz8DpywlG8BeBAqxzWoUA6H3&#10;JlvM56+zAbB2CFJ5T6d3U5LvEn7TKBk+N41XgZmSU28hrZjWKq7ZbiuKFoXrtLy0If6hi15oS0Wv&#10;UHciCHZE/RdUryWChybMJPQZNI2WKnEgNvn8DzYPnXAqcSFxvLvK5P8frPx0enBfkIXxHYw0wETC&#10;u3uQ3z2zsO+EbdUtIgydEjUVzqNk2eB8cXkapfaFjyDV8BFqGrI4BkhAY4N9VIV4MkKnAZyvoqsx&#10;MEmHy3yzWS7XnEnKLfPVcrFOJUTx+NqhD+8V9CxuSo401IQuTvc+xG5E8XglFvNgdH3QxqQA22pv&#10;kJ0EGeCQvgv6b9eMjZctxGcTYjxJNCOziWMYq5HpuuSLCBFZV1CfiTfC5Cv6D2jTAf7kbCBPldz/&#10;OApUnJkPlrR7m69W0YQpWK3fLCjA55nqeUZYSVAlD5xN232YjHt0qNuOKk3TsnBLejc6SfHU1aV9&#10;8k1S6OLxaMzncbr19CfufgEAAP//AwBQSwMEFAAGAAgAAAAhAFBhpLvgAAAADAEAAA8AAABkcnMv&#10;ZG93bnJldi54bWxMj0FOwzAQRfdI3MEaJDaI2rSp06RxKkACsW3pASaxm0TE4yh2m/T2uCtYzszT&#10;n/eL3Wx7djGj7xwpeFkIYIZqpztqFBy/P543wHxA0tg7MgquxsOuvL8rMNduor25HELDYgj5HBW0&#10;IQw5575ujUW/cIOheDu50WKI49hwPeIUw23Pl0JIbrGj+KHFwby3pv45nK2C09f0tM6m6jMc030i&#10;37BLK3dV6vFhft0CC2YOfzDc9KM6lNGpcmfSnvUK1lJkEVUgl0kC7EYIuYr1qrhKVxnwsuD/S5S/&#10;AAAA//8DAFBLAQItABQABgAIAAAAIQC2gziS/gAAAOEBAAATAAAAAAAAAAAAAAAAAAAAAABbQ29u&#10;dGVudF9UeXBlc10ueG1sUEsBAi0AFAAGAAgAAAAhADj9If/WAAAAlAEAAAsAAAAAAAAAAAAAAAAA&#10;LwEAAF9yZWxzLy5yZWxzUEsBAi0AFAAGAAgAAAAhAP+EATb4AQAA0QMAAA4AAAAAAAAAAAAAAAAA&#10;LgIAAGRycy9lMm9Eb2MueG1sUEsBAi0AFAAGAAgAAAAhAFBhpLvgAAAADAEAAA8AAAAAAAAAAAAA&#10;AAAAUgQAAGRycy9kb3ducmV2LnhtbFBLBQYAAAAABAAEAPMAAABfBQAAAAA=&#10;" stroked="f">
+            <v:textbox style="mso-next-textbox:#_x0000_s2063">
+              <w:txbxContent>
+                <w:p>
+                  <w:pPr>
+                    <w:rPr>
+                      <w:rFonts w:ascii="Aptos" w:hAnsi="Aptos"/>
+                      <w:sz w:val="22"/>
+                      <w:szCs w:val="22"/>
+                    </w:rPr>
+                  </w:pPr>
+                  <w:r>
+                    <w:rPr>
+                      <w:rFonts w:ascii="Aptos" w:hAnsi="Aptos"/>
+                      <w:sz w:val="22"/>
+                      <w:szCs w:val="22"/>
+                    </w:rPr>
+                    <w:t xml:space="preserve">Paris, le </w:t>
+                  </w:r>
+                  <w:r>
+                    <w:rPr>
+                      <w:rFonts w:ascii="Aptos" w:hAnsi="Aptos"/>
+                      <w:sz w:val="22"/>
+                      <w:szCs w:val="22"/>
+                    </w:rPr>
+                    <w:fldChar w:fldCharType="begin"/>
+                  </w:r>
+                  <w:r>
+                    <w:rPr>
+                      <w:rFonts w:ascii="Aptos" w:hAnsi="Aptos"/>
+                      <w:sz w:val="22"/>
+                      <w:szCs w:val="22"/>
+                    </w:rPr>
+                    <w:instrText xml:space="preserve"> TIME \@ "d MMMM yyyy" </w:instrText>
+                  </w:r>
+                  <w:r>
+                    <w:rPr>
+                      <w:rFonts w:ascii="Aptos" w:hAnsi="Aptos"/>
+                      <w:sz w:val="22"/>
+                      <w:szCs w:val="22"/>
+                    </w:rPr>
+                    <w:fldChar w:fldCharType="separate"/>
+                  </w:r>
+                  <w:r>
+                    <w:rPr>
+                      <w:rFonts w:ascii="Aptos" w:hAnsi="Aptos"/>
+                      <w:noProof/>
+                      <w:sz w:val="22"/>
+                      <w:szCs w:val="22"/>
+                    </w:rPr>
+                    <w:t>11 décembre 2025</w:t>
+                  </w:r>
+                  <w:r>
+                    <w:rPr>
+                      <w:rFonts w:ascii="Aptos" w:hAnsi="Aptos"/>
+                      <w:sz w:val="22"/>
+                      <w:szCs w:val="22"/>
+                    </w:rPr>
+                    <w:fldChar w:fldCharType="end"/>
+                  </w:r>
+                </w:p>
+              </w:txbxContent>
+            </v:textbox>
+          </v:shape>
+        </w:pict>
+      </w:r>
+    </w:p>
+    <w:p>
+      <w:pPr>
+        <w:rPr>
+          <w:rFonts w:ascii="Aptos" w:hAnsi="Aptos"/>
+          <w:sz w:val="22"/>
+          <w:szCs w:val="22"/>
+        </w:rPr>
+      </w:pPr>
+    </w:p>
+    <w:p>
+      <w:pPr>
+        <w:tabs>
+          <w:tab w:val="left" w:pos="4437"/>
+        </w:tabs>
+        <w:rPr>
+          <w:rFonts w:ascii="Aptos" w:hAnsi="Aptos"/>
+          <w:sz w:val="22"/>
+          <w:szCs w:val="22"/>
+        </w:rPr>
+      </w:pPr>
+      <w:r>
+        <w:rPr>
+          <w:rFonts w:ascii="Aptos" w:hAnsi="Aptos"/>
+          <w:noProof/>
+          <w:sz w:val="22"/>
+          <w:szCs w:val="22"/>
+        </w:rPr>
+        <w:pict w14:anchorId="49EA7E95">
+          <v:shape id="_x0000_s2066" type="#_x0000_t202" style="position:absolute;margin-left:81.5pt;margin-top:353.95pt;width:462pt;height:276.4pt;z-index:251658240;visibility:visible" o:gfxdata="UEsDBBQABgAIAAAAIQC2gziS/gAAAOEBAAATAAAAW0NvbnRlbnRfVHlwZXNdLnhtbJSRQU7DMBBF&#10;90jcwfIWJU67QAgl6YK0S0CoHGBkTxKLZGx5TGhvj5O2G0SRWNoz/78nu9wcxkFMGNg6quQqL6RA&#10;0s5Y6ir5vt9lD1JwBDIwOMJKHpHlpr69KfdHjyxSmriSfYz+USnWPY7AufNIadK6MEJMx9ApD/oD&#10;OlTrorhX2lFEilmcO2RdNtjC5xDF9pCuTyYBB5bi6bQ4syoJ3g9WQ0ymaiLzg5KdCXlKLjvcW893&#10;SUOqXwnz5DrgnHtJTxOsQfEKIT7DmDSUCaxw7Rqn8787ZsmRM9e2VmPeBN4uqYvTtW7jvijg9N/y&#10;JsXecLq0q+WD6m8AAAD//wMAUEsDBBQABgAIAAAAIQA4/SH/1gAAAJQBAAALAAAAX3JlbHMvLnJl&#10;bHOkkMFqwzAMhu+DvYPRfXGawxijTi+j0GvpHsDYimMaW0Yy2fr2M4PBMnrbUb/Q94l/f/hMi1qR&#10;JVI2sOt6UJgd+ZiDgffL8ekFlFSbvV0oo4EbChzGx4f9GRdb25HMsYhqlCwG5lrLq9biZkxWOiqY&#10;22YiTra2kYMu1l1tQD30/bPm3wwYN0x18gb45AdQl1tp5j/sFB2T0FQ7R0nTNEV3j6o9feQzro1i&#10;OWA14Fm+Q8a1a8+Bvu/d/dMb2JY5uiPbhG/ktn4cqGU/er3pcvwCAAD//wMAUEsDBBQABgAIAAAA&#10;IQA6P0Ik+AEAANIDAAAOAAAAZHJzL2Uyb0RvYy54bWysU8GO0zAQvSPxD5bvNGlpu0vUdLV0VYS0&#10;LEgLH+A4TmLheMzYbbJ8PWOn2y1wQ+RgeTz2m3lvXjY3Y2/YUaHXYEs+n+WcKSuh1rYt+bev+zfX&#10;nPkgbC0MWFXyJ+X5zfb1q83gCrWADkytkBGI9cXgSt6F4Ios87JTvfAzcMpSsgHsRaAQ26xGMRB6&#10;b7JFnq+zAbB2CFJ5T6d3U5JvE37TKBk+N41XgZmSU28hrZjWKq7ZdiOKFoXrtDy1If6hi15oS0XP&#10;UHciCHZA/RdUryWChybMJPQZNI2WKnEgNvP8DzaPnXAqcSFxvDvL5P8frHw4ProvyML4HkYaYCLh&#10;3T3I755Z2HXCtuoWEYZOiZoKz6Nk2eB8cXoapfaFjyDV8AlqGrI4BEhAY4N9VIV4MkKnATydRVdj&#10;YJIOV9frq2VOKUm5t+v5Kl+tUg1RPD936MMHBT2Lm5IjTTXBi+O9D7EdUTxfidU8GF3vtTEpwLba&#10;GWRHQQ7Yp++E/ts1Y+NlC/HZhBhPEs9IbSIZxmpkuqY2I0SkXUH9RMQRJmPRj0CbDvAnZwOZquT+&#10;x0Gg4sx8tCTeu/lyGV2YguXqakEBXmaqy4ywkqBKHjibtrswOffgULcdVZrGZeGWBG90kuKlq1P7&#10;ZJyk0Mnk0ZmXcbr18itufwEAAP//AwBQSwMEFAAGAAgAAAAhAHuoWjzfAAAADQEAAA8AAABkcnMv&#10;ZG93bnJldi54bWxMj8FOwzAQRO9I/IO1SFwQtSHgkDROBUigXlv6AU68TaLGdhS7Tfr3bE5wnJ3R&#10;7JtiM9ueXXAMnXcKnlYCGLram841Cg4/X49vwELUzujeO1RwxQCb8vam0Lnxk9vhZR8bRiUu5FpB&#10;G+OQcx7qFq0OKz+gI+/oR6sjybHhZtQTlduePwshudWdow+tHvCzxfq0P1sFx+308JpN1Xc8pLsX&#10;+aG7tPJXpe7v5vc1sIhz/AvDgk/oUBJT5c/OBNaTTjLaEhWkSSqBLQkhEzpViydkBrws+P8V5S8A&#10;AAD//wMAUEsBAi0AFAAGAAgAAAAhALaDOJL+AAAA4QEAABMAAAAAAAAAAAAAAAAAAAAAAFtDb250&#10;ZW50X1R5cGVzXS54bWxQSwECLQAUAAYACAAAACEAOP0h/9YAAACUAQAACwAAAAAAAAAAAAAAAAAv&#10;AQAAX3JlbHMvLnJlbHNQSwECLQAUAAYACAAAACEAOj9CJPgBAADSAwAADgAAAAAAAAAAAAAAAAAu&#10;AgAAZHJzL2Uyb0RvYy54bWxQSwECLQAUAAYACAAAACEAe6haPN8AAAANAQAADwAAAAAAAAAAAAAA&#10;AABSBAAAZHJzL2Rvd25yZXYueG1sUEsFBgAAAAAEAAQA8wAAAF4FAAAAAA==&#10;" stroked="f">
+            <v:textbox style="mso-next-textbox:#_x0000_s2066">
+              <w:txbxContent>
+                <w:p>
+                  <w:pPr>
+                    <w:rPr>
+                      <w:rFonts w:cs="Calibri"/>
+                      <w:sz w:val="22"/>
+                      <w:szCs w:val="22"/>
+                    </w:rPr>
+                  </w:pPr>
+                  <w:permStart w:id="350494471" w:edGrp="everyone"/>
+                  <w:r>
+                    <w:rPr>
+                      <w:rFonts w:cs="Calibri"/>
+                      <w:sz w:val="22"/>
+                      <w:szCs w:val="22"/>
+                    </w:rPr>
+                    <w:t>{</w:t>
+                  </w:r>
+                  <w:proofErr w:type="spellStart"/>
+                  <w:proofErr w:type="gramStart"/>
+                  <w:r>
+                    <w:rPr>
+                      <w:rFonts w:cs="Calibri"/>
+                      <w:sz w:val="22"/>
+                      <w:szCs w:val="22"/>
+                    </w:rPr>
+                    <w:t>codeDocument</w:t>
+                  </w:r>
+                  <w:proofErr w:type="spellEnd"/>
+                  <w:proofErr w:type="gramEnd"/>
+                  <w:r>
+                    <w:rPr>
+                      <w:rFonts w:cs="Calibri"/>
+                      <w:sz w:val="22"/>
+                      <w:szCs w:val="22"/>
+                    </w:rPr>
+                    <w:t>}</w:t>
+                  </w:r>
+                </w:p>
+                <w:p>
+                  <w:pPr>
+                    <w:rPr>
+                      <w:rFonts w:cs="Calibri"/>
+                      <w:sz w:val="22"/>
+                      <w:szCs w:val="22"/>
+                    </w:rPr>
+                  </w:pPr>
+                </w:p>
+                <w:p>
+                  <w:pPr>
+                    <w:rPr>
+                      <w:rFonts w:cs="Calibri"/>
+                      <w:b/>
+                      <w:bCs/>
+                      <w:sz w:val="22"/>
+                      <w:szCs w:val="22"/>
+                    </w:rPr>
+                  </w:pPr>
+                  <w:r>
+                    <w:rPr>
+                      <w:rFonts w:cs="Calibri"/>
+                      <w:b/>
+                      <w:bCs/>
+                      <w:sz w:val="22"/>
+                      <w:szCs w:val="22"/>
+                    </w:rPr>
+                    <w:t>Objet : {objet}</w:t>
+                  </w:r>
+                </w:p>
+                <w:p>
+                  <w:pPr>
+                    <w:rPr>
+                      <w:rFonts w:cs="Calibri"/>
+                      <w:sz w:val="22"/>
+                      <w:szCs w:val="22"/>
+                    </w:rPr>
+                  </w:pPr>
+                </w:p>
+                <w:p>
+                  <w:pPr>
+                    <w:rPr>
+                      <w:rFonts w:cs="Calibri"/>
+                      <w:sz w:val="22"/>
+                      <w:szCs w:val="22"/>
+                    </w:rPr>
+                  </w:pPr>
+                </w:p>
+                <w:p>
+                  <w:pPr>
+                    <w:rPr>
+                      <w:rFonts w:cs="Calibri"/>
+                      <w:sz w:val="22"/>
+                      <w:szCs w:val="22"/>
+                    </w:rPr>
+                  </w:pPr>
+                  <w:r>
+                    <w:rPr>
+                      <w:rFonts w:cs="Calibri"/>
+                      <w:sz w:val="22"/>
+                      <w:szCs w:val="22"/>
+                    </w:rPr>
+                    <w:t>{-</w:t>
+                  </w:r>
+                  <w:proofErr w:type="spellStart"/>
+                  <w:proofErr w:type="gramStart"/>
+                  <w:r>
+                    <w:rPr>
+                      <w:rFonts w:cs="Calibri"/>
+                      <w:sz w:val="22"/>
+                      <w:szCs w:val="22"/>
+                    </w:rPr>
+                    <w:t>w:p</w:t>
+                  </w:r>
+                  <w:proofErr w:type="spellEnd"/>
+                  <w:proofErr w:type="gramEnd"/>
+                  <w:r>
+                    <w:rPr>
+                      <w:rFonts w:cs="Calibri"/>
+                      <w:sz w:val="22"/>
+                      <w:szCs w:val="22"/>
+                    </w:rPr>
+                    <w:t xml:space="preserve"> </w:t>
+                  </w:r>
+                  <w:proofErr w:type="spellStart"/>
+                  <w:proofErr w:type="gramStart"/>
+                  <w:r>
+                    <w:rPr>
+                      <w:rFonts w:cs="Calibri"/>
+                      <w:sz w:val="22"/>
+                      <w:szCs w:val="22"/>
+                    </w:rPr>
+                    <w:t>nomDestinataire</w:t>
+                  </w:r>
+                  <w:proofErr w:type="spellEnd"/>
+                  <w:r>
+                    <w:rPr>
+                      <w:rFonts w:cs="Calibri"/>
+                      <w:sz w:val="22"/>
+                      <w:szCs w:val="22"/>
+                    </w:rPr>
+                    <w:t>}{</w:t>
+                  </w:r>
+                  <w:proofErr w:type="spellStart"/>
+                  <w:proofErr w:type="gramEnd"/>
+                  <w:r>
+                    <w:rPr>
+                      <w:rFonts w:cs="Calibri"/>
+                      <w:sz w:val="22"/>
+                      <w:szCs w:val="22"/>
+                    </w:rPr>
+                    <w:t>civiliteDestinataire</w:t>
+                  </w:r>
+                  <w:proofErr w:type="spellEnd"/>
+                  <w:r>
+                    <w:rPr>
+                      <w:rFonts w:cs="Calibri"/>
+                      <w:sz w:val="22"/>
+                      <w:szCs w:val="22"/>
+                    </w:rPr>
+                    <w:t>} {</w:t>
+                  </w:r>
+                  <w:proofErr w:type="spellStart"/>
+                  <w:r>
+                    <w:rPr>
+                      <w:rFonts w:cs="Calibri"/>
+                      <w:sz w:val="22"/>
+                      <w:szCs w:val="22"/>
+                    </w:rPr>
+                    <w:t>nomDestinataire</w:t>
+                  </w:r>
+                  <w:proofErr w:type="spellEnd"/>
+                  <w:r>
+                    <w:rPr>
+                      <w:rFonts w:cs="Calibri"/>
+                      <w:sz w:val="22"/>
+                      <w:szCs w:val="22"/>
+                    </w:rPr>
+                    <w:t>}{/</w:t>
+                  </w:r>
+                  <w:proofErr w:type="spellStart"/>
+                  <w:r>
+                    <w:rPr>
+                      <w:rFonts w:cs="Calibri"/>
+                      <w:sz w:val="22"/>
+                      <w:szCs w:val="22"/>
+                    </w:rPr>
+                    <w:t>nomDestinataire</w:t>
+                  </w:r>
+                  <w:proofErr w:type="spellEnd"/>
+                  <w:r>
+                    <w:rPr>
+                      <w:rFonts w:cs="Calibri"/>
+                      <w:sz w:val="22"/>
+                      <w:szCs w:val="22"/>
+                    </w:rPr>
+                    <w:t>}</w:t>
+                  </w:r>
+                  <w:r>
+                    <w:rPr>
+                      <w:rFonts w:cs="Calibri"/>
+                      <w:sz w:val="22"/>
+                      <w:szCs w:val="22"/>
+                    </w:rPr>
+                    <w:t>,</w:t>
+                  </w:r>
+                </w:p>
+                <w:p>
+                  <w:pPr>
+                    <w:rPr>
+                      <w:rFonts w:cs="Calibri"/>
+                      <w:sz w:val="22"/>
+                      <w:szCs w:val="22"/>
+                    </w:rPr>
+                  </w:pPr>
+                </w:p>
+                <w:p>
+                  <w:pPr>
+                    <w:rPr>
+                      <w:rFonts w:ascii="Aptos" w:hAnsi="Aptos"/>
+                      <w:sz w:val="22"/>
+                      <w:szCs w:val="22"/>
+                    </w:rPr>
+                  </w:pPr>
+                  <w:r>
+                    <w:rPr>
+                      <w:rFonts w:cs="Calibri"/>
+                      <w:sz w:val="22"/>
+                      <w:szCs w:val="22"/>
+                    </w:rPr>
+                    <w:t>{</w:t>
+                  </w:r>
+                  <w:proofErr w:type="spellStart"/>
+                  <w:proofErr w:type="gramStart"/>
+                  <w:r>
+                    <w:rPr>
+                      <w:rFonts w:cs="Calibri"/>
+                      <w:sz w:val="22"/>
+                      <w:szCs w:val="22"/>
+                    </w:rPr>
+                    <w:t>texteIa</w:t>
+                  </w:r>
+                  <w:proofErr w:type="spellEnd"/>
+                  <w:proofErr w:type="gramEnd"/>
+                  <w:r>
+                    <w:rPr>
+                      <w:rFonts w:cs="Calibri"/>
+                      <w:sz w:val="22"/>
+                      <w:szCs w:val="22"/>
+                    </w:rPr>
+                    <w:t>}</w:t>
+                  </w:r>
+                </w:p>
+                <w:permEnd w:id="350494471"/>
+              </w:txbxContent>
+            </v:textbox>
+          </v:shape>
+        </w:pict>
+      </w:r>
+      <w:r>
+        <w:rPr>
+          <w:rFonts w:ascii="Aptos" w:hAnsi="Aptos"/>
+          <w:noProof/>
+          <w:sz w:val="22"/>
+          <w:szCs w:val="22"/>
+        </w:rPr>
+        <w:pict w14:anchorId="2F3011E9">
+          <v:shape id="_x0000_s2062" type="#_x0000_t202" style="position:absolute;margin-left:292.1pt;margin-top:128.6pt;width:251.05pt;height:155.6pt;z-index:251656192;visibility:visible;mso-width-relative:margin;mso-height-relative:margin" o:gfxdata="UEsDBBQABgAIAAAAIQC2gziS/gAAAOEBAAATAAAAW0NvbnRlbnRfVHlwZXNdLnhtbJSRQU7DMBBF&#10;90jcwfIWJU67QAgl6YK0S0CoHGBkTxKLZGx5TGhvj5O2G0SRWNoz/78nu9wcxkFMGNg6quQqL6RA&#10;0s5Y6ir5vt9lD1JwBDIwOMJKHpHlpr69KfdHjyxSmriSfYz+USnWPY7AufNIadK6MEJMx9ApD/oD&#10;OlTrorhX2lFEilmcO2RdNtjC5xDF9pCuTyYBB5bi6bQ4syoJ3g9WQ0ymaiLzg5KdCXlKLjvcW893&#10;SUOqXwnz5DrgnHtJTxOsQfEKIT7DmDSUCaxw7Rqn8787ZsmRM9e2VmPeBN4uqYvTtW7jvijg9N/y&#10;JsXecLq0q+WD6m8AAAD//wMAUEsDBBQABgAIAAAAIQA4/SH/1gAAAJQBAAALAAAAX3JlbHMvLnJl&#10;bHOkkMFqwzAMhu+DvYPRfXGawxijTi+j0GvpHsDYimMaW0Yy2fr2M4PBMnrbUb/Q94l/f/hMi1qR&#10;JVI2sOt6UJgd+ZiDgffL8ekFlFSbvV0oo4EbChzGx4f9GRdb25HMsYhqlCwG5lrLq9biZkxWOiqY&#10;22YiTra2kYMu1l1tQD30/bPm3wwYN0x18gb45AdQl1tp5j/sFB2T0FQ7R0nTNEV3j6o9feQzro1i&#10;OWA14Fm+Q8a1a8+Bvu/d/dMb2JY5uiPbhG/ktn4cqGU/er3pcvwCAAD//wMAUEsDBBQABgAIAAAA&#10;IQCVjOgwOwIAAG0EAAAOAAAAZHJzL2Uyb0RvYy54bWysVEtv2zAMvg/YfxB0Xxzn1dSIU2QpMgwI&#10;2gLp0LMiy7EAWdQkJXb260fJebXbaVgOCilSfHwf6dlDWytyENZJ0DlNe31KhOZQSL3L6Y/X1Zcp&#10;Jc4zXTAFWuT0KBx9mH/+NGtMJgZQgSqEJRhEu6wxOa28N1mSOF6JmrkeGKHRWIKtmUfV7pLCsgaj&#10;1yoZ9PuTpAFbGAtcOIe3j52RzmP8shTcP5elE56onGJtPp42nttwJvMZy3aWmUryUxnsH6qomdSY&#10;9BLqkXlG9lb+EaqW3IKD0vc41AmUpeQi9oDdpP0P3WwqZkTsBcFx5gKT+39h+dNhY14s8e1XaJHA&#10;AEhjXObwMvTTlrYO/1gpQTtCeLzAJlpPOF4O0+l0OBxTwtGWDu4nk7sIbHJ9bqzz3wTUJAg5tchL&#10;hIsd1s5jSnQ9u4RsDpQsVlKpqBzdUllyYEghMl9AQ4lizuNlTlfxF6rGEO+eKU2anE6G437MpCHE&#10;6/yURvdrl0Hy7bYlsrhBYAvFEYGx0M2MM3wlsfg1Zn5hFocEscDB9894lAowF5wkSiqwv/52H/yR&#10;O7RS0uDQ5dT93DMrsKHvGlm9T0ejMKVRGY3vBqjYW8v21qL39RIQlBRXzPAoBn+vzmJpoX7D/ViE&#10;rGhimmPunPqzuPTdKuB+cbFYRCecS8P8Wm8MD6EDA4Ga1/aNWXPizyP1T3AeT5Z9oLHzDS81LPYe&#10;Shk5Djh3qJ7gx5mOvJ32LyzNrR69rl+J+W8AAAD//wMAUEsDBBQABgAIAAAAIQDbCZ5r3wAAAAwB&#10;AAAPAAAAZHJzL2Rvd25yZXYueG1sTI9BTwIxEIXvJv6HZky8ScuiFdadJcbEq4mAnMu2bDe20822&#10;wMKvt5zkOHlf3vumWo7esaMZYhcIYToRwAw1QXfUImzWn09zYDEp0soFMghnE2FZ399VqtThRN/m&#10;uEotyyUUS4VgU+pLzmNjjVdxEnpDOduHwauUz6HlelCnXO4dL4SQ3KuO8oJVvfmwpvldHTzCtvWX&#10;7c+0H6z27pm+Luf1JnSIjw/j+xuwZMb0D8NVP6tDnZ124UA6MofwIkWRUYTZQr4CuxJCFjNgOwQp&#10;xAJ4XfHbJ+o/AAAA//8DAFBLAQItABQABgAIAAAAIQC2gziS/gAAAOEBAAATAAAAAAAAAAAAAAAA&#10;AAAAAABbQ29udGVudF9UeXBlc10ueG1sUEsBAi0AFAAGAAgAAAAhADj9If/WAAAAlAEAAAsAAAAA&#10;AAAAAAAAAAAALwEAAF9yZWxzLy5yZWxzUEsBAi0AFAAGAAgAAAAhAJWM6DA7AgAAbQQAAA4AAAAA&#10;AAAAAAAAAAAALgIAAGRycy9lMm9Eb2MueG1sUEsBAi0AFAAGAAgAAAAhANsJnmvfAAAADAEAAA8A&#10;AAAAAAAAAAAAAAAAlQQAAGRycy9kb3ducmV2LnhtbFBLBQYAAAAABAAEAPMAAAChBQAAAAA=&#10;" stroked="f" strokeweight=".5pt">
             <v:textbox style="mso-next-textbox:#_x0000_s2062">
               <w:txbxContent>
                 <w:p>
@@ -627,475 +1068,21 @@
           </v:shape>
         </w:pict>
       </w:r>
-    </w:p>
-    <w:p>
-      <w:pPr>
-        <w:rPr>
-          <w:rFonts w:ascii="Aptos" w:hAnsi="Aptos"/>
-          <w:sz w:val="22"/>
-          <w:szCs w:val="22"/>
-        </w:rPr>
-      </w:pPr>
-    </w:p>
-    <w:p>
-      <w:pPr>
-        <w:rPr>
-          <w:rFonts w:ascii="Aptos" w:hAnsi="Aptos"/>
-          <w:sz w:val="22"/>
-          <w:szCs w:val="22"/>
-        </w:rPr>
-      </w:pPr>
-      <w:r>
-        <w:rPr>
-          <w:rFonts w:ascii="Aptos" w:hAnsi="Aptos"/>
-          <w:noProof/>
-          <w:sz w:val="22"/>
-          <w:szCs w:val="22"/>
-        </w:rPr>
-        <w:pict w14:anchorId="622BEB30">
-          <v:shape id="_x0000_s2063" type="#_x0000_t202" style="position:absolute;margin-left:292.45pt;margin-top:5.9pt;width:251.05pt;height:24.75pt;z-index:251657216;visibility:visible" o:gfxdata="UEsDBBQABgAIAAAAIQC2gziS/gAAAOEBAAATAAAAW0NvbnRlbnRfVHlwZXNdLnhtbJSRQU7DMBBF&#10;90jcwfIWJU67QAgl6YK0S0CoHGBkTxKLZGx5TGhvj5O2G0SRWNoz/78nu9wcxkFMGNg6quQqL6RA&#10;0s5Y6ir5vt9lD1JwBDIwOMJKHpHlpr69KfdHjyxSmriSfYz+USnWPY7AufNIadK6MEJMx9ApD/oD&#10;OlTrorhX2lFEilmcO2RdNtjC5xDF9pCuTyYBB5bi6bQ4syoJ3g9WQ0ymaiLzg5KdCXlKLjvcW893&#10;SUOqXwnz5DrgnHtJTxOsQfEKIT7DmDSUCaxw7Rqn8787ZsmRM9e2VmPeBN4uqYvTtW7jvijg9N/y&#10;JsXecLq0q+WD6m8AAAD//wMAUEsDBBQABgAIAAAAIQA4/SH/1gAAAJQBAAALAAAAX3JlbHMvLnJl&#10;bHOkkMFqwzAMhu+DvYPRfXGawxijTi+j0GvpHsDYimMaW0Yy2fr2M4PBMnrbUb/Q94l/f/hMi1qR&#10;JVI2sOt6UJgd+ZiDgffL8ekFlFSbvV0oo4EbChzGx4f9GRdb25HMsYhqlCwG5lrLq9biZkxWOiqY&#10;22YiTra2kYMu1l1tQD30/bPm3wwYN0x18gb45AdQl1tp5j/sFB2T0FQ7R0nTNEV3j6o9feQzro1i&#10;OWA14Fm+Q8a1a8+Bvu/d/dMb2JY5uiPbhG/ktn4cqGU/er3pcvwCAAD//wMAUEsDBBQABgAIAAAA&#10;IQD/hAE2+AEAANEDAAAOAAAAZHJzL2Uyb0RvYy54bWysU9uO0zAQfUfiHyy/0zS9QImarpauipCW&#10;i7TwAY7jJBaOx4zdJuXrGTvd7gJviDxYHo99Zs6Zk+3N2Bt2Uug12JLnszlnykqotW1L/u3r4dWG&#10;Mx+ErYUBq0p+Vp7f7F6+2A6uUAvowNQKGYFYXwyu5F0IrsgyLzvVCz8DpywlG8BeBAqxzWoUA6H3&#10;JlvM56+zAbB2CFJ5T6d3U5LvEn7TKBk+N41XgZmSU28hrZjWKq7ZbiuKFoXrtLy0If6hi15oS0Wv&#10;UHciCHZE/RdUryWChybMJPQZNI2WKnEgNvn8DzYPnXAqcSFxvLvK5P8frPx0enBfkIXxHYw0wETC&#10;u3uQ3z2zsO+EbdUtIgydEjUVzqNk2eB8cXkapfaFjyDV8BFqGrI4BkhAY4N9VIV4MkKnAZyvoqsx&#10;MEmHy3yzWS7XnEnKLfPVcrFOJUTx+NqhD+8V9CxuSo401IQuTvc+xG5E8XglFvNgdH3QxqQA22pv&#10;kJ0EGeCQvgv6b9eMjZctxGcTYjxJNCOziWMYq5HpuuSLCBFZV1CfiTfC5Cv6D2jTAf7kbCBPldz/&#10;OApUnJkPlrR7m69W0YQpWK3fLCjA55nqeUZYSVAlD5xN232YjHt0qNuOKk3TsnBLejc6SfHU1aV9&#10;8k1S6OLxaMzncbr19CfufgEAAP//AwBQSwMEFAAGAAgAAAAhAFBhpLvgAAAADAEAAA8AAABkcnMv&#10;ZG93bnJldi54bWxMj0FOwzAQRfdI3MEaJDaI2rSp06RxKkACsW3pASaxm0TE4yh2m/T2uCtYzszT&#10;n/eL3Wx7djGj7xwpeFkIYIZqpztqFBy/P543wHxA0tg7MgquxsOuvL8rMNduor25HELDYgj5HBW0&#10;IQw5575ujUW/cIOheDu50WKI49hwPeIUw23Pl0JIbrGj+KHFwby3pv45nK2C09f0tM6m6jMc030i&#10;37BLK3dV6vFhft0CC2YOfzDc9KM6lNGpcmfSnvUK1lJkEVUgl0kC7EYIuYr1qrhKVxnwsuD/S5S/&#10;AAAA//8DAFBLAQItABQABgAIAAAAIQC2gziS/gAAAOEBAAATAAAAAAAAAAAAAAAAAAAAAABbQ29u&#10;dGVudF9UeXBlc10ueG1sUEsBAi0AFAAGAAgAAAAhADj9If/WAAAAlAEAAAsAAAAAAAAAAAAAAAAA&#10;LwEAAF9yZWxzLy5yZWxzUEsBAi0AFAAGAAgAAAAhAP+EATb4AQAA0QMAAA4AAAAAAAAAAAAAAAAA&#10;LgIAAGRycy9lMm9Eb2MueG1sUEsBAi0AFAAGAAgAAAAhAFBhpLvgAAAADAEAAA8AAAAAAAAAAAAA&#10;AAAAUgQAAGRycy9kb3ducmV2LnhtbFBLBQYAAAAABAAEAPMAAABfBQAAAAA=&#10;" stroked="f">
-            <v:textbox style="mso-next-textbox:#_x0000_s2063">
-              <w:txbxContent>
-                <w:p>
-                  <w:pPr>
-                    <w:rPr>
-                      <w:rFonts w:ascii="Aptos" w:hAnsi="Aptos"/>
-                      <w:sz w:val="22"/>
-                      <w:szCs w:val="22"/>
-                    </w:rPr>
-                  </w:pPr>
-                  <w:r>
-                    <w:rPr>
-                      <w:rFonts w:ascii="Aptos" w:hAnsi="Aptos"/>
-                      <w:sz w:val="22"/>
-                      <w:szCs w:val="22"/>
-                    </w:rPr>
-                    <w:t xml:space="preserve">Paris, le </w:t>
-                  </w:r>
-                  <w:r>
-                    <w:rPr>
-                      <w:rFonts w:ascii="Aptos" w:hAnsi="Aptos"/>
-                      <w:sz w:val="22"/>
-                      <w:szCs w:val="22"/>
-                    </w:rPr>
-                    <w:fldChar w:fldCharType="begin"/>
-                  </w:r>
-                  <w:r>
-                    <w:rPr>
-                      <w:rFonts w:ascii="Aptos" w:hAnsi="Aptos"/>
-                      <w:sz w:val="22"/>
-                      <w:szCs w:val="22"/>
-                    </w:rPr>
-                    <w:instrText xml:space="preserve"> TIME \@ "d MMMM yyyy" </w:instrText>
-                  </w:r>
-                  <w:r>
-                    <w:rPr>
-                      <w:rFonts w:ascii="Aptos" w:hAnsi="Aptos"/>
-                      <w:sz w:val="22"/>
-                      <w:szCs w:val="22"/>
-                    </w:rPr>
-                    <w:fldChar w:fldCharType="separate"/>
-                  </w:r>
-                  <w:r>
-                    <w:rPr>
-                      <w:rFonts w:ascii="Aptos" w:hAnsi="Aptos"/>
-                      <w:noProof/>
-                      <w:sz w:val="22"/>
-                      <w:szCs w:val="22"/>
-                    </w:rPr>
-                    <w:t>5 décembre 2025</w:t>
-                  </w:r>
-                  <w:r>
-                    <w:rPr>
-                      <w:rFonts w:ascii="Aptos" w:hAnsi="Aptos"/>
-                      <w:sz w:val="22"/>
-                      <w:szCs w:val="22"/>
-                    </w:rPr>
-                    <w:fldChar w:fldCharType="end"/>
-                  </w:r>
-                </w:p>
-              </w:txbxContent>
-            </v:textbox>
-          </v:shape>
-        </w:pict>
-      </w:r>
-    </w:p>
-    <w:p>
-      <w:pPr>
-        <w:rPr>
-          <w:rFonts w:ascii="Aptos" w:hAnsi="Aptos"/>
-          <w:sz w:val="22"/>
-          <w:szCs w:val="22"/>
-        </w:rPr>
-      </w:pPr>
-    </w:p>
-    <w:p>
-      <w:pPr>
-        <w:tabs>
-          <w:tab w:val="left" w:pos="7985"/>
-        </w:tabs>
-        <w:rPr>
-          <w:rFonts w:ascii="Aptos" w:hAnsi="Aptos"/>
-          <w:sz w:val="22"/>
-          <w:szCs w:val="22"/>
-        </w:rPr>
-      </w:pPr>
-    </w:p>
-    <w:p>
-      <w:pPr>
-        <w:rPr>
-          <w:rFonts w:ascii="Aptos" w:hAnsi="Aptos"/>
-          <w:sz w:val="22"/>
-          <w:szCs w:val="22"/>
-        </w:rPr>
-      </w:pPr>
-    </w:p>
-    <w:p>
-      <w:pPr>
-        <w:tabs>
-          <w:tab w:val="left" w:pos="954"/>
-        </w:tabs>
-        <w:rPr>
-          <w:rFonts w:ascii="Aptos" w:hAnsi="Aptos"/>
-          <w:sz w:val="22"/>
-          <w:szCs w:val="22"/>
-        </w:rPr>
-      </w:pPr>
-    </w:p>
-    <w:p>
-      <w:pPr>
-        <w:ind w:left="1134" w:right="1134"/>
-        <w:rPr>
-          <w:rFonts w:cs="Calibri"/>
-          <w:sz w:val="22"/>
-          <w:szCs w:val="22"/>
-        </w:rPr>
-      </w:pPr>
-      <w:permStart w:id="1647476519" w:edGrp="everyone"/>
-      <w:r>
-        <w:rPr>
-          <w:rFonts w:cs="Calibri"/>
-          <w:sz w:val="22"/>
-          <w:szCs w:val="22"/>
-        </w:rPr>
-        <w:t>{</w:t>
-      </w:r>
-      <w:proofErr w:type="spellStart"/>
-      <w:proofErr w:type="gramStart"/>
-      <w:r>
-        <w:rPr>
-          <w:rFonts w:cs="Calibri"/>
-          <w:sz w:val="22"/>
-          <w:szCs w:val="22"/>
-        </w:rPr>
-        <w:t>codeDocument</w:t>
-      </w:r>
-      <w:proofErr w:type="spellEnd"/>
-      <w:proofErr w:type="gramEnd"/>
-      <w:r>
-        <w:rPr>
-          <w:rFonts w:cs="Calibri"/>
-          <w:sz w:val="22"/>
-          <w:szCs w:val="22"/>
-        </w:rPr>
-        <w:t>}</w:t>
-      </w:r>
-    </w:p>
-    <w:p>
-      <w:pPr>
-        <w:ind w:left="1134" w:right="1134"/>
-        <w:rPr>
-          <w:rFonts w:cs="Calibri"/>
-          <w:sz w:val="22"/>
-          <w:szCs w:val="22"/>
-        </w:rPr>
-      </w:pPr>
-    </w:p>
-    <w:p>
-      <w:pPr>
-        <w:ind w:left="1134" w:right="1134"/>
-        <w:rPr>
-          <w:rFonts w:cs="Calibri"/>
-          <w:b/>
-          <w:bCs/>
-          <w:sz w:val="22"/>
-          <w:szCs w:val="22"/>
-        </w:rPr>
-      </w:pPr>
-      <w:r>
-        <w:rPr>
-          <w:rFonts w:cs="Calibri"/>
-          <w:b/>
-          <w:bCs/>
-          <w:sz w:val="22"/>
-          <w:szCs w:val="22"/>
-        </w:rPr>
-        <w:t>Objet : {objet}</w:t>
-      </w:r>
-    </w:p>
-    <w:p>
-      <w:pPr>
-        <w:ind w:left="1134" w:right="1134"/>
-        <w:rPr>
-          <w:rFonts w:cs="Calibri"/>
-          <w:sz w:val="22"/>
-          <w:szCs w:val="22"/>
-        </w:rPr>
-      </w:pPr>
-    </w:p>
-    <w:p>
-      <w:pPr>
-        <w:ind w:left="1134" w:right="1134"/>
-        <w:rPr>
-          <w:rFonts w:cs="Calibri"/>
-          <w:sz w:val="22"/>
-          <w:szCs w:val="22"/>
-        </w:rPr>
-      </w:pPr>
-    </w:p>
-    <w:p>
-      <w:pPr>
-        <w:ind w:left="1134" w:right="1134"/>
-        <w:rPr>
-          <w:rFonts w:cs="Calibri"/>
-          <w:sz w:val="22"/>
-          <w:szCs w:val="22"/>
-        </w:rPr>
-      </w:pPr>
-      <w:r>
-        <w:rPr>
-          <w:rFonts w:cs="Calibri"/>
-          <w:sz w:val="22"/>
-          <w:szCs w:val="22"/>
-        </w:rPr>
-        <w:t>{-</w:t>
-      </w:r>
-      <w:proofErr w:type="spellStart"/>
-      <w:proofErr w:type="gramStart"/>
-      <w:r>
-        <w:rPr>
-          <w:rFonts w:cs="Calibri"/>
-          <w:sz w:val="22"/>
-          <w:szCs w:val="22"/>
-        </w:rPr>
-        <w:t>w:p</w:t>
-      </w:r>
-      <w:proofErr w:type="spellEnd"/>
-      <w:proofErr w:type="gramEnd"/>
-      <w:r>
-        <w:rPr>
-          <w:rFonts w:cs="Calibri"/>
-          <w:sz w:val="22"/>
-          <w:szCs w:val="22"/>
-        </w:rPr>
-        <w:t xml:space="preserve"> </w:t>
-      </w:r>
-      <w:proofErr w:type="spellStart"/>
-      <w:proofErr w:type="gramStart"/>
-      <w:r>
-        <w:rPr>
-          <w:rFonts w:cs="Calibri"/>
-          <w:sz w:val="22"/>
-          <w:szCs w:val="22"/>
-        </w:rPr>
-        <w:t>nomDestinataire</w:t>
-      </w:r>
-      <w:proofErr w:type="spellEnd"/>
-      <w:r>
-        <w:rPr>
-          <w:rFonts w:cs="Calibri"/>
-          <w:sz w:val="22"/>
-          <w:szCs w:val="22"/>
-        </w:rPr>
-        <w:t>}{</w:t>
-      </w:r>
-      <w:proofErr w:type="spellStart"/>
-      <w:proofErr w:type="gramEnd"/>
-      <w:r>
-        <w:rPr>
-          <w:rFonts w:cs="Calibri"/>
-          <w:sz w:val="22"/>
-          <w:szCs w:val="22"/>
-        </w:rPr>
-        <w:t>civiliteDestinataire</w:t>
-      </w:r>
-      <w:proofErr w:type="spellEnd"/>
-      <w:r>
-        <w:rPr>
-          <w:rFonts w:cs="Calibri"/>
-          <w:sz w:val="22"/>
-          <w:szCs w:val="22"/>
-        </w:rPr>
-        <w:t>} {</w:t>
-      </w:r>
-      <w:proofErr w:type="spellStart"/>
-      <w:r>
-        <w:rPr>
-          <w:rFonts w:cs="Calibri"/>
-          <w:sz w:val="22"/>
-          <w:szCs w:val="22"/>
-        </w:rPr>
-        <w:t>nomDestinataire</w:t>
-      </w:r>
-      <w:proofErr w:type="spellEnd"/>
-      <w:r>
-        <w:rPr>
-          <w:rFonts w:cs="Calibri"/>
-          <w:sz w:val="22"/>
-          <w:szCs w:val="22"/>
-        </w:rPr>
-        <w:t>}{/</w:t>
-      </w:r>
-      <w:proofErr w:type="spellStart"/>
-      <w:r>
-        <w:rPr>
-          <w:rFonts w:cs="Calibri"/>
-          <w:sz w:val="22"/>
-          <w:szCs w:val="22"/>
-        </w:rPr>
-        <w:t>nomDestinataire</w:t>
-      </w:r>
-      <w:proofErr w:type="spellEnd"/>
-      <w:r>
-        <w:rPr>
-          <w:rFonts w:cs="Calibri"/>
-          <w:sz w:val="22"/>
-          <w:szCs w:val="22"/>
-        </w:rPr>
-        <w:t>}</w:t>
-      </w:r>
-      <w:r>
-        <w:rPr>
-          <w:rFonts w:cs="Calibri"/>
-          <w:sz w:val="22"/>
-          <w:szCs w:val="22"/>
-        </w:rPr>
-        <w:t>,</w:t>
-      </w:r>
-    </w:p>
-    <w:p>
-      <w:pPr>
-        <w:ind w:left="1134" w:right="1134"/>
-        <w:rPr>
-          <w:rFonts w:cs="Calibri"/>
-          <w:sz w:val="22"/>
-          <w:szCs w:val="22"/>
-        </w:rPr>
-      </w:pPr>
-    </w:p>
-    <w:p>
-      <w:pPr>
-        <w:ind w:left="1134" w:right="1134"/>
-        <w:rPr>
-          <w:rFonts w:cs="Calibri"/>
-          <w:sz w:val="22"/>
-          <w:szCs w:val="22"/>
-        </w:rPr>
-      </w:pPr>
-      <w:r>
-        <w:rPr>
-          <w:rFonts w:cs="Calibri"/>
-          <w:sz w:val="22"/>
-          <w:szCs w:val="22"/>
-        </w:rPr>
-        <w:t>{</w:t>
-      </w:r>
-      <w:proofErr w:type="spellStart"/>
-      <w:proofErr w:type="gramStart"/>
-      <w:r>
-        <w:rPr>
-          <w:rFonts w:cs="Calibri"/>
-          <w:sz w:val="22"/>
-          <w:szCs w:val="22"/>
-        </w:rPr>
-        <w:t>texteIa</w:t>
-      </w:r>
-      <w:proofErr w:type="spellEnd"/>
-      <w:proofErr w:type="gramEnd"/>
-      <w:r>
-        <w:rPr>
-          <w:rFonts w:cs="Calibri"/>
-          <w:sz w:val="22"/>
-          <w:szCs w:val="22"/>
-        </w:rPr>
-        <w:t>}</w:t>
-      </w:r>
-    </w:p>
-    <w:p>
-      <w:pPr>
-        <w:spacing w:before="1800"/>
-        <w:ind w:left="1134" w:right="1134"/>
-        <w:jc w:val="right"/>
-        <w:rPr>
-          <w:rFonts w:ascii="Aptos" w:hAnsi="Aptos"/>
-          <w:sz w:val="22"/>
-          <w:szCs w:val="22"/>
-        </w:rPr>
-      </w:pPr>
       <w:r>
         <w:rPr>
           <w:rFonts w:ascii="Aptos" w:hAnsi="Aptos"/>
           <w:sz w:val="22"/>
           <w:szCs w:val="22"/>
         </w:rPr>
-        <w:t>{</w:t>
-      </w:r>
-      <w:proofErr w:type="spellStart"/>
-      <w:proofErr w:type="gramStart"/>
-      <w:r>
-        <w:rPr>
-          <w:rFonts w:ascii="Aptos" w:hAnsi="Aptos"/>
-          <w:sz w:val="22"/>
-          <w:szCs w:val="22"/>
-        </w:rPr>
-        <w:t>signature</w:t>
-      </w:r>
-      <w:r>
-        <w:rPr>
-          <w:rFonts w:ascii="Aptos" w:hAnsi="Aptos"/>
-          <w:sz w:val="22"/>
-          <w:szCs w:val="22"/>
-        </w:rPr>
-        <w:t>Exp</w:t>
-      </w:r>
-      <w:proofErr w:type="spellEnd"/>
-      <w:proofErr w:type="gramEnd"/>
-      <w:r>
-        <w:rPr>
-          <w:rFonts w:ascii="Aptos" w:hAnsi="Aptos"/>
-          <w:sz w:val="22"/>
-          <w:szCs w:val="22"/>
-        </w:rPr>
-        <w:t>}</w:t>
+        <w:tab/>
       </w:r>
     </w:p>
-    <w:p>
-      <w:pPr>
-        <w:ind w:left="1134" w:right="1134"/>
-        <w:jc w:val="right"/>
-        <w:rPr>
-          <w:rFonts w:ascii="Aptos" w:hAnsi="Aptos"/>
-          <w:sz w:val="22"/>
-          <w:szCs w:val="22"/>
-        </w:rPr>
-      </w:pPr>
-      <w:r>
-        <w:rPr>
-          <w:rFonts w:ascii="Aptos" w:hAnsi="Aptos"/>
-          <w:sz w:val="22"/>
-          <w:szCs w:val="22"/>
-        </w:rPr>
-        <w:t>Secrétaire Fédéral</w:t>
-      </w:r>
-      <w:permEnd w:id="1647476519"/>
-    </w:p>
     <w:sectPr>
-      <w:headerReference w:type="first" r:id="rId8"/>
-      <w:footerReference w:type="first" r:id="rId9"/>
+      <w:headerReference w:type="default" r:id="rId8"/>
+      <w:footerReference w:type="default" r:id="rId9"/>
       <w:pgSz w:w="11900" w:h="16840"/>
-      <w:pgMar w:top="17" w:right="0" w:bottom="24" w:left="0" w:header="5669" w:footer="708" w:gutter="0"/>
+      <w:pgMar w:top="17" w:right="0" w:bottom="24" w:left="0" w:header="708" w:footer="708" w:gutter="0"/>
       <w:cols w:space="708"/>
-      <w:titlePg/>
       <w:docGrid w:linePitch="360"/>
     </w:sectPr>
   </w:body>
@@ -1132,7 +1119,7 @@
         <w:noProof/>
       </w:rPr>
       <w:pict w14:anchorId="1D1540E1">
-        <v:rect id="_x0000_s1035" style="position:absolute;margin-left:-1.35pt;margin-top:.9pt;width:594.9pt;height:44.3pt;z-index:251660288" stroked="f">
+        <v:rect id="_x0000_s1027" style="position:absolute;margin-left:-1.35pt;margin-top:.9pt;width:594.9pt;height:44.3pt;z-index:251657216" stroked="f">
           <v:fill r:id="rId1" o:title="logo FO pied" recolor="t" type="frame"/>
         </v:rect>
       </w:pict>
@@ -1171,7 +1158,7 @@
         <w:noProof/>
       </w:rPr>
       <w:pict w14:anchorId="6ABAD89F">
-        <v:rect id="_x0000_s1040" style="position:absolute;margin-left:19.35pt;margin-top:-202.5pt;width:141.25pt;height:205.15pt;z-index:251662336" stroked="f">
+        <v:rect id="_x0000_s1028" style="position:absolute;margin-left:19.35pt;margin-top:45.55pt;width:141.25pt;height:205.15pt;z-index:251658240" stroked="f">
           <v:fill r:id="rId1" o:title="logo FO" recolor="t" type="frame"/>
         </v:rect>
       </w:pict>
@@ -1572,7 +1559,7 @@
   <w:style w:type="paragraph" w:default="1" w:styleId="Normal">
     <w:name w:val="Normal"/>
     <w:qFormat/>
-    <w:rsid w:val="00F73CC8"/>
+    <w:rsid w:val="00B5606E"/>
     <w:rPr>
       <w:sz w:val="24"/>
       <w:szCs w:val="24"/>

</xml_diff>

<commit_message>
Push all code to GitHub repository
</commit_message>
<xml_diff>
--- a/templates/word/template_custom.docx
+++ b/templates/word/template_custom.docx
@@ -195,7 +195,7 @@
           <w:szCs w:val="22"/>
         </w:rPr>
         <w:pict w14:anchorId="49EA7E95">
-          <v:shape id="_x0000_s2066" type="#_x0000_t202" style="position:absolute;margin-left:81.5pt;margin-top:353.95pt;width:462pt;height:276.4pt;z-index:251658240;visibility:visible" o:gfxdata="UEsDBBQABgAIAAAAIQC2gziS/gAAAOEBAAATAAAAW0NvbnRlbnRfVHlwZXNdLnhtbJSRQU7DMBBF&#10;90jcwfIWJU67QAgl6YK0S0CoHGBkTxKLZGx5TGhvj5O2G0SRWNoz/78nu9wcxkFMGNg6quQqL6RA&#10;0s5Y6ir5vt9lD1JwBDIwOMJKHpHlpr69KfdHjyxSmriSfYz+USnWPY7AufNIadK6MEJMx9ApD/oD&#10;OlTrorhX2lFEilmcO2RdNtjC5xDF9pCuTyYBB5bi6bQ4syoJ3g9WQ0ymaiLzg5KdCXlKLjvcW893&#10;SUOqXwnz5DrgnHtJTxOsQfEKIT7DmDSUCaxw7Rqn8787ZsmRM9e2VmPeBN4uqYvTtW7jvijg9N/y&#10;JsXecLq0q+WD6m8AAAD//wMAUEsDBBQABgAIAAAAIQA4/SH/1gAAAJQBAAALAAAAX3JlbHMvLnJl&#10;bHOkkMFqwzAMhu+DvYPRfXGawxijTi+j0GvpHsDYimMaW0Yy2fr2M4PBMnrbUb/Q94l/f/hMi1qR&#10;JVI2sOt6UJgd+ZiDgffL8ekFlFSbvV0oo4EbChzGx4f9GRdb25HMsYhqlCwG5lrLq9biZkxWOiqY&#10;22YiTra2kYMu1l1tQD30/bPm3wwYN0x18gb45AdQl1tp5j/sFB2T0FQ7R0nTNEV3j6o9feQzro1i&#10;OWA14Fm+Q8a1a8+Bvu/d/dMb2JY5uiPbhG/ktn4cqGU/er3pcvwCAAD//wMAUEsDBBQABgAIAAAA&#10;IQA6P0Ik+AEAANIDAAAOAAAAZHJzL2Uyb0RvYy54bWysU8GO0zAQvSPxD5bvNGlpu0vUdLV0VYS0&#10;LEgLH+A4TmLheMzYbbJ8PWOn2y1wQ+RgeTz2m3lvXjY3Y2/YUaHXYEs+n+WcKSuh1rYt+bev+zfX&#10;nPkgbC0MWFXyJ+X5zfb1q83gCrWADkytkBGI9cXgSt6F4Ios87JTvfAzcMpSsgHsRaAQ26xGMRB6&#10;b7JFnq+zAbB2CFJ5T6d3U5JvE37TKBk+N41XgZmSU28hrZjWKq7ZdiOKFoXrtDy1If6hi15oS0XP&#10;UHciCHZA/RdUryWChybMJPQZNI2WKnEgNvP8DzaPnXAqcSFxvDvL5P8frHw4ProvyML4HkYaYCLh&#10;3T3I755Z2HXCtuoWEYZOiZoKz6Nk2eB8cXoapfaFjyDV8AlqGrI4BEhAY4N9VIV4MkKnATydRVdj&#10;YJIOV9frq2VOKUm5t+v5Kl+tUg1RPD936MMHBT2Lm5IjTTXBi+O9D7EdUTxfidU8GF3vtTEpwLba&#10;GWRHQQ7Yp++E/ts1Y+NlC/HZhBhPEs9IbSIZxmpkuqY2I0SkXUH9RMQRJmPRj0CbDvAnZwOZquT+&#10;x0Gg4sx8tCTeu/lyGV2YguXqakEBXmaqy4ywkqBKHjibtrswOffgULcdVZrGZeGWBG90kuKlq1P7&#10;ZJyk0Mnk0ZmXcbr18itufwEAAP//AwBQSwMEFAAGAAgAAAAhAHuoWjzfAAAADQEAAA8AAABkcnMv&#10;ZG93bnJldi54bWxMj8FOwzAQRO9I/IO1SFwQtSHgkDROBUigXlv6AU68TaLGdhS7Tfr3bE5wnJ3R&#10;7JtiM9ueXXAMnXcKnlYCGLram841Cg4/X49vwELUzujeO1RwxQCb8vam0Lnxk9vhZR8bRiUu5FpB&#10;G+OQcx7qFq0OKz+gI+/oR6sjybHhZtQTlduePwshudWdow+tHvCzxfq0P1sFx+308JpN1Xc8pLsX&#10;+aG7tPJXpe7v5vc1sIhz/AvDgk/oUBJT5c/OBNaTTjLaEhWkSSqBLQkhEzpViydkBrws+P8V5S8A&#10;AAD//wMAUEsBAi0AFAAGAAgAAAAhALaDOJL+AAAA4QEAABMAAAAAAAAAAAAAAAAAAAAAAFtDb250&#10;ZW50X1R5cGVzXS54bWxQSwECLQAUAAYACAAAACEAOP0h/9YAAACUAQAACwAAAAAAAAAAAAAAAAAv&#10;AQAAX3JlbHMvLnJlbHNQSwECLQAUAAYACAAAACEAOj9CJPgBAADSAwAADgAAAAAAAAAAAAAAAAAu&#10;AgAAZHJzL2Uyb0RvYy54bWxQSwECLQAUAAYACAAAACEAe6haPN8AAAANAQAADwAAAAAAAAAAAAAA&#10;AABSBAAAZHJzL2Rvd25yZXYueG1sUEsFBgAAAAAEAAQA8wAAAF4FAAAAAA==&#10;" stroked="f">
+          <v:shape id="_x0000_s2066" type="#_x0000_t202" style="position:absolute;margin-left:81.5pt;margin-top:353.95pt;width:462pt;height:289.2pt;z-index:251658240;visibility:visible" o:gfxdata="UEsDBBQABgAIAAAAIQC2gziS/gAAAOEBAAATAAAAW0NvbnRlbnRfVHlwZXNdLnhtbJSRQU7DMBBF&#10;90jcwfIWJU67QAgl6YK0S0CoHGBkTxKLZGx5TGhvj5O2G0SRWNoz/78nu9wcxkFMGNg6quQqL6RA&#10;0s5Y6ir5vt9lD1JwBDIwOMJKHpHlpr69KfdHjyxSmriSfYz+USnWPY7AufNIadK6MEJMx9ApD/oD&#10;OlTrorhX2lFEilmcO2RdNtjC5xDF9pCuTyYBB5bi6bQ4syoJ3g9WQ0ymaiLzg5KdCXlKLjvcW893&#10;SUOqXwnz5DrgnHtJTxOsQfEKIT7DmDSUCaxw7Rqn8787ZsmRM9e2VmPeBN4uqYvTtW7jvijg9N/y&#10;JsXecLq0q+WD6m8AAAD//wMAUEsDBBQABgAIAAAAIQA4/SH/1gAAAJQBAAALAAAAX3JlbHMvLnJl&#10;bHOkkMFqwzAMhu+DvYPRfXGawxijTi+j0GvpHsDYimMaW0Yy2fr2M4PBMnrbUb/Q94l/f/hMi1qR&#10;JVI2sOt6UJgd+ZiDgffL8ekFlFSbvV0oo4EbChzGx4f9GRdb25HMsYhqlCwG5lrLq9biZkxWOiqY&#10;22YiTra2kYMu1l1tQD30/bPm3wwYN0x18gb45AdQl1tp5j/sFB2T0FQ7R0nTNEV3j6o9feQzro1i&#10;OWA14Fm+Q8a1a8+Bvu/d/dMb2JY5uiPbhG/ktn4cqGU/er3pcvwCAAD//wMAUEsDBBQABgAIAAAA&#10;IQA6P0Ik+AEAANIDAAAOAAAAZHJzL2Uyb0RvYy54bWysU8GO0zAQvSPxD5bvNGlpu0vUdLV0VYS0&#10;LEgLH+A4TmLheMzYbbJ8PWOn2y1wQ+RgeTz2m3lvXjY3Y2/YUaHXYEs+n+WcKSuh1rYt+bev+zfX&#10;nPkgbC0MWFXyJ+X5zfb1q83gCrWADkytkBGI9cXgSt6F4Ios87JTvfAzcMpSsgHsRaAQ26xGMRB6&#10;b7JFnq+zAbB2CFJ5T6d3U5JvE37TKBk+N41XgZmSU28hrZjWKq7ZdiOKFoXrtDy1If6hi15oS0XP&#10;UHciCHZA/RdUryWChybMJPQZNI2WKnEgNvP8DzaPnXAqcSFxvDvL5P8frHw4ProvyML4HkYaYCLh&#10;3T3I755Z2HXCtuoWEYZOiZoKz6Nk2eB8cXoapfaFjyDV8AlqGrI4BEhAY4N9VIV4MkKnATydRVdj&#10;YJIOV9frq2VOKUm5t+v5Kl+tUg1RPD936MMHBT2Lm5IjTTXBi+O9D7EdUTxfidU8GF3vtTEpwLba&#10;GWRHQQ7Yp++E/ts1Y+NlC/HZhBhPEs9IbSIZxmpkuqY2I0SkXUH9RMQRJmPRj0CbDvAnZwOZquT+&#10;x0Gg4sx8tCTeu/lyGV2YguXqakEBXmaqy4ywkqBKHjibtrswOffgULcdVZrGZeGWBG90kuKlq1P7&#10;ZJyk0Mnk0ZmXcbr18itufwEAAP//AwBQSwMEFAAGAAgAAAAhAHuoWjzfAAAADQEAAA8AAABkcnMv&#10;ZG93bnJldi54bWxMj8FOwzAQRO9I/IO1SFwQtSHgkDROBUigXlv6AU68TaLGdhS7Tfr3bE5wnJ3R&#10;7JtiM9ueXXAMnXcKnlYCGLram841Cg4/X49vwELUzujeO1RwxQCb8vam0Lnxk9vhZR8bRiUu5FpB&#10;G+OQcx7qFq0OKz+gI+/oR6sjybHhZtQTlduePwshudWdow+tHvCzxfq0P1sFx+308JpN1Xc8pLsX&#10;+aG7tPJXpe7v5vc1sIhz/AvDgk/oUBJT5c/OBNaTTjLaEhWkSSqBLQkhEzpViydkBrws+P8V5S8A&#10;AAD//wMAUEsBAi0AFAAGAAgAAAAhALaDOJL+AAAA4QEAABMAAAAAAAAAAAAAAAAAAAAAAFtDb250&#10;ZW50X1R5cGVzXS54bWxQSwECLQAUAAYACAAAACEAOP0h/9YAAACUAQAACwAAAAAAAAAAAAAAAAAv&#10;AQAAX3JlbHMvLnJlbHNQSwECLQAUAAYACAAAACEAOj9CJPgBAADSAwAADgAAAAAAAAAAAAAAAAAu&#10;AgAAZHJzL2Uyb0RvYy54bWxQSwECLQAUAAYACAAAACEAe6haPN8AAAANAQAADwAAAAAAAAAAAAAA&#10;AABSBAAAZHJzL2Rvd25yZXYueG1sUEsFBgAAAAAEAAQA8wAAAF4FAAAAAA==&#10;" stroked="f">
             <v:textbox style="mso-next-textbox:#_x0000_s2066">
               <w:txbxContent>
                 <w:p>
@@ -215,25 +215,13 @@
                     </w:rPr>
                     <w:t>{</w:t>
                   </w:r>
-                  <w:proofErr w:type="spellStart"/>
-                  <w:proofErr w:type="gramStart"/>
                   <w:r>
                     <w:rPr>
                       <w:rFonts w:cs="Calibri"/>
                       <w:sz w:val="22"/>
                       <w:szCs w:val="22"/>
                     </w:rPr>
-                    <w:t>codeDocument</w:t>
-                  </w:r>
-                  <w:proofErr w:type="spellEnd"/>
-                  <w:proofErr w:type="gramEnd"/>
-                  <w:r>
-                    <w:rPr>
-                      <w:rFonts w:cs="Calibri"/>
-                      <w:sz w:val="22"/>
-                      <w:szCs w:val="22"/>
-                    </w:rPr>
-                    <w:t>}</w:t>
+                    <w:t>codeDocument}</w:t>
                   </w:r>
                 </w:p>
                 <w:p>
@@ -298,155 +286,41 @@
                       <w:sz w:val="22"/>
                       <w:szCs w:val="22"/>
                     </w:rPr>
-                    <w:t>{-</w:t>
-                  </w:r>
-                  <w:proofErr w:type="spellStart"/>
-                  <w:proofErr w:type="gramStart"/>
+                    <w:t>{-w:p nomDestinataire}{civiliteDestinataire} {nomDestinataire}{/nomDestinataire}</w:t>
+                  </w:r>
                   <w:r>
                     <w:rPr>
                       <w:rFonts w:cs="Calibri"/>
                       <w:sz w:val="22"/>
                       <w:szCs w:val="22"/>
                     </w:rPr>
-                    <w:t>w:p</w:t>
-                  </w:r>
-                  <w:proofErr w:type="spellEnd"/>
-                  <w:proofErr w:type="gramEnd"/>
-                  <w:r>
+                    <w:t>,</w:t>
+                  </w:r>
+                </w:p>
+                <w:p>
+                  <w:pPr>
                     <w:rPr>
                       <w:rFonts w:cs="Calibri"/>
                       <w:sz w:val="22"/>
                       <w:szCs w:val="22"/>
                     </w:rPr>
-                    <w:t xml:space="preserve"> </w:t>
-                  </w:r>
-                  <w:proofErr w:type="spellStart"/>
-                  <w:proofErr w:type="gramStart"/>
+                  </w:pPr>
+                </w:p>
+                <w:p>
+                  <w:pPr>
+                    <w:rPr>
+                      <w:rFonts w:ascii="Aptos" w:hAnsi="Aptos"/>
+                      <w:sz w:val="22"/>
+                      <w:szCs w:val="22"/>
+                    </w:rPr>
+                  </w:pPr>
                   <w:r>
                     <w:rPr>
                       <w:rFonts w:cs="Calibri"/>
                       <w:sz w:val="22"/>
                       <w:szCs w:val="22"/>
                     </w:rPr>
-                    <w:t>nomDestinataire</w:t>
-                  </w:r>
-                  <w:proofErr w:type="spellEnd"/>
-                  <w:r>
-                    <w:rPr>
-                      <w:rFonts w:cs="Calibri"/>
-                      <w:sz w:val="22"/>
-                      <w:szCs w:val="22"/>
-                    </w:rPr>
-                    <w:t>}{</w:t>
-                  </w:r>
-                  <w:proofErr w:type="spellStart"/>
-                  <w:proofErr w:type="gramEnd"/>
-                  <w:r>
-                    <w:rPr>
-                      <w:rFonts w:cs="Calibri"/>
-                      <w:sz w:val="22"/>
-                      <w:szCs w:val="22"/>
-                    </w:rPr>
-                    <w:t>civiliteDestinataire</w:t>
-                  </w:r>
-                  <w:proofErr w:type="spellEnd"/>
-                  <w:r>
-                    <w:rPr>
-                      <w:rFonts w:cs="Calibri"/>
-                      <w:sz w:val="22"/>
-                      <w:szCs w:val="22"/>
-                    </w:rPr>
-                    <w:t>} {</w:t>
-                  </w:r>
-                  <w:proofErr w:type="spellStart"/>
-                  <w:r>
-                    <w:rPr>
-                      <w:rFonts w:cs="Calibri"/>
-                      <w:sz w:val="22"/>
-                      <w:szCs w:val="22"/>
-                    </w:rPr>
-                    <w:t>nomDestinataire</w:t>
-                  </w:r>
-                  <w:proofErr w:type="spellEnd"/>
-                  <w:r>
-                    <w:rPr>
-                      <w:rFonts w:cs="Calibri"/>
-                      <w:sz w:val="22"/>
-                      <w:szCs w:val="22"/>
-                    </w:rPr>
-                    <w:t>}{/</w:t>
-                  </w:r>
-                  <w:proofErr w:type="spellStart"/>
-                  <w:r>
-                    <w:rPr>
-                      <w:rFonts w:cs="Calibri"/>
-                      <w:sz w:val="22"/>
-                      <w:szCs w:val="22"/>
-                    </w:rPr>
-                    <w:t>nomDestinataire</w:t>
-                  </w:r>
-                  <w:proofErr w:type="spellEnd"/>
-                  <w:r>
-                    <w:rPr>
-                      <w:rFonts w:cs="Calibri"/>
-                      <w:sz w:val="22"/>
-                      <w:szCs w:val="22"/>
-                    </w:rPr>
-                    <w:t>}</w:t>
-                  </w:r>
-                  <w:r>
-                    <w:rPr>
-                      <w:rFonts w:cs="Calibri"/>
-                      <w:sz w:val="22"/>
-                      <w:szCs w:val="22"/>
-                    </w:rPr>
-                    <w:t>,</w:t>
-                  </w:r>
-                </w:p>
-                <w:p>
-                  <w:pPr>
-                    <w:rPr>
-                      <w:rFonts w:cs="Calibri"/>
-                      <w:sz w:val="22"/>
-                      <w:szCs w:val="22"/>
-                    </w:rPr>
-                  </w:pPr>
-                </w:p>
-                <w:p>
-                  <w:pPr>
-                    <w:rPr>
-                      <w:rFonts w:ascii="Aptos" w:hAnsi="Aptos"/>
-                      <w:sz w:val="22"/>
-                      <w:szCs w:val="22"/>
-                    </w:rPr>
-                  </w:pPr>
-                  <w:r>
-                    <w:rPr>
-                      <w:rFonts w:cs="Calibri"/>
-                      <w:sz w:val="22"/>
-                      <w:szCs w:val="22"/>
-                    </w:rPr>
-                    <w:t>{</w:t>
-                  </w:r>
-                  <w:proofErr w:type="spellStart"/>
-                  <w:proofErr w:type="gramStart"/>
-                  <w:r>
-                    <w:rPr>
-                      <w:rFonts w:cs="Calibri"/>
-                      <w:sz w:val="22"/>
-                      <w:szCs w:val="22"/>
-                    </w:rPr>
-                    <w:t>texteIa</w:t>
-                  </w:r>
-                  <w:proofErr w:type="spellEnd"/>
-                  <w:proofErr w:type="gramEnd"/>
-                  <w:r>
-                    <w:rPr>
-                      <w:rFonts w:cs="Calibri"/>
-                      <w:sz w:val="22"/>
-                      <w:szCs w:val="22"/>
-                    </w:rPr>
-                    <w:t>}</w:t>
+                    <w:t>{texteIa}</w:t>
                   </w:r>
                 </w:p>
                 <w:permEnd w:id="350494471"/>
@@ -517,7 +391,6 @@
                     </w:rPr>
                     <w:t>{-</w:t>
                   </w:r>
-                  <w:proofErr w:type="spellStart"/>
                   <w:proofErr w:type="gramStart"/>
                   <w:r>
                     <w:rPr>
@@ -527,7 +400,6 @@
                     </w:rPr>
                     <w:t>w:p</w:t>
                   </w:r>
-                  <w:proofErr w:type="spellEnd"/>
                   <w:proofErr w:type="gramEnd"/>
                   <w:r>
                     <w:rPr>
@@ -537,7 +409,6 @@
                     </w:rPr>
                     <w:t xml:space="preserve"> </w:t>
                   </w:r>
-                  <w:proofErr w:type="spellStart"/>
                   <w:proofErr w:type="gramStart"/>
                   <w:r>
                     <w:rPr>
@@ -545,18 +416,8 @@
                       <w:color w:val="020418"/>
                       <w:sz w:val="22"/>
                     </w:rPr>
-                    <w:t>nomDestinataire</w:t>
-                  </w:r>
-                  <w:proofErr w:type="spellEnd"/>
-                  <w:r>
-                    <w:rPr>
-                      <w:rFonts w:ascii="Aptos" w:hAnsi="Aptos"/>
-                      <w:color w:val="020418"/>
-                      <w:sz w:val="22"/>
-                    </w:rPr>
-                    <w:t>}{</w:t>
-                  </w:r>
-                  <w:proofErr w:type="spellStart"/>
+                    <w:t>nomDestinataire}{</w:t>
+                  </w:r>
                   <w:proofErr w:type="gramEnd"/>
                   <w:r>
                     <w:rPr>
@@ -564,52 +425,7 @@
                       <w:color w:val="020418"/>
                       <w:sz w:val="22"/>
                     </w:rPr>
-                    <w:t>civiliteDestinataire</w:t>
-                  </w:r>
-                  <w:proofErr w:type="spellEnd"/>
-                  <w:r>
-                    <w:rPr>
-                      <w:rFonts w:ascii="Aptos" w:hAnsi="Aptos"/>
-                      <w:color w:val="020418"/>
-                      <w:sz w:val="22"/>
-                    </w:rPr>
-                    <w:t>} {</w:t>
-                  </w:r>
-                  <w:proofErr w:type="spellStart"/>
-                  <w:r>
-                    <w:rPr>
-                      <w:rFonts w:ascii="Aptos" w:hAnsi="Aptos"/>
-                      <w:color w:val="020418"/>
-                      <w:sz w:val="22"/>
-                    </w:rPr>
-                    <w:t>nomDestinataire</w:t>
-                  </w:r>
-                  <w:proofErr w:type="spellEnd"/>
-                  <w:r>
-                    <w:rPr>
-                      <w:rFonts w:ascii="Aptos" w:hAnsi="Aptos"/>
-                      <w:color w:val="020418"/>
-                      <w:sz w:val="22"/>
-                    </w:rPr>
-                    <w:t>}{/</w:t>
-                  </w:r>
-                  <w:proofErr w:type="spellStart"/>
-                  <w:r>
-                    <w:rPr>
-                      <w:rFonts w:ascii="Aptos" w:hAnsi="Aptos"/>
-                      <w:color w:val="020418"/>
-                      <w:sz w:val="22"/>
-                    </w:rPr>
-                    <w:t>nomDestinataire</w:t>
-                  </w:r>
-                  <w:proofErr w:type="spellEnd"/>
-                  <w:r>
-                    <w:rPr>
-                      <w:rFonts w:ascii="Aptos" w:hAnsi="Aptos"/>
-                      <w:color w:val="020418"/>
-                      <w:sz w:val="22"/>
-                    </w:rPr>
-                    <w:t>}</w:t>
+                    <w:t>civiliteDestinataire} {nomDestinataire}{/nomDestinataire}</w:t>
                   </w:r>
                 </w:p>
                 <w:p>
@@ -628,7 +444,6 @@
                     </w:rPr>
                     <w:t>{-</w:t>
                   </w:r>
-                  <w:proofErr w:type="spellStart"/>
                   <w:proofErr w:type="gramStart"/>
                   <w:r>
                     <w:rPr>
@@ -638,7 +453,6 @@
                     </w:rPr>
                     <w:t>w:p</w:t>
                   </w:r>
-                  <w:proofErr w:type="spellEnd"/>
                   <w:proofErr w:type="gramEnd"/>
                   <w:r>
                     <w:rPr>
@@ -648,7 +462,6 @@
                     </w:rPr>
                     <w:t xml:space="preserve"> </w:t>
                   </w:r>
-                  <w:proofErr w:type="spellStart"/>
                   <w:proofErr w:type="gramStart"/>
                   <w:r>
                     <w:rPr>
@@ -656,16 +469,7 @@
                       <w:color w:val="020418"/>
                       <w:sz w:val="22"/>
                     </w:rPr>
-                    <w:t>statutDestinataire</w:t>
-                  </w:r>
-                  <w:proofErr w:type="spellEnd"/>
-                  <w:r>
-                    <w:rPr>
-                      <w:rFonts w:ascii="Aptos" w:hAnsi="Aptos"/>
-                      <w:color w:val="020418"/>
-                      <w:sz w:val="22"/>
-                    </w:rPr>
-                    <w:t>}{</w:t>
+                    <w:t>statutDestinataire}{</w:t>
                   </w:r>
                   <w:proofErr w:type="gramEnd"/>
                   <w:r>
@@ -674,43 +478,7 @@
                       <w:color w:val="020418"/>
                       <w:sz w:val="22"/>
                     </w:rPr>
-                    <w:t>genre} {</w:t>
-                  </w:r>
-                  <w:proofErr w:type="spellStart"/>
-                  <w:r>
-                    <w:rPr>
-                      <w:rFonts w:ascii="Aptos" w:hAnsi="Aptos"/>
-                      <w:color w:val="020418"/>
-                      <w:sz w:val="22"/>
-                    </w:rPr>
-                    <w:t>statutDestinataire</w:t>
-                  </w:r>
-                  <w:proofErr w:type="spellEnd"/>
-                  <w:r>
-                    <w:rPr>
-                      <w:rFonts w:ascii="Aptos" w:hAnsi="Aptos"/>
-                      <w:color w:val="020418"/>
-                      <w:sz w:val="22"/>
-                    </w:rPr>
-                    <w:t>}{/</w:t>
-                  </w:r>
-                  <w:proofErr w:type="spellStart"/>
-                  <w:r>
-                    <w:rPr>
-                      <w:rFonts w:ascii="Aptos" w:hAnsi="Aptos"/>
-                      <w:color w:val="020418"/>
-                      <w:sz w:val="22"/>
-                    </w:rPr>
-                    <w:t>statutDestinataire</w:t>
-                  </w:r>
-                  <w:proofErr w:type="spellEnd"/>
-                  <w:r>
-                    <w:rPr>
-                      <w:rFonts w:ascii="Aptos" w:hAnsi="Aptos"/>
-                      <w:color w:val="020418"/>
-                      <w:sz w:val="22"/>
-                    </w:rPr>
-                    <w:t>}</w:t>
+                    <w:t>genre} {statutDestinataire}{/statutDestinataire}</w:t>
                   </w:r>
                 </w:p>
                 <w:p>
@@ -729,7 +497,6 @@
                     </w:rPr>
                     <w:t>{-</w:t>
                   </w:r>
-                  <w:proofErr w:type="spellStart"/>
                   <w:proofErr w:type="gramStart"/>
                   <w:r>
                     <w:rPr>
@@ -739,7 +506,6 @@
                     </w:rPr>
                     <w:t>w:p</w:t>
                   </w:r>
-                  <w:proofErr w:type="spellEnd"/>
                   <w:proofErr w:type="gramEnd"/>
                   <w:r>
                     <w:rPr>
@@ -749,7 +515,6 @@
                     </w:rPr>
                     <w:t xml:space="preserve"> </w:t>
                   </w:r>
-                  <w:proofErr w:type="spellStart"/>
                   <w:proofErr w:type="gramStart"/>
                   <w:r>
                     <w:rPr>
@@ -757,18 +522,8 @@
                       <w:color w:val="020418"/>
                       <w:sz w:val="22"/>
                     </w:rPr>
-                    <w:t>batiment</w:t>
-                  </w:r>
-                  <w:proofErr w:type="spellEnd"/>
-                  <w:r>
-                    <w:rPr>
-                      <w:rFonts w:ascii="Aptos" w:hAnsi="Aptos"/>
-                      <w:color w:val="020418"/>
-                      <w:sz w:val="22"/>
-                    </w:rPr>
-                    <w:t>}{</w:t>
-                  </w:r>
-                  <w:proofErr w:type="spellStart"/>
+                    <w:t>batiment}{</w:t>
+                  </w:r>
                   <w:proofErr w:type="gramEnd"/>
                   <w:r>
                     <w:rPr>
@@ -776,34 +531,7 @@
                       <w:color w:val="020418"/>
                       <w:sz w:val="22"/>
                     </w:rPr>
-                    <w:t>batiment</w:t>
-                  </w:r>
-                  <w:proofErr w:type="spellEnd"/>
-                  <w:r>
-                    <w:rPr>
-                      <w:rFonts w:ascii="Aptos" w:hAnsi="Aptos"/>
-                      <w:color w:val="020418"/>
-                      <w:sz w:val="22"/>
-                    </w:rPr>
-                    <w:t>}{/</w:t>
-                  </w:r>
-                  <w:proofErr w:type="spellStart"/>
-                  <w:r>
-                    <w:rPr>
-                      <w:rFonts w:ascii="Aptos" w:hAnsi="Aptos"/>
-                      <w:color w:val="020418"/>
-                      <w:sz w:val="22"/>
-                    </w:rPr>
-                    <w:t>batiment</w:t>
-                  </w:r>
-                  <w:proofErr w:type="spellEnd"/>
-                  <w:r>
-                    <w:rPr>
-                      <w:rFonts w:ascii="Aptos" w:hAnsi="Aptos"/>
-                      <w:color w:val="020418"/>
-                      <w:sz w:val="22"/>
-                    </w:rPr>
-                    <w:t>}</w:t>
+                    <w:t>batiment}{/batiment}</w:t>
                   </w:r>
                 </w:p>
                 <w:p>
@@ -822,7 +550,6 @@
                     </w:rPr>
                     <w:t>{-</w:t>
                   </w:r>
-                  <w:proofErr w:type="spellStart"/>
                   <w:proofErr w:type="gramStart"/>
                   <w:r>
                     <w:rPr>
@@ -832,7 +559,6 @@
                     </w:rPr>
                     <w:t>w:p</w:t>
                   </w:r>
-                  <w:proofErr w:type="spellEnd"/>
                   <w:proofErr w:type="gramEnd"/>
                   <w:r>
                     <w:rPr>
@@ -877,7 +603,6 @@
                     </w:rPr>
                     <w:t>{-</w:t>
                   </w:r>
-                  <w:proofErr w:type="spellStart"/>
                   <w:proofErr w:type="gramStart"/>
                   <w:r>
                     <w:rPr>
@@ -887,7 +612,6 @@
                     </w:rPr>
                     <w:t>w:p</w:t>
                   </w:r>
-                  <w:proofErr w:type="spellEnd"/>
                   <w:proofErr w:type="gramEnd"/>
                   <w:r>
                     <w:rPr>
@@ -897,7 +621,6 @@
                     </w:rPr>
                     <w:t xml:space="preserve"> </w:t>
                   </w:r>
-                  <w:proofErr w:type="spellStart"/>
                   <w:proofErr w:type="gramStart"/>
                   <w:r>
                     <w:rPr>
@@ -905,18 +628,8 @@
                       <w:color w:val="020418"/>
                       <w:sz w:val="22"/>
                     </w:rPr>
-                    <w:t>cpVille</w:t>
-                  </w:r>
-                  <w:proofErr w:type="spellEnd"/>
-                  <w:r>
-                    <w:rPr>
-                      <w:rFonts w:ascii="Aptos" w:hAnsi="Aptos"/>
-                      <w:color w:val="020418"/>
-                      <w:sz w:val="22"/>
-                    </w:rPr>
-                    <w:t>}{</w:t>
-                  </w:r>
-                  <w:proofErr w:type="spellStart"/>
+                    <w:t>cpVille}{</w:t>
+                  </w:r>
                   <w:proofErr w:type="gramEnd"/>
                   <w:r>
                     <w:rPr>
@@ -924,34 +637,7 @@
                       <w:color w:val="020418"/>
                       <w:sz w:val="22"/>
                     </w:rPr>
-                    <w:t>cpVille</w:t>
-                  </w:r>
-                  <w:proofErr w:type="spellEnd"/>
-                  <w:r>
-                    <w:rPr>
-                      <w:rFonts w:ascii="Aptos" w:hAnsi="Aptos"/>
-                      <w:color w:val="020418"/>
-                      <w:sz w:val="22"/>
-                    </w:rPr>
-                    <w:t>}{/</w:t>
-                  </w:r>
-                  <w:proofErr w:type="spellStart"/>
-                  <w:r>
-                    <w:rPr>
-                      <w:rFonts w:ascii="Aptos" w:hAnsi="Aptos"/>
-                      <w:color w:val="020418"/>
-                      <w:sz w:val="22"/>
-                    </w:rPr>
-                    <w:t>cpVille</w:t>
-                  </w:r>
-                  <w:proofErr w:type="spellEnd"/>
-                  <w:r>
-                    <w:rPr>
-                      <w:rFonts w:ascii="Aptos" w:hAnsi="Aptos"/>
-                      <w:color w:val="020418"/>
-                      <w:sz w:val="22"/>
-                    </w:rPr>
-                    <w:t>}</w:t>
+                    <w:t>cpVille}{/cpVille}</w:t>
                   </w:r>
                 </w:p>
                 <w:p>
@@ -970,7 +656,6 @@
                     </w:rPr>
                     <w:t>{-</w:t>
                   </w:r>
-                  <w:proofErr w:type="spellStart"/>
                   <w:proofErr w:type="gramStart"/>
                   <w:r>
                     <w:rPr>
@@ -980,7 +665,6 @@
                     </w:rPr>
                     <w:t>w:p</w:t>
                   </w:r>
-                  <w:proofErr w:type="spellEnd"/>
                   <w:proofErr w:type="gramEnd"/>
                   <w:r>
                     <w:rPr>
@@ -988,18 +672,8 @@
                       <w:color w:val="020418"/>
                       <w:sz w:val="22"/>
                     </w:rPr>
-                    <w:t xml:space="preserve"> </w:t>
-                  </w:r>
-                  <w:proofErr w:type="spellStart"/>
-                  <w:r>
-                    <w:rPr>
-                      <w:rFonts w:ascii="Aptos" w:hAnsi="Aptos"/>
-                      <w:color w:val="020418"/>
-                      <w:sz w:val="22"/>
-                    </w:rPr>
-                    <w:t>emailDestinataire</w:t>
-                  </w:r>
-                  <w:proofErr w:type="spellEnd"/>
+                    <w:t xml:space="preserve"> emailDestinataire</w:t>
+                  </w:r>
                   <w:r>
                     <w:rPr>
                       <w:rFonts w:ascii="Aptos" w:hAnsi="Aptos"/>
@@ -1015,25 +689,7 @@
                         <w:rFonts w:ascii="Aptos" w:hAnsi="Aptos"/>
                         <w:sz w:val="22"/>
                       </w:rPr>
-                      <w:t>{</w:t>
-                    </w:r>
-                    <w:proofErr w:type="spellStart"/>
-                    <w:r>
-                      <w:rPr>
-                        <w:rStyle w:val="Lienhypertexte"/>
-                        <w:rFonts w:ascii="Aptos" w:hAnsi="Aptos"/>
-                        <w:sz w:val="22"/>
-                      </w:rPr>
-                      <w:t>emailDestinataire</w:t>
-                    </w:r>
-                    <w:proofErr w:type="spellEnd"/>
-                    <w:r>
-                      <w:rPr>
-                        <w:rStyle w:val="Lienhypertexte"/>
-                        <w:rFonts w:ascii="Aptos" w:hAnsi="Aptos"/>
-                        <w:sz w:val="22"/>
-                      </w:rPr>
-                      <w:t>}</w:t>
+                      <w:t>{emailDestinataire}</w:t>
                     </w:r>
                   </w:hyperlink>
                   <w:r>
@@ -1042,25 +698,7 @@
                       <w:color w:val="020418"/>
                       <w:sz w:val="22"/>
                     </w:rPr>
-                    <w:t>{/</w:t>
-                  </w:r>
-                  <w:proofErr w:type="spellStart"/>
-                  <w:r>
-                    <w:rPr>
-                      <w:rFonts w:ascii="Aptos" w:hAnsi="Aptos"/>
-                      <w:color w:val="020418"/>
-                      <w:sz w:val="22"/>
-                    </w:rPr>
-                    <w:t>emailDestinataire</w:t>
-                  </w:r>
-                  <w:proofErr w:type="spellEnd"/>
-                  <w:r>
-                    <w:rPr>
-                      <w:rFonts w:ascii="Aptos" w:hAnsi="Aptos"/>
-                      <w:color w:val="020418"/>
-                      <w:sz w:val="22"/>
-                    </w:rPr>
-                    <w:t>}</w:t>
+                    <w:t>{/emailDestinataire}</w:t>
                   </w:r>
                 </w:p>
               </w:txbxContent>

</xml_diff>